<commit_message>
L-0639: review round 5 - only the header's field block is its status; rebuild the daily-workflow DOCX/PDF
A status: in the title with no status field read as the field, so a
dependency could read closed. The field block that ends line 1, set off by
the template's column gap, is the only place read; none is cannot-tell.

Claude-Session: https://claude.ai/code/session_01QLY3kk7DCXpucXGu3wSniW
</commit_message>
<xml_diff>
--- a/docs/guides/crew/crew-daily-workflow.docx
+++ b/docs/guides/crew/crew-daily-workflow.docx
@@ -287,6 +287,108 @@
       <w:r>
         <w:rPr/>
         <w:t xml:space="preserve"> gets a row.</w:t>
+      </w:r>
+    </w:p>
+    <w:p>
+      <w:pPr>
+        <w:pStyle w:val="BodyText"/>
+        <w:bidi w:val="0"/>
+        <w:jc w:val="left"/>
+        <w:rPr/>
+      </w:pPr>
+      <w:r>
+        <w:rPr/>
+        <w:t xml:space="preserve">If the ticket cannot start before others close, the spec carries an optional </w:t>
+      </w:r>
+      <w:r>
+        <w:rPr>
+          <w:rStyle w:val="SourceText"/>
+        </w:rPr>
+        <w:t>depends-on: [T-0088, T-0090]</w:t>
+      </w:r>
+      <w:r>
+        <w:rPr/>
+        <w:t xml:space="preserve"> line under its header. </w:t>
+      </w:r>
+      <w:r>
+        <w:rPr>
+          <w:rStyle w:val="SourceText"/>
+        </w:rPr>
+        <w:t>blocked</w:t>
+      </w:r>
+      <w:r>
+        <w:rPr/>
+        <w:t xml:space="preserve"> is then derived from it, never typed: any dependency that is open, </w:t>
+      </w:r>
+      <w:r>
+        <w:rPr>
+          <w:rStyle w:val="SourceText"/>
+        </w:rPr>
+        <w:t>cancelled</w:t>
+      </w:r>
+      <w:r>
+        <w:rPr/>
+        <w:t xml:space="preserve">, </w:t>
+      </w:r>
+      <w:r>
+        <w:rPr>
+          <w:rStyle w:val="SourceText"/>
+        </w:rPr>
+        <w:t>superseded</w:t>
+      </w:r>
+      <w:r>
+        <w:rPr/>
+        <w:t xml:space="preserve"> or cannot be read blocks, and </w:t>
+      </w:r>
+      <w:r>
+        <w:rPr>
+          <w:rStyle w:val="SourceText"/>
+        </w:rPr>
+        <w:t>done</w:t>
+      </w:r>
+      <w:r>
+        <w:rPr/>
+        <w:t xml:space="preserve"> or </w:t>
+      </w:r>
+      <w:r>
+        <w:rPr>
+          <w:rStyle w:val="SourceText"/>
+        </w:rPr>
+        <w:t>merged</w:t>
+      </w:r>
+      <w:r>
+        <w:rPr/>
+        <w:t xml:space="preserve"> unblocks (</w:t>
+      </w:r>
+      <w:r>
+        <w:rPr>
+          <w:rStyle w:val="SourceText"/>
+        </w:rPr>
+        <w:t>hooks/scripts/crew_ticket_state.py</w:t>
+      </w:r>
+      <w:r>
+        <w:rPr/>
+        <w:t xml:space="preserve">). The line is hashed with the spec, so changing it needs </w:t>
+      </w:r>
+      <w:r>
+        <w:rPr>
+          <w:rStyle w:val="SourceText"/>
+        </w:rPr>
+        <w:t>/crew:approve</w:t>
+      </w:r>
+      <w:r>
+        <w:rPr/>
+        <w:t xml:space="preserve"> again. </w:t>
+      </w:r>
+      <w:r>
+        <w:rPr>
+          <w:rStyle w:val="SourceText"/>
+        </w:rPr>
+        <w:t>needs-replan</w:t>
+      </w:r>
+      <w:r>
+        <w:rPr/>
+        <w:t xml:space="preserve"> is derived the same way, from the review ledger.</w:t>
       </w:r>
     </w:p>
     <w:p>

</xml_diff>

<commit_message>
L-0640: next.md - waiting-on, next, reason, revisit and superseded-by, read into the ticket view
crew_ticket_state.read_next parses .work/tickets/<id>/next.md and view
(top, ticket, today=None) carries the fields as next, with revisit_due.
A bad, empty or repeated value, an unreadable file and a link out of the
ticket folder are problems; a needs-owner gate without next: and a
superseded gate without a successor are reported. Nothing writes next.md.
README, the daily-workflow guide (rebuilt), CHANGELOG and plan.md.

Claude-Session: https://claude.ai/code/session_01QLY3kk7DCXpucXGu3wSniW
</commit_message>
<xml_diff>
--- a/docs/guides/crew/crew-daily-workflow.docx
+++ b/docs/guides/crew/crew-daily-workflow.docx
@@ -2918,6 +2918,7 @@
           <w:tab w:val="left" w:pos="829" w:leader="none"/>
         </w:tabs>
         <w:bidi w:val="0"/>
+        <w:spacing w:before="120" w:after="0"/>
         <w:ind w:hanging="283" w:left="829"/>
         <w:jc w:val="left"/>
         <w:rPr/>
@@ -2971,6 +2972,143 @@
       <w:r>
         <w:rPr/>
         <w:t xml:space="preserve"> entry must fall inside Touch. A plan cannot add a path the spec does not list. </w:t>
+      </w:r>
+    </w:p>
+    <w:p>
+      <w:pPr>
+        <w:pStyle w:val="BodyText"/>
+        <w:numPr>
+          <w:ilvl w:val="0"/>
+          <w:numId w:val="4"/>
+        </w:numPr>
+        <w:tabs>
+          <w:tab w:val="clear" w:pos="1134"/>
+          <w:tab w:val="left" w:pos="829" w:leader="none"/>
+        </w:tabs>
+        <w:bidi w:val="0"/>
+        <w:ind w:hanging="283" w:left="829"/>
+        <w:jc w:val="left"/>
+        <w:rPr/>
+      </w:pPr>
+      <w:r>
+        <w:rPr>
+          <w:rStyle w:val="SourceText"/>
+        </w:rPr>
+        <w:t>next.md</w:t>
+      </w:r>
+      <w:r>
+        <w:rPr/>
+        <w:t xml:space="preserve"> is optional, and nothing in crew writes it: you do, by hand. One </w:t>
+      </w:r>
+      <w:r>
+        <w:rPr>
+          <w:rStyle w:val="SourceText"/>
+        </w:rPr>
+        <w:t>key: value</w:t>
+      </w:r>
+      <w:r>
+        <w:rPr/>
+        <w:t xml:space="preserve"> per line says who the ticket waits on and what happens next: </w:t>
+      </w:r>
+      <w:r>
+        <w:rPr>
+          <w:rStyle w:val="SourceText"/>
+        </w:rPr>
+        <w:t>waiting-on:</w:t>
+      </w:r>
+      <w:r>
+        <w:rPr/>
+        <w:t xml:space="preserve"> (</w:t>
+      </w:r>
+      <w:r>
+        <w:rPr>
+          <w:rStyle w:val="SourceText"/>
+        </w:rPr>
+        <w:t>owner</w:t>
+      </w:r>
+      <w:r>
+        <w:rPr/>
+        <w:t xml:space="preserve">, </w:t>
+      </w:r>
+      <w:r>
+        <w:rPr>
+          <w:rStyle w:val="SourceText"/>
+        </w:rPr>
+        <w:t>agent</w:t>
+      </w:r>
+      <w:r>
+        <w:rPr/>
+        <w:t xml:space="preserve">, </w:t>
+      </w:r>
+      <w:r>
+        <w:rPr>
+          <w:rStyle w:val="SourceText"/>
+        </w:rPr>
+        <w:t>external</w:t>
+      </w:r>
+      <w:r>
+        <w:rPr/>
+        <w:t xml:space="preserve"> or a ticket id), </w:t>
+      </w:r>
+      <w:r>
+        <w:rPr>
+          <w:rStyle w:val="SourceText"/>
+        </w:rPr>
+        <w:t>next:</w:t>
+      </w:r>
+      <w:r>
+        <w:rPr/>
+        <w:t xml:space="preserve">, </w:t>
+      </w:r>
+      <w:r>
+        <w:rPr>
+          <w:rStyle w:val="SourceText"/>
+        </w:rPr>
+        <w:t>reason:</w:t>
+      </w:r>
+      <w:r>
+        <w:rPr/>
+        <w:t xml:space="preserve">, </w:t>
+      </w:r>
+      <w:r>
+        <w:rPr>
+          <w:rStyle w:val="SourceText"/>
+        </w:rPr>
+        <w:t>revisit:</w:t>
+      </w:r>
+      <w:r>
+        <w:rPr/>
+        <w:t xml:space="preserve"> (a </w:t>
+      </w:r>
+      <w:r>
+        <w:rPr>
+          <w:rStyle w:val="SourceText"/>
+        </w:rPr>
+        <w:t>YYYY-MM-DD</w:t>
+      </w:r>
+      <w:r>
+        <w:rPr/>
+        <w:t xml:space="preserve"> date) and </w:t>
+      </w:r>
+      <w:r>
+        <w:rPr>
+          <w:rStyle w:val="SourceText"/>
+        </w:rPr>
+        <w:t>superseded-by:</w:t>
+      </w:r>
+      <w:r>
+        <w:rPr/>
+        <w:t xml:space="preserve"> (a ticket id). It is not part of the contract: approval does not hash it and </w:t>
+      </w:r>
+      <w:r>
+        <w:rPr>
+          <w:rStyle w:val="SourceText"/>
+        </w:rPr>
+        <w:t>validate</w:t>
+      </w:r>
+      <w:r>
+        <w:rPr/>
+        <w:t xml:space="preserve"> never reads it, so you can edit it at any step without approving again. </w:t>
       </w:r>
     </w:p>
     <w:p>

</xml_diff>

<commit_message>
T-0068: rebuild crew-daily-workflow and crew-troubleshooting (html, docx, pdf) from the merged sources with build.py
Claude-Session: https://claude.ai/code/session_01QLY3kk7DCXpucXGu3wSniW
</commit_message>
<xml_diff>
--- a/docs/guides/crew/crew-daily-workflow.docx
+++ b/docs/guides/crew/crew-daily-workflow.docx
@@ -678,7 +678,7 @@
       </w:r>
       <w:r>
         <w:rPr/>
-        <w:t xml:space="preserve">, L-0520). Lanes still implement at the same time, overlapping Touch or not; only gate and land queue. Before the review round, </w:t>
+        <w:t xml:space="preserve">, L-0520). Lanes still implement at the same time, overlapping Touch or not; only gate and land queue. The review round takes the train itself (L-0526; </w:t>
       </w:r>
       <w:r>
         <w:rPr>
@@ -688,7 +688,17 @@
       </w:r>
       <w:r>
         <w:rPr/>
-        <w:t xml:space="preserve"> takes the train: a ticket whose Touch overlaps one already holding it waits (exit 1, colliding paths named) and gates next, in the order the lanes reached their gate, while a ticket with a disjoint Touch gates at once. Catch up with </w:t>
+        <w:t xml:space="preserve"> does the same by hand): a ticket whose Touch overlaps one already holding it waits - </w:t>
+      </w:r>
+      <w:r>
+        <w:rPr>
+          <w:rStyle w:val="SourceText"/>
+        </w:rPr>
+        <w:t>/crew:review</w:t>
+      </w:r>
+      <w:r>
+        <w:rPr/>
+        <w:t xml:space="preserve"> stops with exit 6, colliding paths named, no round spent - and gates next, in the order the lanes reached their gate, while a ticket with a disjoint Touch gates at once. Catch up with </w:t>
       </w:r>
       <w:r>
         <w:rPr>
@@ -708,7 +718,7 @@
       </w:r>
       <w:r>
         <w:rPr/>
-        <w:t xml:space="preserve"> of the base, never a rebase, with git rerere on so a conflict resolved once replays next time. A replay is left unstaged and listed: inspect it, </w:t>
+        <w:t xml:space="preserve"> of the base, never a rebase, with git rerere on so a conflict resolved once replays next time. A replay is left unstaged and listed: inspect it and </w:t>
       </w:r>
       <w:r>
         <w:rPr>
@@ -718,7 +728,7 @@
       </w:r>
       <w:r>
         <w:rPr/>
-        <w:t xml:space="preserve"> it, and show it to the reviewer. crew never turns on </w:t>
+        <w:t xml:space="preserve"> it; the review prompt lists it for the reviewer. crew never turns on </w:t>
       </w:r>
       <w:r>
         <w:rPr>
@@ -3494,38 +3504,34 @@
         <w:rPr/>
       </w:pPr>
       <w:r>
-        <w:rPr/>
-        <w:t xml:space="preserve">Nothing else is exempt: </w:t>
-      </w:r>
-      <w:r>
-        <w:rPr>
-          <w:rStyle w:val="SourceText"/>
-        </w:rPr>
-        <w:t>.crew/</w:t>
-      </w:r>
-      <w:r>
-        <w:rPr/>
-        <w:t xml:space="preserve"> beyond the code map, </w:t>
-      </w:r>
-      <w:r>
-        <w:rPr>
-          <w:rStyle w:val="SourceText"/>
-        </w:rPr>
-        <w:t>TODO.md</w:t>
-      </w:r>
-      <w:r>
-        <w:rPr/>
-        <w:t xml:space="preserve">, the rest of </w:t>
-      </w:r>
-      <w:r>
-        <w:rPr>
-          <w:rStyle w:val="SourceText"/>
-        </w:rPr>
-        <w:t>.claude/</w:t>
-      </w:r>
-      <w:r>
-        <w:rPr/>
-        <w:t xml:space="preserve"> and crew's own policy files. If the ticket changes one of them, list it in Touch. </w:t>
+        <w:rPr>
+          <w:rStyle w:val="SourceText"/>
+        </w:rPr>
+        <w:t>.crew/metrics.md</w:t>
+      </w:r>
+      <w:r>
+        <w:rPr/>
+        <w:t xml:space="preserve"> is writable with or without an approval: </w:t>
+      </w:r>
+      <w:r>
+        <w:rPr>
+          <w:rStyle w:val="SourceText"/>
+        </w:rPr>
+        <w:t>/crew:review</w:t>
+      </w:r>
+      <w:r>
+        <w:rPr/>
+        <w:t xml:space="preserve"> appends its row by hand when the script could not (</w:t>
+      </w:r>
+      <w:r>
+        <w:rPr>
+          <w:rStyle w:val="SourceText"/>
+        </w:rPr>
+        <w:t>crew_ticket.CREW_WRITE_ALLOWED_PATHS</w:t>
+      </w:r>
+      <w:r>
+        <w:rPr/>
+        <w:t xml:space="preserve">, that one file). </w:t>
       </w:r>
     </w:p>
     <w:p>
@@ -3540,6 +3546,160 @@
           <w:tab w:val="left" w:pos="829" w:leader="none"/>
         </w:tabs>
         <w:bidi w:val="0"/>
+        <w:spacing w:before="120" w:after="0"/>
+        <w:ind w:hanging="283" w:left="829"/>
+        <w:jc w:val="left"/>
+        <w:rPr/>
+      </w:pPr>
+      <w:r>
+        <w:rPr/>
+        <w:t xml:space="preserve">The scope base, the verify gate's records and marker and </w:t>
+      </w:r>
+      <w:r>
+        <w:rPr>
+          <w:rStyle w:val="SourceText"/>
+        </w:rPr>
+        <w:t>.crew/metrics.jsonl</w:t>
+      </w:r>
+      <w:r>
+        <w:rPr/>
+        <w:t xml:space="preserve"> are refused to Write/Edit in every mode but </w:t>
+      </w:r>
+      <w:r>
+        <w:rPr>
+          <w:rStyle w:val="SourceText"/>
+        </w:rPr>
+        <w:t>off</w:t>
+      </w:r>
+      <w:r>
+        <w:rPr/>
+        <w:t xml:space="preserve">, even inside Touch: the audit and the review bundle leave them out, so a write to them would be invisible. </w:t>
+      </w:r>
+    </w:p>
+    <w:p>
+      <w:pPr>
+        <w:pStyle w:val="BodyText"/>
+        <w:numPr>
+          <w:ilvl w:val="0"/>
+          <w:numId w:val="6"/>
+        </w:numPr>
+        <w:tabs>
+          <w:tab w:val="clear" w:pos="1134"/>
+          <w:tab w:val="left" w:pos="829" w:leader="none"/>
+        </w:tabs>
+        <w:bidi w:val="0"/>
+        <w:spacing w:before="120" w:after="0"/>
+        <w:ind w:hanging="283" w:left="829"/>
+        <w:jc w:val="left"/>
+        <w:rPr/>
+      </w:pPr>
+      <w:r>
+        <w:rPr/>
+        <w:t xml:space="preserve">Nothing else is exempt: </w:t>
+      </w:r>
+      <w:r>
+        <w:rPr>
+          <w:rStyle w:val="SourceText"/>
+        </w:rPr>
+        <w:t>.crew/</w:t>
+      </w:r>
+      <w:r>
+        <w:rPr/>
+        <w:t xml:space="preserve"> beyond the code map and the metrics row (</w:t>
+      </w:r>
+      <w:r>
+        <w:rPr>
+          <w:rStyle w:val="SourceText"/>
+        </w:rPr>
+        <w:t>config.json</w:t>
+      </w:r>
+      <w:r>
+        <w:rPr/>
+        <w:t xml:space="preserve">, </w:t>
+      </w:r>
+      <w:r>
+        <w:rPr>
+          <w:rStyle w:val="SourceText"/>
+        </w:rPr>
+        <w:t>verify.json</w:t>
+      </w:r>
+      <w:r>
+        <w:rPr/>
+        <w:t xml:space="preserve">, </w:t>
+      </w:r>
+      <w:r>
+        <w:rPr>
+          <w:rStyle w:val="SourceText"/>
+        </w:rPr>
+        <w:t>standards.md</w:t>
+      </w:r>
+      <w:r>
+        <w:rPr/>
+        <w:t xml:space="preserve">, and files crew writes but also trusts, such as </w:t>
+      </w:r>
+      <w:r>
+        <w:rPr>
+          <w:rStyle w:val="SourceText"/>
+        </w:rPr>
+        <w:t>.crew/tfplan/</w:t>
+      </w:r>
+      <w:r>
+        <w:rPr/>
+        <w:t xml:space="preserve">, </w:t>
+      </w:r>
+      <w:r>
+        <w:rPr>
+          <w:rStyle w:val="SourceText"/>
+        </w:rPr>
+        <w:t>incident.json</w:t>
+      </w:r>
+      <w:r>
+        <w:rPr/>
+        <w:t xml:space="preserve"> and </w:t>
+      </w:r>
+      <w:r>
+        <w:rPr>
+          <w:rStyle w:val="SourceText"/>
+        </w:rPr>
+        <w:t>.deploy-in-flight</w:t>
+      </w:r>
+      <w:r>
+        <w:rPr/>
+        <w:t xml:space="preserve">), </w:t>
+      </w:r>
+      <w:r>
+        <w:rPr>
+          <w:rStyle w:val="SourceText"/>
+        </w:rPr>
+        <w:t>TODO.md</w:t>
+      </w:r>
+      <w:r>
+        <w:rPr/>
+        <w:t xml:space="preserve">, the rest of </w:t>
+      </w:r>
+      <w:r>
+        <w:rPr>
+          <w:rStyle w:val="SourceText"/>
+        </w:rPr>
+        <w:t>.claude/</w:t>
+      </w:r>
+      <w:r>
+        <w:rPr/>
+        <w:t xml:space="preserve"> and crew's own policy files. If the ticket changes one of them, list it in Touch. </w:t>
+      </w:r>
+    </w:p>
+    <w:p>
+      <w:pPr>
+        <w:pStyle w:val="BodyText"/>
+        <w:numPr>
+          <w:ilvl w:val="0"/>
+          <w:numId w:val="6"/>
+        </w:numPr>
+        <w:tabs>
+          <w:tab w:val="clear" w:pos="1134"/>
+          <w:tab w:val="left" w:pos="829" w:leader="none"/>
+        </w:tabs>
+        <w:bidi w:val="0"/>
         <w:ind w:hanging="283" w:left="829"/>
         <w:jc w:val="left"/>
         <w:rPr/>
@@ -3679,7 +3839,47 @@
       </w:r>
       <w:r>
         <w:rPr/>
-        <w:t>, a shell redirect or a formatter can still change files. So when the session stops, the completion audit compares the whole tree with the commit the ticket started from. It covers committed, staged, unstaged and untracked changes, and both ends of a rename. After you merge main, a file byte-identical to the merged main commit is not counted: it is main's change, not the ticket's; the verdict names that commit. If any changed path is outside Touch, the audit blocks the stop and lists the paths in six lines or fewer. It never blocks the continuation it caused.</w:t>
+        <w:t xml:space="preserve">, a shell redirect or a formatter can still change files. So when the session stops, the completion audit compares the whole tree with the commit the ticket started from. It covers committed, staged, unstaged and untracked changes, and both ends of a rename. After you merge main, a file byte-identical to the merged main commit is not counted: it is main's change, not the ticket's; the verdict names that commit. If any changed path is outside Touch, the audit blocks the stop and lists the paths in six lines or fewer. It never blocks the continuation it caused. crew's own ticket-flow bookkeeping (the scope base, the gate's records, the metrics files) is never a changed path, whatever </w:t>
+      </w:r>
+      <w:r>
+        <w:rPr>
+          <w:rStyle w:val="SourceText"/>
+        </w:rPr>
+        <w:t>.gitignore</w:t>
+      </w:r>
+      <w:r>
+        <w:rPr/>
+        <w:t xml:space="preserve"> says, so a </w:t>
+      </w:r>
+      <w:r>
+        <w:rPr>
+          <w:rStyle w:val="SourceText"/>
+        </w:rPr>
+        <w:t>.crew/</w:t>
+      </w:r>
+      <w:r>
+        <w:rPr/>
+        <w:t xml:space="preserve"> path the audit lists (say </w:t>
+      </w:r>
+      <w:r>
+        <w:rPr>
+          <w:rStyle w:val="SourceText"/>
+        </w:rPr>
+        <w:t>.crew/verify.json</w:t>
+      </w:r>
+      <w:r>
+        <w:rPr/>
+        <w:t xml:space="preserve"> or a committed </w:t>
+      </w:r>
+      <w:r>
+        <w:rPr>
+          <w:rStyle w:val="SourceText"/>
+        </w:rPr>
+        <w:t>.crew/incident.json</w:t>
+      </w:r>
+      <w:r>
+        <w:rPr/>
+        <w:t>) is a real finding, not crew's noise.</w:t>
       </w:r>
     </w:p>
     <w:p>

</xml_diff>

<commit_message>
rush/g3-contracts: rebuild the daily-workflow DOCX/PDF from the merged source
release/1.2.0's T-0039 edited daily-workflow.md and its HTML; this group's
DOCX/PDF were built before that. build.py --guide daily-workflow; --check
stays green (HTML unchanged).

Claude-Session: https://claude.ai/code/session_01QLY3kk7DCXpucXGu3wSniW
</commit_message>
<xml_diff>
--- a/docs/guides/crew/crew-daily-workflow.docx
+++ b/docs/guides/crew/crew-daily-workflow.docx
@@ -582,7 +582,37 @@
       </w:r>
       <w:r>
         <w:rPr/>
-        <w:t xml:space="preserve"> runs next and usually says "none" — most tickets touch no document that needs updating.</w:t>
+        <w:t xml:space="preserve"> runs next and usually says "none" — most tickets touch no document that needs updating. Then </w:t>
+      </w:r>
+      <w:r>
+        <w:rPr>
+          <w:rStyle w:val="SourceText"/>
+        </w:rPr>
+        <w:t>crew_gitignore.py check</w:t>
+      </w:r>
+      <w:r>
+        <w:rPr/>
+        <w:t xml:space="preserve"> asks whether the ticket brought a language or manifest whose ignore patterns are missing: it adds them only if the spec's Touch covers </w:t>
+      </w:r>
+      <w:r>
+        <w:rPr>
+          <w:rStyle w:val="SourceText"/>
+        </w:rPr>
+        <w:t>.gitignore</w:t>
+      </w:r>
+      <w:r>
+        <w:rPr/>
+        <w:t xml:space="preserve">, and otherwise the PR body lists them and the next </w:t>
+      </w:r>
+      <w:r>
+        <w:rPr>
+          <w:rStyle w:val="SourceText"/>
+        </w:rPr>
+        <w:t>/crew:onboard</w:t>
+      </w:r>
+      <w:r>
+        <w:rPr/>
+        <w:t xml:space="preserve"> adds them.</w:t>
       </w:r>
     </w:p>
     <w:p>

</xml_diff>

<commit_message>
T-0031: versioned contracts on the coordination channel (crew_contract.py)
put, put --new-version --ticket, build-against and status on
crew-coord/<channel>, through crew_coord's public Channel. A version
is frozen from its first build-against; build-against needs an approved
ticket, checks the body hash, appends built_by once and writes the local
binding .work/tickets/<id>/contracts.json. Plan written by the
implementing session; README, daily-workflow guide (rebuilt), codemap,
verify rule, CHANGELOG. Sabotage is L-0635 (harness, T-0087).

Claude-Session: https://claude.ai/code/session_01QLY3kk7DCXpucXGu3wSniW
</commit_message>
<xml_diff>
--- a/docs/guides/crew/crew-daily-workflow.docx
+++ b/docs/guides/crew/crew-daily-workflow.docx
@@ -480,7 +480,37 @@
       </w:r>
       <w:r>
         <w:rPr/>
-        <w:t xml:space="preserve"> runs next and usually says "none" — most tickets touch no document that needs updating.</w:t>
+        <w:t xml:space="preserve"> runs next and usually says "none" — most tickets touch no document that needs updating. Then </w:t>
+      </w:r>
+      <w:r>
+        <w:rPr>
+          <w:rStyle w:val="SourceText"/>
+        </w:rPr>
+        <w:t>crew_gitignore.py check</w:t>
+      </w:r>
+      <w:r>
+        <w:rPr/>
+        <w:t xml:space="preserve"> asks whether the ticket brought a language or manifest whose ignore patterns are missing: it adds them only if the spec's Touch covers </w:t>
+      </w:r>
+      <w:r>
+        <w:rPr>
+          <w:rStyle w:val="SourceText"/>
+        </w:rPr>
+        <w:t>.gitignore</w:t>
+      </w:r>
+      <w:r>
+        <w:rPr/>
+        <w:t xml:space="preserve">, and otherwise the PR body lists them and the next </w:t>
+      </w:r>
+      <w:r>
+        <w:rPr>
+          <w:rStyle w:val="SourceText"/>
+        </w:rPr>
+        <w:t>/crew:onboard</w:t>
+      </w:r>
+      <w:r>
+        <w:rPr/>
+        <w:t xml:space="preserve"> adds them.</w:t>
       </w:r>
     </w:p>
     <w:p>
@@ -1944,8 +1974,178 @@
         <w:jc w:val="left"/>
         <w:rPr/>
       </w:pPr>
-      <w:bookmarkStart w:id="5" w:name="if-something-refuses"/>
+      <w:bookmarkStart w:id="5" w:name="contracts-between-two-sessions"/>
       <w:bookmarkEnd w:id="5"/>
+      <w:r>
+        <w:rPr/>
+        <w:t>Contracts Between Two Sessions</w:t>
+      </w:r>
+    </w:p>
+    <w:p>
+      <w:pPr>
+        <w:pStyle w:val="BodyText"/>
+        <w:bidi w:val="0"/>
+        <w:jc w:val="left"/>
+        <w:rPr/>
+      </w:pPr>
+      <w:r>
+        <w:rPr/>
+        <w:t>When two sessions build against each other (a service and its client, two repositories sharing a format), the interface goes on the coordination channel the claims use, as a numbered version with a content hash:</w:t>
+      </w:r>
+    </w:p>
+    <w:p>
+      <w:pPr>
+        <w:pStyle w:val="BodyText"/>
+        <w:numPr>
+          <w:ilvl w:val="0"/>
+          <w:numId w:val="3"/>
+        </w:numPr>
+        <w:tabs>
+          <w:tab w:val="clear" w:pos="1134"/>
+          <w:tab w:val="left" w:pos="829" w:leader="none"/>
+        </w:tabs>
+        <w:bidi w:val="0"/>
+        <w:spacing w:before="120" w:after="0"/>
+        <w:ind w:hanging="283" w:left="829"/>
+        <w:jc w:val="left"/>
+        <w:rPr/>
+      </w:pPr>
+      <w:r>
+        <w:rPr/>
+        <w:t xml:space="preserve">One side writes the draft: </w:t>
+      </w:r>
+      <w:r>
+        <w:rPr>
+          <w:rStyle w:val="SourceText"/>
+        </w:rPr>
+        <w:t>crew_contract.py put --name &lt;n&gt; --file &lt;path&gt;</w:t>
+      </w:r>
+      <w:r>
+        <w:rPr/>
+        <w:t xml:space="preserve">. While it is a draft, </w:t>
+      </w:r>
+      <w:r>
+        <w:rPr>
+          <w:rStyle w:val="SourceText"/>
+        </w:rPr>
+        <w:t>put</w:t>
+      </w:r>
+      <w:r>
+        <w:rPr/>
+        <w:t xml:space="preserve"> replaces it in place. </w:t>
+      </w:r>
+    </w:p>
+    <w:p>
+      <w:pPr>
+        <w:pStyle w:val="BodyText"/>
+        <w:numPr>
+          <w:ilvl w:val="0"/>
+          <w:numId w:val="3"/>
+        </w:numPr>
+        <w:tabs>
+          <w:tab w:val="clear" w:pos="1134"/>
+          <w:tab w:val="left" w:pos="829" w:leader="none"/>
+        </w:tabs>
+        <w:bidi w:val="0"/>
+        <w:spacing w:before="120" w:after="0"/>
+        <w:ind w:hanging="283" w:left="829"/>
+        <w:jc w:val="left"/>
+        <w:rPr/>
+      </w:pPr>
+      <w:r>
+        <w:rPr/>
+        <w:t xml:space="preserve">Each side, once its ticket is approved, records what it built against: </w:t>
+      </w:r>
+      <w:r>
+        <w:rPr>
+          <w:rStyle w:val="SourceText"/>
+        </w:rPr>
+        <w:t>crew_contract.py build-against --name &lt;n&gt; --version &lt;N&gt; --ticket &lt;id&gt;</w:t>
+      </w:r>
+      <w:r>
+        <w:rPr/>
+        <w:t xml:space="preserve">. That freezes the version and writes the binding to </w:t>
+      </w:r>
+      <w:r>
+        <w:rPr>
+          <w:rStyle w:val="SourceText"/>
+        </w:rPr>
+        <w:t>.work/tickets/&lt;id&gt;/contracts.json</w:t>
+      </w:r>
+      <w:r>
+        <w:rPr/>
+        <w:t xml:space="preserve">. </w:t>
+      </w:r>
+    </w:p>
+    <w:p>
+      <w:pPr>
+        <w:pStyle w:val="BodyText"/>
+        <w:numPr>
+          <w:ilvl w:val="0"/>
+          <w:numId w:val="3"/>
+        </w:numPr>
+        <w:tabs>
+          <w:tab w:val="clear" w:pos="1134"/>
+          <w:tab w:val="left" w:pos="829" w:leader="none"/>
+        </w:tabs>
+        <w:bidi w:val="0"/>
+        <w:ind w:hanging="283" w:left="829"/>
+        <w:jc w:val="left"/>
+        <w:rPr/>
+      </w:pPr>
+      <w:r>
+        <w:rPr/>
+        <w:t xml:space="preserve">A frozen version is never edited. A change is a new version tied to a new ticket on each side: </w:t>
+      </w:r>
+      <w:r>
+        <w:rPr>
+          <w:rStyle w:val="SourceText"/>
+        </w:rPr>
+        <w:t>put --name &lt;n&gt; --file &lt;path&gt; --new-version --ticket &lt;new id&gt;</w:t>
+      </w:r>
+      <w:r>
+        <w:rPr/>
+        <w:t xml:space="preserve">. </w:t>
+      </w:r>
+    </w:p>
+    <w:p>
+      <w:pPr>
+        <w:pStyle w:val="BodyText"/>
+        <w:bidi w:val="0"/>
+        <w:jc w:val="left"/>
+        <w:rPr/>
+      </w:pPr>
+      <w:r>
+        <w:rPr>
+          <w:rStyle w:val="SourceText"/>
+        </w:rPr>
+        <w:t>crew_contract.py status</w:t>
+      </w:r>
+      <w:r>
+        <w:rPr/>
+        <w:t xml:space="preserve"> lists every version, who built against it and anything it cannot read (</w:t>
+      </w:r>
+      <w:r>
+        <w:rPr>
+          <w:rStyle w:val="SourceText"/>
+        </w:rPr>
+        <w:t>unknown</w:t>
+      </w:r>
+      <w:r>
+        <w:rPr/>
+        <w:t>, never skipped). Everything on the channel is peer-written data; see the plugin README's "Versioned contracts".</w:t>
+      </w:r>
+    </w:p>
+    <w:p>
+      <w:pPr>
+        <w:pStyle w:val="Heading2"/>
+        <w:bidi w:val="0"/>
+        <w:ind w:hanging="0" w:left="0" w:right="0"/>
+        <w:jc w:val="left"/>
+        <w:rPr/>
+      </w:pPr>
+      <w:bookmarkStart w:id="6" w:name="if-something-refuses"/>
+      <w:bookmarkEnd w:id="6"/>
       <w:r>
         <w:rPr/>
         <w:t>If Something Refuses</w:t>
@@ -2595,8 +2795,8 @@
         <w:jc w:val="left"/>
         <w:rPr/>
       </w:pPr>
-      <w:bookmarkStart w:id="6" w:name="scope-and-approval"/>
-      <w:bookmarkEnd w:id="6"/>
+      <w:bookmarkStart w:id="7" w:name="scope-and-approval"/>
+      <w:bookmarkEnd w:id="7"/>
       <w:r>
         <w:rPr/>
         <w:t>Scope and Approval</w:t>
@@ -2622,8 +2822,8 @@
         <w:jc w:val="left"/>
         <w:rPr/>
       </w:pPr>
-      <w:bookmarkStart w:id="7" w:name="the-contract"/>
-      <w:bookmarkEnd w:id="7"/>
+      <w:bookmarkStart w:id="8" w:name="the-contract"/>
+      <w:bookmarkEnd w:id="8"/>
       <w:r>
         <w:rPr/>
         <w:t>The Contract</w:t>
@@ -2649,159 +2849,6 @@
       <w:r>
         <w:rPr/>
         <w:t>:</w:t>
-      </w:r>
-    </w:p>
-    <w:p>
-      <w:pPr>
-        <w:pStyle w:val="BodyText"/>
-        <w:numPr>
-          <w:ilvl w:val="0"/>
-          <w:numId w:val="3"/>
-        </w:numPr>
-        <w:tabs>
-          <w:tab w:val="clear" w:pos="1134"/>
-          <w:tab w:val="left" w:pos="829" w:leader="none"/>
-        </w:tabs>
-        <w:bidi w:val="0"/>
-        <w:ind w:hanging="283" w:left="829"/>
-        <w:jc w:val="left"/>
-        <w:rPr/>
-      </w:pPr>
-      <w:r>
-        <w:rPr>
-          <w:rStyle w:val="SourceText"/>
-        </w:rPr>
-        <w:t>spec.md</w:t>
-      </w:r>
-      <w:r>
-        <w:rPr/>
-        <w:t xml:space="preserve"> has six sections: </w:t>
-      </w:r>
-      <w:r>
-        <w:rPr>
-          <w:rStyle w:val="SourceText"/>
-        </w:rPr>
-        <w:t>## Intent</w:t>
-      </w:r>
-      <w:r>
-        <w:rPr/>
-        <w:t xml:space="preserve">, </w:t>
-      </w:r>
-      <w:r>
-        <w:rPr>
-          <w:rStyle w:val="SourceText"/>
-        </w:rPr>
-        <w:t>## Exclusions</w:t>
-      </w:r>
-      <w:r>
-        <w:rPr/>
-        <w:t xml:space="preserve">, </w:t>
-      </w:r>
-      <w:r>
-        <w:rPr>
-          <w:rStyle w:val="SourceText"/>
-        </w:rPr>
-        <w:t>## Evidence</w:t>
-      </w:r>
-      <w:r>
-        <w:rPr/>
-        <w:t xml:space="preserve">, </w:t>
-      </w:r>
-      <w:r>
-        <w:rPr>
-          <w:rStyle w:val="SourceText"/>
-        </w:rPr>
-        <w:t>## Unknowns</w:t>
-      </w:r>
-      <w:r>
-        <w:rPr/>
-        <w:t xml:space="preserve">, </w:t>
-      </w:r>
-      <w:r>
-        <w:rPr>
-          <w:rStyle w:val="SourceText"/>
-        </w:rPr>
-        <w:t>## Touch</w:t>
-      </w:r>
-      <w:r>
-        <w:rPr/>
-        <w:t xml:space="preserve"> and </w:t>
-      </w:r>
-      <w:r>
-        <w:rPr>
-          <w:rStyle w:val="SourceText"/>
-        </w:rPr>
-        <w:t>## Acceptance checks</w:t>
-      </w:r>
-      <w:r>
-        <w:rPr/>
-        <w:t xml:space="preserve">. </w:t>
-      </w:r>
-      <w:r>
-        <w:rPr>
-          <w:rStyle w:val="SourceText"/>
-        </w:rPr>
-        <w:t>## Touch</w:t>
-      </w:r>
-      <w:r>
-        <w:rPr/>
-        <w:t xml:space="preserve"> lists one repo-relative glob or path per bullet: </w:t>
-      </w:r>
-    </w:p>
-    <w:p>
-      <w:pPr>
-        <w:pStyle w:val="PreformattedText"/>
-        <w:bidi w:val="0"/>
-        <w:jc w:val="left"/>
-        <w:rPr/>
-      </w:pPr>
-      <w:r>
-        <w:rPr>
-          <w:rStyle w:val="SourceText"/>
-        </w:rPr>
-        <w:t>## Touch</w:t>
-      </w:r>
-    </w:p>
-    <w:p>
-      <w:pPr>
-        <w:pStyle w:val="PreformattedText"/>
-        <w:bidi w:val="0"/>
-        <w:jc w:val="left"/>
-        <w:rPr/>
-      </w:pPr>
-      <w:r>
-        <w:rPr>
-          <w:rStyle w:val="SourceText"/>
-        </w:rPr>
-        <w:t>- `src/export/**`</w:t>
-      </w:r>
-    </w:p>
-    <w:p>
-      <w:pPr>
-        <w:pStyle w:val="PreformattedText"/>
-        <w:bidi w:val="0"/>
-        <w:jc w:val="left"/>
-        <w:rPr/>
-      </w:pPr>
-      <w:r>
-        <w:rPr>
-          <w:rStyle w:val="SourceText"/>
-        </w:rPr>
-        <w:t>- `tests/test_export.py`</w:t>
-      </w:r>
-    </w:p>
-    <w:p>
-      <w:pPr>
-        <w:pStyle w:val="PreformattedText"/>
-        <w:bidi w:val="0"/>
-        <w:jc w:val="left"/>
-        <w:rPr/>
-      </w:pPr>
-      <w:r>
-        <w:rPr>
-          <w:rStyle w:val="SourceText"/>
-        </w:rPr>
-        <w:t>- `docs/export.md`</w:t>
       </w:r>
     </w:p>
     <w:p>
@@ -2824,63 +2871,81 @@
         <w:rPr>
           <w:rStyle w:val="SourceText"/>
         </w:rPr>
-        <w:t>plan.md</w:t>
-      </w:r>
-      <w:r>
-        <w:rPr/>
-        <w:t xml:space="preserve"> is a list of steps. Each step has a </w:t>
-      </w:r>
-      <w:r>
-        <w:rPr>
-          <w:rStyle w:val="SourceText"/>
-        </w:rPr>
-        <w:t>Files:</w:t>
-      </w:r>
-      <w:r>
-        <w:rPr/>
-        <w:t xml:space="preserve"> line, a </w:t>
-      </w:r>
-      <w:r>
-        <w:rPr>
-          <w:rStyle w:val="SourceText"/>
-        </w:rPr>
-        <w:t>Test:</w:t>
-      </w:r>
-      <w:r>
-        <w:rPr/>
-        <w:t xml:space="preserve"> line and a </w:t>
-      </w:r>
-      <w:r>
-        <w:rPr>
-          <w:rStyle w:val="SourceText"/>
-        </w:rPr>
-        <w:t>Risk:</w:t>
-      </w:r>
-      <w:r>
-        <w:rPr/>
-        <w:t xml:space="preserve"> line. Every </w:t>
-      </w:r>
-      <w:r>
-        <w:rPr>
-          <w:rStyle w:val="SourceText"/>
-        </w:rPr>
-        <w:t>Files:</w:t>
-      </w:r>
-      <w:r>
-        <w:rPr/>
-        <w:t xml:space="preserve"> entry must fall inside Touch. A plan cannot add a path the spec does not list. </w:t>
-      </w:r>
-    </w:p>
-    <w:p>
-      <w:pPr>
-        <w:pStyle w:val="BodyText"/>
-        <w:bidi w:val="0"/>
-        <w:jc w:val="left"/>
-        <w:rPr/>
-      </w:pPr>
-      <w:r>
-        <w:rPr/>
-        <w:t>Check the contract at any time:</w:t>
+        <w:t>spec.md</w:t>
+      </w:r>
+      <w:r>
+        <w:rPr/>
+        <w:t xml:space="preserve"> has six sections: </w:t>
+      </w:r>
+      <w:r>
+        <w:rPr>
+          <w:rStyle w:val="SourceText"/>
+        </w:rPr>
+        <w:t>## Intent</w:t>
+      </w:r>
+      <w:r>
+        <w:rPr/>
+        <w:t xml:space="preserve">, </w:t>
+      </w:r>
+      <w:r>
+        <w:rPr>
+          <w:rStyle w:val="SourceText"/>
+        </w:rPr>
+        <w:t>## Exclusions</w:t>
+      </w:r>
+      <w:r>
+        <w:rPr/>
+        <w:t xml:space="preserve">, </w:t>
+      </w:r>
+      <w:r>
+        <w:rPr>
+          <w:rStyle w:val="SourceText"/>
+        </w:rPr>
+        <w:t>## Evidence</w:t>
+      </w:r>
+      <w:r>
+        <w:rPr/>
+        <w:t xml:space="preserve">, </w:t>
+      </w:r>
+      <w:r>
+        <w:rPr>
+          <w:rStyle w:val="SourceText"/>
+        </w:rPr>
+        <w:t>## Unknowns</w:t>
+      </w:r>
+      <w:r>
+        <w:rPr/>
+        <w:t xml:space="preserve">, </w:t>
+      </w:r>
+      <w:r>
+        <w:rPr>
+          <w:rStyle w:val="SourceText"/>
+        </w:rPr>
+        <w:t>## Touch</w:t>
+      </w:r>
+      <w:r>
+        <w:rPr/>
+        <w:t xml:space="preserve"> and </w:t>
+      </w:r>
+      <w:r>
+        <w:rPr>
+          <w:rStyle w:val="SourceText"/>
+        </w:rPr>
+        <w:t>## Acceptance checks</w:t>
+      </w:r>
+      <w:r>
+        <w:rPr/>
+        <w:t xml:space="preserve">. </w:t>
+      </w:r>
+      <w:r>
+        <w:rPr>
+          <w:rStyle w:val="SourceText"/>
+        </w:rPr>
+        <w:t>## Touch</w:t>
+      </w:r>
+      <w:r>
+        <w:rPr/>
+        <w:t xml:space="preserve"> lists one repo-relative glob or path per bullet: </w:t>
       </w:r>
     </w:p>
     <w:p>
@@ -2894,56 +2959,7 @@
         <w:rPr>
           <w:rStyle w:val="SourceText"/>
         </w:rPr>
-        <w:t>python3 &lt;crew&gt;/hooks/scripts/crew_ticket.py validate --ticket T-0042</w:t>
-      </w:r>
-    </w:p>
-    <w:p>
-      <w:pPr>
-        <w:pStyle w:val="BodyText"/>
-        <w:bidi w:val="0"/>
-        <w:jc w:val="left"/>
-        <w:rPr/>
-      </w:pPr>
-      <w:r>
-        <w:rPr/>
-        <w:t xml:space="preserve">A plan path outside Touch is reported as </w:t>
-      </w:r>
-      <w:r>
-        <w:rPr>
-          <w:rStyle w:val="SourceText"/>
-        </w:rPr>
-        <w:t>INVALID: plan Files entry '...' is outside spec ## Touch</w:t>
-      </w:r>
-      <w:r>
-        <w:rPr/>
-        <w:t>. To fix it, add the path to Touch. crew never widens Touch for you.</w:t>
-      </w:r>
-    </w:p>
-    <w:p>
-      <w:pPr>
-        <w:pStyle w:val="Heading3"/>
-        <w:bidi w:val="0"/>
-        <w:ind w:hanging="0" w:left="0" w:right="0"/>
-        <w:jc w:val="left"/>
-        <w:rPr/>
-      </w:pPr>
-      <w:bookmarkStart w:id="8" w:name="approval"/>
-      <w:bookmarkEnd w:id="8"/>
-      <w:r>
-        <w:rPr/>
-        <w:t>Approval</w:t>
-      </w:r>
-    </w:p>
-    <w:p>
-      <w:pPr>
-        <w:pStyle w:val="BodyText"/>
-        <w:bidi w:val="0"/>
-        <w:jc w:val="left"/>
-        <w:rPr/>
-      </w:pPr>
-      <w:r>
-        <w:rPr/>
-        <w:t>When the plan is ready, the session asks you to approve it. Type this yourself:</w:t>
+        <w:t>## Touch</w:t>
       </w:r>
     </w:p>
     <w:p>
@@ -2957,297 +2973,35 @@
         <w:rPr>
           <w:rStyle w:val="SourceText"/>
         </w:rPr>
-        <w:t>/crew:approve T-0042</w:t>
-      </w:r>
-    </w:p>
-    <w:p>
-      <w:pPr>
-        <w:pStyle w:val="BodyText"/>
-        <w:bidi w:val="0"/>
-        <w:jc w:val="left"/>
-        <w:rPr/>
-      </w:pPr>
-      <w:r>
-        <w:rPr/>
-        <w:t xml:space="preserve">crew's UserPromptSubmit hook sees the prompt you typed, validates the contract, then records the sha256 of </w:t>
-      </w:r>
-      <w:r>
-        <w:rPr>
-          <w:rStyle w:val="SourceText"/>
-        </w:rPr>
-        <w:t>spec.md</w:t>
-      </w:r>
-      <w:r>
-        <w:rPr/>
-        <w:t xml:space="preserve"> and </w:t>
-      </w:r>
-      <w:r>
-        <w:rPr>
-          <w:rStyle w:val="SourceText"/>
-        </w:rPr>
-        <w:t>plan.md</w:t>
-      </w:r>
-      <w:r>
-        <w:rPr/>
-        <w:t xml:space="preserve"> in </w:t>
-      </w:r>
-      <w:r>
-        <w:rPr>
-          <w:rStyle w:val="SourceText"/>
-        </w:rPr>
-        <w:t>&lt;git-common-dir&gt;/crew/tickets/T-0042/approval.json</w:t>
-      </w:r>
-      <w:r>
-        <w:rPr/>
-        <w:t xml:space="preserve">, marked </w:t>
-      </w:r>
-      <w:r>
-        <w:rPr>
-          <w:rStyle w:val="SourceText"/>
-        </w:rPr>
-        <w:t>approved_via: "user-prompt"</w:t>
-      </w:r>
-      <w:r>
-        <w:rPr/>
-        <w:t xml:space="preserve">. If the contract does not validate, the hook blocks the prompt and says why. That file is outside the worktree, and the scope guard refuses any Write or Edit to it and any shell command that runs </w:t>
-      </w:r>
-      <w:r>
-        <w:rPr>
-          <w:rStyle w:val="SourceText"/>
-        </w:rPr>
-        <w:t>crew_ticket.py approve</w:t>
-      </w:r>
-      <w:r>
-        <w:rPr/>
-        <w:t xml:space="preserve">, so the session cannot approve its own plan. The one exception is opt-in: with </w:t>
-      </w:r>
-      <w:r>
-        <w:rPr>
-          <w:rStyle w:val="SourceText"/>
-        </w:rPr>
-        <w:t>scope.allowCliApproval: true</w:t>
-      </w:r>
-      <w:r>
-        <w:rPr/>
-        <w:t xml:space="preserve"> and </w:t>
-      </w:r>
-      <w:r>
-        <w:rPr>
-          <w:rStyle w:val="SourceText"/>
-        </w:rPr>
-        <w:t>autopilot.approval</w:t>
-      </w:r>
-      <w:r>
-        <w:rPr/>
-        <w:t xml:space="preserve"> set to </w:t>
-      </w:r>
-      <w:r>
-        <w:rPr>
-          <w:rStyle w:val="SourceText"/>
-        </w:rPr>
-        <w:t>self</w:t>
-      </w:r>
-      <w:r>
-        <w:rPr/>
-        <w:t xml:space="preserve"> (or </w:t>
-      </w:r>
-      <w:r>
-        <w:rPr>
-          <w:rStyle w:val="SourceText"/>
-        </w:rPr>
-        <w:t>risk</w:t>
-      </w:r>
-      <w:r>
-        <w:rPr/>
-        <w:t xml:space="preserve">, for a </w:t>
-      </w:r>
-      <w:r>
-        <w:rPr>
-          <w:rStyle w:val="SourceText"/>
-        </w:rPr>
-        <w:t>risk: low</w:t>
-      </w:r>
-      <w:r>
-        <w:rPr/>
-        <w:t xml:space="preserve"> spec), </w:t>
-      </w:r>
-      <w:r>
-        <w:rPr>
-          <w:rStyle w:val="SourceText"/>
-        </w:rPr>
-        <w:t>/crew:autopilot</w:t>
-      </w:r>
-      <w:r>
-        <w:rPr/>
-        <w:t xml:space="preserve"> runs </w:t>
-      </w:r>
-      <w:r>
-        <w:rPr>
-          <w:rStyle w:val="SourceText"/>
-        </w:rPr>
-        <w:t>crew_autopilot.py approve</w:t>
-      </w:r>
-      <w:r>
-        <w:rPr/>
-        <w:t xml:space="preserve">. It writes what every approval route writes: </w:t>
-      </w:r>
-      <w:r>
-        <w:rPr>
-          <w:rStyle w:val="SourceText"/>
-        </w:rPr>
-        <w:t>approval.json</w:t>
-      </w:r>
-      <w:r>
-        <w:rPr/>
-        <w:t xml:space="preserve"> (marked </w:t>
-      </w:r>
-      <w:r>
-        <w:rPr>
-          <w:rStyle w:val="SourceText"/>
-        </w:rPr>
-        <w:t>approved_via: "autopilot"</w:t>
-      </w:r>
-      <w:r>
-        <w:rPr/>
-        <w:t xml:space="preserve">), </w:t>
-      </w:r>
-      <w:r>
-        <w:rPr>
-          <w:rStyle w:val="SourceText"/>
-        </w:rPr>
-        <w:t>scope-tickets.json</w:t>
-      </w:r>
-      <w:r>
-        <w:rPr/>
-        <w:t xml:space="preserve"> on a ticket's first approval, and, for a distinct successor plan under a spent review budget, the review ledger moved NEEDS_REPLAN -&gt; IN_REVIEW. Both default off, so out of the box nothing self-approves. Inside an </w:t>
-      </w:r>
-      <w:r>
-        <w:rPr>
-          <w:rStyle w:val="SourceText"/>
-        </w:rPr>
-        <w:t>autopilot.sleep.schedule</w:t>
-      </w:r>
-      <w:r>
-        <w:rPr/>
-        <w:t xml:space="preserve"> window, </w:t>
-      </w:r>
-      <w:r>
-        <w:rPr>
-          <w:rStyle w:val="SourceText"/>
-        </w:rPr>
-        <w:t>autopilot.sleep.approval</w:t>
-      </w:r>
-      <w:r>
-        <w:rPr/>
-        <w:t xml:space="preserve"> stands in for </w:t>
-      </w:r>
-      <w:r>
-        <w:rPr>
-          <w:rStyle w:val="SourceText"/>
-        </w:rPr>
-        <w:t>autopilot.approval</w:t>
-      </w:r>
-      <w:r>
-        <w:rPr/>
-        <w:t xml:space="preserve"> (T-0053), and a receipt written asleep stops standing when the window ends if the day value would not have approved it: in the morning that ticket waits for </w:t>
-      </w:r>
-      <w:r>
-        <w:rPr>
-          <w:rStyle w:val="SourceText"/>
-        </w:rPr>
-        <w:t>/crew:approve &lt;id&gt;</w:t>
-      </w:r>
-      <w:r>
-        <w:rPr/>
-        <w:t xml:space="preserve">. </w:t>
-      </w:r>
-      <w:r>
-        <w:rPr>
-          <w:rStyle w:val="SourceText"/>
-        </w:rPr>
-        <w:t>/crew:autopilot sleep</w:t>
-      </w:r>
-      <w:r>
-        <w:rPr/>
-        <w:t xml:space="preserve"> starts sleep mode now, until the window's end (12 hours with no window), and </w:t>
-      </w:r>
-      <w:r>
-        <w:rPr>
-          <w:rStyle w:val="SourceText"/>
-        </w:rPr>
-        <w:t>/crew:autopilot wake</w:t>
-      </w:r>
-      <w:r>
-        <w:rPr/>
-        <w:t xml:space="preserve"> ends it now (L-0652); they write only </w:t>
-      </w:r>
-      <w:r>
-        <w:rPr>
-          <w:rStyle w:val="SourceText"/>
-        </w:rPr>
-        <w:t>&lt;git-common-dir&gt;/crew/autopilot-sleep.json</w:t>
-      </w:r>
-      <w:r>
-        <w:rPr/>
-        <w:t xml:space="preserve">. Until L-1504 a manual sleep only tightens: outside the window it applies a night value only where it is stricter than the day value. </w:t>
-      </w:r>
-      <w:r>
-        <w:rPr>
-          <w:rStyle w:val="SourceText"/>
-        </w:rPr>
-        <w:t>sleep</w:t>
-      </w:r>
-      <w:r>
-        <w:rPr/>
-        <w:t xml:space="preserve"> needs </w:t>
-      </w:r>
-      <w:r>
-        <w:rPr>
-          <w:rStyle w:val="SourceText"/>
-        </w:rPr>
-        <w:t>scope.allowCliApproval: true</w:t>
-      </w:r>
-      <w:r>
-        <w:rPr/>
-        <w:t xml:space="preserve"> and an override stricter than its day value, or the window open. Autopilot's one other ledger writer is </w:t>
-      </w:r>
-      <w:r>
-        <w:rPr>
-          <w:rStyle w:val="SourceText"/>
-        </w:rPr>
-        <w:t>crew_autopilot.py auto-reject</w:t>
-      </w:r>
-      <w:r>
-        <w:rPr/>
-        <w:t xml:space="preserve"> (T-0074), only with </w:t>
-      </w:r>
-      <w:r>
-        <w:rPr>
-          <w:rStyle w:val="SourceText"/>
-        </w:rPr>
-        <w:t>autopilot.maxAutoReplans</w:t>
-      </w:r>
-      <w:r>
-        <w:rPr/>
-        <w:t xml:space="preserve"> set: it moves the ledger REVIEWED -&gt; NEEDS_REPLAN after a final round with a BLOCK. The approval is a step you take, not a lock.</w:t>
-      </w:r>
-    </w:p>
-    <w:p>
-      <w:pPr>
-        <w:pStyle w:val="BodyText"/>
-        <w:bidi w:val="0"/>
-        <w:jc w:val="left"/>
-        <w:rPr/>
-      </w:pPr>
-      <w:r>
-        <w:rPr>
-          <w:rStyle w:val="SourceText"/>
-        </w:rPr>
-        <w:t>crew_ticket.py status --ticket T-0042</w:t>
-      </w:r>
-      <w:r>
-        <w:rPr/>
-        <w:t xml:space="preserve"> prints one of three states:</w:t>
+        <w:t>- `src/export/**`</w:t>
+      </w:r>
+    </w:p>
+    <w:p>
+      <w:pPr>
+        <w:pStyle w:val="PreformattedText"/>
+        <w:bidi w:val="0"/>
+        <w:jc w:val="left"/>
+        <w:rPr/>
+      </w:pPr>
+      <w:r>
+        <w:rPr>
+          <w:rStyle w:val="SourceText"/>
+        </w:rPr>
+        <w:t>- `tests/test_export.py`</w:t>
+      </w:r>
+    </w:p>
+    <w:p>
+      <w:pPr>
+        <w:pStyle w:val="PreformattedText"/>
+        <w:bidi w:val="0"/>
+        <w:jc w:val="left"/>
+        <w:rPr/>
+      </w:pPr>
+      <w:r>
+        <w:rPr>
+          <w:rStyle w:val="SourceText"/>
+        </w:rPr>
+        <w:t>- `docs/export.md`</w:t>
       </w:r>
     </w:p>
     <w:p>
@@ -3262,7 +3016,6 @@
           <w:tab w:val="left" w:pos="829" w:leader="none"/>
         </w:tabs>
         <w:bidi w:val="0"/>
-        <w:spacing w:before="120" w:after="0"/>
         <w:ind w:hanging="283" w:left="829"/>
         <w:jc w:val="left"/>
         <w:rPr/>
@@ -3271,39 +3024,152 @@
         <w:rPr>
           <w:rStyle w:val="SourceText"/>
         </w:rPr>
-        <w:t>approved</w:t>
-      </w:r>
-      <w:r>
-        <w:rPr/>
-        <w:t xml:space="preserve">: both files match the receipt. </w:t>
-      </w:r>
-    </w:p>
-    <w:p>
-      <w:pPr>
-        <w:pStyle w:val="BodyText"/>
-        <w:numPr>
-          <w:ilvl w:val="0"/>
-          <w:numId w:val="5"/>
-        </w:numPr>
-        <w:tabs>
-          <w:tab w:val="clear" w:pos="1134"/>
-          <w:tab w:val="left" w:pos="829" w:leader="none"/>
-        </w:tabs>
-        <w:bidi w:val="0"/>
-        <w:spacing w:before="120" w:after="0"/>
-        <w:ind w:hanging="283" w:left="829"/>
-        <w:jc w:val="left"/>
-        <w:rPr/>
-      </w:pPr>
-      <w:r>
-        <w:rPr>
-          <w:rStyle w:val="SourceText"/>
-        </w:rPr>
-        <w:t>stale</w:t>
-      </w:r>
-      <w:r>
-        <w:rPr/>
-        <w:t xml:space="preserve">: </w:t>
+        <w:t>plan.md</w:t>
+      </w:r>
+      <w:r>
+        <w:rPr/>
+        <w:t xml:space="preserve"> is a list of steps. Each step has a </w:t>
+      </w:r>
+      <w:r>
+        <w:rPr>
+          <w:rStyle w:val="SourceText"/>
+        </w:rPr>
+        <w:t>Files:</w:t>
+      </w:r>
+      <w:r>
+        <w:rPr/>
+        <w:t xml:space="preserve"> line, a </w:t>
+      </w:r>
+      <w:r>
+        <w:rPr>
+          <w:rStyle w:val="SourceText"/>
+        </w:rPr>
+        <w:t>Test:</w:t>
+      </w:r>
+      <w:r>
+        <w:rPr/>
+        <w:t xml:space="preserve"> line and a </w:t>
+      </w:r>
+      <w:r>
+        <w:rPr>
+          <w:rStyle w:val="SourceText"/>
+        </w:rPr>
+        <w:t>Risk:</w:t>
+      </w:r>
+      <w:r>
+        <w:rPr/>
+        <w:t xml:space="preserve"> line. Every </w:t>
+      </w:r>
+      <w:r>
+        <w:rPr>
+          <w:rStyle w:val="SourceText"/>
+        </w:rPr>
+        <w:t>Files:</w:t>
+      </w:r>
+      <w:r>
+        <w:rPr/>
+        <w:t xml:space="preserve"> entry must fall inside Touch. A plan cannot add a path the spec does not list. </w:t>
+      </w:r>
+    </w:p>
+    <w:p>
+      <w:pPr>
+        <w:pStyle w:val="BodyText"/>
+        <w:bidi w:val="0"/>
+        <w:jc w:val="left"/>
+        <w:rPr/>
+      </w:pPr>
+      <w:r>
+        <w:rPr/>
+        <w:t>Check the contract at any time:</w:t>
+      </w:r>
+    </w:p>
+    <w:p>
+      <w:pPr>
+        <w:pStyle w:val="PreformattedText"/>
+        <w:bidi w:val="0"/>
+        <w:jc w:val="left"/>
+        <w:rPr/>
+      </w:pPr>
+      <w:r>
+        <w:rPr>
+          <w:rStyle w:val="SourceText"/>
+        </w:rPr>
+        <w:t>python3 &lt;crew&gt;/hooks/scripts/crew_ticket.py validate --ticket T-0042</w:t>
+      </w:r>
+    </w:p>
+    <w:p>
+      <w:pPr>
+        <w:pStyle w:val="BodyText"/>
+        <w:bidi w:val="0"/>
+        <w:jc w:val="left"/>
+        <w:rPr/>
+      </w:pPr>
+      <w:r>
+        <w:rPr/>
+        <w:t xml:space="preserve">A plan path outside Touch is reported as </w:t>
+      </w:r>
+      <w:r>
+        <w:rPr>
+          <w:rStyle w:val="SourceText"/>
+        </w:rPr>
+        <w:t>INVALID: plan Files entry '...' is outside spec ## Touch</w:t>
+      </w:r>
+      <w:r>
+        <w:rPr/>
+        <w:t>. To fix it, add the path to Touch. crew never widens Touch for you.</w:t>
+      </w:r>
+    </w:p>
+    <w:p>
+      <w:pPr>
+        <w:pStyle w:val="Heading3"/>
+        <w:bidi w:val="0"/>
+        <w:ind w:hanging="0" w:left="0" w:right="0"/>
+        <w:jc w:val="left"/>
+        <w:rPr/>
+      </w:pPr>
+      <w:bookmarkStart w:id="9" w:name="approval"/>
+      <w:bookmarkEnd w:id="9"/>
+      <w:r>
+        <w:rPr/>
+        <w:t>Approval</w:t>
+      </w:r>
+    </w:p>
+    <w:p>
+      <w:pPr>
+        <w:pStyle w:val="BodyText"/>
+        <w:bidi w:val="0"/>
+        <w:jc w:val="left"/>
+        <w:rPr/>
+      </w:pPr>
+      <w:r>
+        <w:rPr/>
+        <w:t>When the plan is ready, the session asks you to approve it. Type this yourself:</w:t>
+      </w:r>
+    </w:p>
+    <w:p>
+      <w:pPr>
+        <w:pStyle w:val="PreformattedText"/>
+        <w:bidi w:val="0"/>
+        <w:jc w:val="left"/>
+        <w:rPr/>
+      </w:pPr>
+      <w:r>
+        <w:rPr>
+          <w:rStyle w:val="SourceText"/>
+        </w:rPr>
+        <w:t>/crew:approve T-0042</w:t>
+      </w:r>
+    </w:p>
+    <w:p>
+      <w:pPr>
+        <w:pStyle w:val="BodyText"/>
+        <w:bidi w:val="0"/>
+        <w:jc w:val="left"/>
+        <w:rPr/>
+      </w:pPr>
+      <w:r>
+        <w:rPr/>
+        <w:t xml:space="preserve">crew's UserPromptSubmit hook sees the prompt you typed, validates the contract, then records the sha256 of </w:t>
       </w:r>
       <w:r>
         <w:rPr>
@@ -3313,7 +3179,7 @@
       </w:r>
       <w:r>
         <w:rPr/>
-        <w:t xml:space="preserve"> or </w:t>
+        <w:t xml:space="preserve"> and </w:t>
       </w:r>
       <w:r>
         <w:rPr>
@@ -3323,61 +3189,265 @@
       </w:r>
       <w:r>
         <w:rPr/>
-        <w:t xml:space="preserve"> changed since approval. </w:t>
-      </w:r>
-    </w:p>
-    <w:p>
-      <w:pPr>
-        <w:pStyle w:val="BodyText"/>
-        <w:numPr>
-          <w:ilvl w:val="0"/>
-          <w:numId w:val="5"/>
-        </w:numPr>
-        <w:tabs>
-          <w:tab w:val="clear" w:pos="1134"/>
-          <w:tab w:val="left" w:pos="829" w:leader="none"/>
-        </w:tabs>
-        <w:bidi w:val="0"/>
-        <w:ind w:hanging="283" w:left="829"/>
-        <w:jc w:val="left"/>
-        <w:rPr/>
-      </w:pPr>
-      <w:r>
-        <w:rPr>
-          <w:rStyle w:val="SourceText"/>
-        </w:rPr>
-        <w:t>none</w:t>
-      </w:r>
-      <w:r>
-        <w:rPr/>
-        <w:t xml:space="preserve">: the ticket has never been approved. </w:t>
-      </w:r>
-    </w:p>
-    <w:p>
-      <w:pPr>
-        <w:pStyle w:val="Heading3"/>
-        <w:bidi w:val="0"/>
-        <w:ind w:hanging="0" w:left="0" w:right="0"/>
-        <w:jc w:val="left"/>
-        <w:rPr/>
-      </w:pPr>
-      <w:bookmarkStart w:id="9" w:name="while-you-implement-the-scope-guard"/>
-      <w:bookmarkEnd w:id="9"/>
-      <w:r>
-        <w:rPr/>
-        <w:t>While You Implement: The Scope Guard</w:t>
-      </w:r>
-    </w:p>
-    <w:p>
-      <w:pPr>
-        <w:pStyle w:val="BodyText"/>
-        <w:bidi w:val="0"/>
-        <w:jc w:val="left"/>
-        <w:rPr/>
-      </w:pPr>
-      <w:r>
-        <w:rPr/>
-        <w:t>Before every Write, Edit, MultiEdit or NotebookEdit, the guard checks the target file:</w:t>
+        <w:t xml:space="preserve"> in </w:t>
+      </w:r>
+      <w:r>
+        <w:rPr>
+          <w:rStyle w:val="SourceText"/>
+        </w:rPr>
+        <w:t>&lt;git-common-dir&gt;/crew/tickets/T-0042/approval.json</w:t>
+      </w:r>
+      <w:r>
+        <w:rPr/>
+        <w:t xml:space="preserve">, marked </w:t>
+      </w:r>
+      <w:r>
+        <w:rPr>
+          <w:rStyle w:val="SourceText"/>
+        </w:rPr>
+        <w:t>approved_via: "user-prompt"</w:t>
+      </w:r>
+      <w:r>
+        <w:rPr/>
+        <w:t xml:space="preserve">. If the contract does not validate, the hook blocks the prompt and says why. That file is outside the worktree, and the scope guard refuses any Write or Edit to it and any shell command that runs </w:t>
+      </w:r>
+      <w:r>
+        <w:rPr>
+          <w:rStyle w:val="SourceText"/>
+        </w:rPr>
+        <w:t>crew_ticket.py approve</w:t>
+      </w:r>
+      <w:r>
+        <w:rPr/>
+        <w:t xml:space="preserve">, so the session cannot approve its own plan. The one exception is opt-in: with </w:t>
+      </w:r>
+      <w:r>
+        <w:rPr>
+          <w:rStyle w:val="SourceText"/>
+        </w:rPr>
+        <w:t>scope.allowCliApproval: true</w:t>
+      </w:r>
+      <w:r>
+        <w:rPr/>
+        <w:t xml:space="preserve"> and </w:t>
+      </w:r>
+      <w:r>
+        <w:rPr>
+          <w:rStyle w:val="SourceText"/>
+        </w:rPr>
+        <w:t>autopilot.approval</w:t>
+      </w:r>
+      <w:r>
+        <w:rPr/>
+        <w:t xml:space="preserve"> set to </w:t>
+      </w:r>
+      <w:r>
+        <w:rPr>
+          <w:rStyle w:val="SourceText"/>
+        </w:rPr>
+        <w:t>self</w:t>
+      </w:r>
+      <w:r>
+        <w:rPr/>
+        <w:t xml:space="preserve"> (or </w:t>
+      </w:r>
+      <w:r>
+        <w:rPr>
+          <w:rStyle w:val="SourceText"/>
+        </w:rPr>
+        <w:t>risk</w:t>
+      </w:r>
+      <w:r>
+        <w:rPr/>
+        <w:t xml:space="preserve">, for a </w:t>
+      </w:r>
+      <w:r>
+        <w:rPr>
+          <w:rStyle w:val="SourceText"/>
+        </w:rPr>
+        <w:t>risk: low</w:t>
+      </w:r>
+      <w:r>
+        <w:rPr/>
+        <w:t xml:space="preserve"> spec), </w:t>
+      </w:r>
+      <w:r>
+        <w:rPr>
+          <w:rStyle w:val="SourceText"/>
+        </w:rPr>
+        <w:t>/crew:autopilot</w:t>
+      </w:r>
+      <w:r>
+        <w:rPr/>
+        <w:t xml:space="preserve"> runs </w:t>
+      </w:r>
+      <w:r>
+        <w:rPr>
+          <w:rStyle w:val="SourceText"/>
+        </w:rPr>
+        <w:t>crew_autopilot.py approve</w:t>
+      </w:r>
+      <w:r>
+        <w:rPr/>
+        <w:t xml:space="preserve">. It writes what every approval route writes: </w:t>
+      </w:r>
+      <w:r>
+        <w:rPr>
+          <w:rStyle w:val="SourceText"/>
+        </w:rPr>
+        <w:t>approval.json</w:t>
+      </w:r>
+      <w:r>
+        <w:rPr/>
+        <w:t xml:space="preserve"> (marked </w:t>
+      </w:r>
+      <w:r>
+        <w:rPr>
+          <w:rStyle w:val="SourceText"/>
+        </w:rPr>
+        <w:t>approved_via: "autopilot"</w:t>
+      </w:r>
+      <w:r>
+        <w:rPr/>
+        <w:t xml:space="preserve">), </w:t>
+      </w:r>
+      <w:r>
+        <w:rPr>
+          <w:rStyle w:val="SourceText"/>
+        </w:rPr>
+        <w:t>scope-tickets.json</w:t>
+      </w:r>
+      <w:r>
+        <w:rPr/>
+        <w:t xml:space="preserve"> on a ticket's first approval, and, for a distinct successor plan under a spent review budget, the review ledger moved NEEDS_REPLAN -&gt; IN_REVIEW. Both default off, so out of the box nothing self-approves. Inside an </w:t>
+      </w:r>
+      <w:r>
+        <w:rPr>
+          <w:rStyle w:val="SourceText"/>
+        </w:rPr>
+        <w:t>autopilot.sleep.schedule</w:t>
+      </w:r>
+      <w:r>
+        <w:rPr/>
+        <w:t xml:space="preserve"> window, </w:t>
+      </w:r>
+      <w:r>
+        <w:rPr>
+          <w:rStyle w:val="SourceText"/>
+        </w:rPr>
+        <w:t>autopilot.sleep.approval</w:t>
+      </w:r>
+      <w:r>
+        <w:rPr/>
+        <w:t xml:space="preserve"> stands in for </w:t>
+      </w:r>
+      <w:r>
+        <w:rPr>
+          <w:rStyle w:val="SourceText"/>
+        </w:rPr>
+        <w:t>autopilot.approval</w:t>
+      </w:r>
+      <w:r>
+        <w:rPr/>
+        <w:t xml:space="preserve"> (T-0053), and a receipt written asleep stops standing when the window ends if the day value would not have approved it: in the morning that ticket waits for </w:t>
+      </w:r>
+      <w:r>
+        <w:rPr>
+          <w:rStyle w:val="SourceText"/>
+        </w:rPr>
+        <w:t>/crew:approve &lt;id&gt;</w:t>
+      </w:r>
+      <w:r>
+        <w:rPr/>
+        <w:t xml:space="preserve">. </w:t>
+      </w:r>
+      <w:r>
+        <w:rPr>
+          <w:rStyle w:val="SourceText"/>
+        </w:rPr>
+        <w:t>/crew:autopilot sleep</w:t>
+      </w:r>
+      <w:r>
+        <w:rPr/>
+        <w:t xml:space="preserve"> starts sleep mode now, until the window's end (12 hours with no window), and </w:t>
+      </w:r>
+      <w:r>
+        <w:rPr>
+          <w:rStyle w:val="SourceText"/>
+        </w:rPr>
+        <w:t>/crew:autopilot wake</w:t>
+      </w:r>
+      <w:r>
+        <w:rPr/>
+        <w:t xml:space="preserve"> ends it now (L-0652); they write only </w:t>
+      </w:r>
+      <w:r>
+        <w:rPr>
+          <w:rStyle w:val="SourceText"/>
+        </w:rPr>
+        <w:t>&lt;git-common-dir&gt;/crew/autopilot-sleep.json</w:t>
+      </w:r>
+      <w:r>
+        <w:rPr/>
+        <w:t xml:space="preserve">. Until L-1504 a manual sleep only tightens: outside the window it applies a night value only where it is stricter than the day value. </w:t>
+      </w:r>
+      <w:r>
+        <w:rPr>
+          <w:rStyle w:val="SourceText"/>
+        </w:rPr>
+        <w:t>sleep</w:t>
+      </w:r>
+      <w:r>
+        <w:rPr/>
+        <w:t xml:space="preserve"> needs </w:t>
+      </w:r>
+      <w:r>
+        <w:rPr>
+          <w:rStyle w:val="SourceText"/>
+        </w:rPr>
+        <w:t>scope.allowCliApproval: true</w:t>
+      </w:r>
+      <w:r>
+        <w:rPr/>
+        <w:t xml:space="preserve"> and an override stricter than its day value, or the window open. Autopilot's one other ledger writer is </w:t>
+      </w:r>
+      <w:r>
+        <w:rPr>
+          <w:rStyle w:val="SourceText"/>
+        </w:rPr>
+        <w:t>crew_autopilot.py auto-reject</w:t>
+      </w:r>
+      <w:r>
+        <w:rPr/>
+        <w:t xml:space="preserve"> (T-0074), only with </w:t>
+      </w:r>
+      <w:r>
+        <w:rPr>
+          <w:rStyle w:val="SourceText"/>
+        </w:rPr>
+        <w:t>autopilot.maxAutoReplans</w:t>
+      </w:r>
+      <w:r>
+        <w:rPr/>
+        <w:t xml:space="preserve"> set: it moves the ledger REVIEWED -&gt; NEEDS_REPLAN after a final round with a BLOCK. The approval is a step you take, not a lock.</w:t>
+      </w:r>
+    </w:p>
+    <w:p>
+      <w:pPr>
+        <w:pStyle w:val="BodyText"/>
+        <w:bidi w:val="0"/>
+        <w:jc w:val="left"/>
+        <w:rPr/>
+      </w:pPr>
+      <w:r>
+        <w:rPr>
+          <w:rStyle w:val="SourceText"/>
+        </w:rPr>
+        <w:t>crew_ticket.py status --ticket T-0042</w:t>
+      </w:r>
+      <w:r>
+        <w:rPr/>
+        <w:t xml:space="preserve"> prints one of three states:</w:t>
       </w:r>
     </w:p>
     <w:p>
@@ -3398,18 +3468,14 @@
         <w:rPr/>
       </w:pPr>
       <w:r>
-        <w:rPr/>
-        <w:t xml:space="preserve">The ticket's own </w:t>
-      </w:r>
-      <w:r>
-        <w:rPr>
-          <w:rStyle w:val="SourceText"/>
-        </w:rPr>
-        <w:t>.work/tickets/&lt;id&gt;/</w:t>
-      </w:r>
-      <w:r>
-        <w:rPr/>
-        <w:t xml:space="preserve"> files are always allowed, so you can amend the spec and plan. </w:t>
+        <w:rPr>
+          <w:rStyle w:val="SourceText"/>
+        </w:rPr>
+        <w:t>approved</w:t>
+      </w:r>
+      <w:r>
+        <w:rPr/>
+        <w:t xml:space="preserve">: both files match the receipt. </w:t>
       </w:r>
     </w:p>
     <w:p>
@@ -3430,8 +3496,34 @@
         <w:rPr/>
       </w:pPr>
       <w:r>
-        <w:rPr/>
-        <w:t xml:space="preserve">Any other file needs a current approval and a path inside Touch. </w:t>
+        <w:rPr>
+          <w:rStyle w:val="SourceText"/>
+        </w:rPr>
+        <w:t>stale</w:t>
+      </w:r>
+      <w:r>
+        <w:rPr/>
+        <w:t xml:space="preserve">: </w:t>
+      </w:r>
+      <w:r>
+        <w:rPr>
+          <w:rStyle w:val="SourceText"/>
+        </w:rPr>
+        <w:t>spec.md</w:t>
+      </w:r>
+      <w:r>
+        <w:rPr/>
+        <w:t xml:space="preserve"> or </w:t>
+      </w:r>
+      <w:r>
+        <w:rPr>
+          <w:rStyle w:val="SourceText"/>
+        </w:rPr>
+        <w:t>plan.md</w:t>
+      </w:r>
+      <w:r>
+        <w:rPr/>
+        <w:t xml:space="preserve"> changed since approval. </w:t>
       </w:r>
     </w:p>
     <w:p>
@@ -3446,203 +3538,19 @@
           <w:tab w:val="left" w:pos="829" w:leader="none"/>
         </w:tabs>
         <w:bidi w:val="0"/>
-        <w:spacing w:before="120" w:after="0"/>
         <w:ind w:hanging="283" w:left="829"/>
         <w:jc w:val="left"/>
         <w:rPr/>
       </w:pPr>
       <w:r>
-        <w:rPr/>
-        <w:t xml:space="preserve">The code map, the diagrams dir, the graph dir and </w:t>
-      </w:r>
-      <w:r>
-        <w:rPr>
-          <w:rStyle w:val="SourceText"/>
-        </w:rPr>
-        <w:t>.claude/rules/</w:t>
-      </w:r>
-      <w:r>
-        <w:rPr/>
-        <w:t xml:space="preserve"> are writable for an approved ticket, because </w:t>
-      </w:r>
-      <w:r>
-        <w:rPr>
-          <w:rStyle w:val="SourceText"/>
-        </w:rPr>
-        <w:t>/crew:implement</w:t>
-      </w:r>
-      <w:r>
-        <w:rPr/>
-        <w:t xml:space="preserve"> step 6 refreshes them. </w:t>
-      </w:r>
-    </w:p>
-    <w:p>
-      <w:pPr>
-        <w:pStyle w:val="BodyText"/>
-        <w:numPr>
-          <w:ilvl w:val="0"/>
-          <w:numId w:val="6"/>
-        </w:numPr>
-        <w:tabs>
-          <w:tab w:val="clear" w:pos="1134"/>
-          <w:tab w:val="left" w:pos="829" w:leader="none"/>
-        </w:tabs>
-        <w:bidi w:val="0"/>
-        <w:spacing w:before="120" w:after="0"/>
-        <w:ind w:hanging="283" w:left="829"/>
-        <w:jc w:val="left"/>
-        <w:rPr/>
-      </w:pPr>
-      <w:r>
-        <w:rPr/>
-        <w:t xml:space="preserve">Nothing else is exempt: </w:t>
-      </w:r>
-      <w:r>
-        <w:rPr>
-          <w:rStyle w:val="SourceText"/>
-        </w:rPr>
-        <w:t>.crew/</w:t>
-      </w:r>
-      <w:r>
-        <w:rPr/>
-        <w:t xml:space="preserve"> beyond the code map, </w:t>
-      </w:r>
-      <w:r>
-        <w:rPr>
-          <w:rStyle w:val="SourceText"/>
-        </w:rPr>
-        <w:t>TODO.md</w:t>
-      </w:r>
-      <w:r>
-        <w:rPr/>
-        <w:t xml:space="preserve">, the rest of </w:t>
-      </w:r>
-      <w:r>
-        <w:rPr>
-          <w:rStyle w:val="SourceText"/>
-        </w:rPr>
-        <w:t>.claude/</w:t>
-      </w:r>
-      <w:r>
-        <w:rPr/>
-        <w:t xml:space="preserve"> and crew's own policy files. If the ticket changes one of them, list it in Touch. </w:t>
-      </w:r>
-    </w:p>
-    <w:p>
-      <w:pPr>
-        <w:pStyle w:val="BodyText"/>
-        <w:numPr>
-          <w:ilvl w:val="0"/>
-          <w:numId w:val="6"/>
-        </w:numPr>
-        <w:tabs>
-          <w:tab w:val="clear" w:pos="1134"/>
-          <w:tab w:val="left" w:pos="829" w:leader="none"/>
-        </w:tabs>
-        <w:bidi w:val="0"/>
-        <w:ind w:hanging="283" w:left="829"/>
-        <w:jc w:val="left"/>
-        <w:rPr/>
-      </w:pPr>
-      <w:r>
-        <w:rPr/>
-        <w:t xml:space="preserve">Approval receipts, the review ledger and the scope base are always refused. </w:t>
-      </w:r>
-    </w:p>
-    <w:p>
-      <w:pPr>
-        <w:pStyle w:val="BodyText"/>
-        <w:bidi w:val="0"/>
-        <w:jc w:val="left"/>
-        <w:rPr/>
-      </w:pPr>
-      <w:r>
-        <w:rPr/>
-        <w:t xml:space="preserve">The guard checks the real file a symlink points to and the path as written, so a link cannot move a write into or out of scope. </w:t>
-      </w:r>
-      <w:r>
-        <w:rPr>
-          <w:rStyle w:val="SourceText"/>
-        </w:rPr>
-        <w:t>..</w:t>
-      </w:r>
-      <w:r>
-        <w:rPr/>
-        <w:t xml:space="preserve"> is resolved the way the operating system resolves it. Refusals look like this:</w:t>
-      </w:r>
-    </w:p>
-    <w:p>
-      <w:pPr>
-        <w:pStyle w:val="PreformattedText"/>
-        <w:bidi w:val="0"/>
-        <w:jc w:val="left"/>
-        <w:rPr/>
-      </w:pPr>
-      <w:r>
-        <w:rPr>
-          <w:rStyle w:val="SourceText"/>
-        </w:rPr>
-        <w:t>SCOPE GUARD: refused Edit on other/keep.py.</w:t>
-      </w:r>
-    </w:p>
-    <w:p>
-      <w:pPr>
-        <w:pStyle w:val="PreformattedText"/>
-        <w:bidi w:val="0"/>
-        <w:jc w:val="left"/>
-        <w:rPr/>
-      </w:pPr>
-      <w:r>
-        <w:rPr>
-          <w:rStyle w:val="SourceText"/>
-        </w:rPr>
-        <w:t xml:space="preserve">  </w:t>
-      </w:r>
-      <w:r>
-        <w:rPr>
-          <w:rStyle w:val="SourceText"/>
-        </w:rPr>
-        <w:t>Reason: other/keep.py is outside T-0042's spec ## Touch.</w:t>
-      </w:r>
-    </w:p>
-    <w:p>
-      <w:pPr>
-        <w:pStyle w:val="PreformattedText"/>
-        <w:bidi w:val="0"/>
-        <w:jc w:val="left"/>
-        <w:rPr/>
-      </w:pPr>
-      <w:r>
-        <w:rPr>
-          <w:rStyle w:val="SourceText"/>
-        </w:rPr>
-        <w:t xml:space="preserve">  </w:t>
-      </w:r>
-      <w:r>
-        <w:rPr>
-          <w:rStyle w:val="SourceText"/>
-        </w:rPr>
-        <w:t>To widen scope: amend .work/tickets/T-0042/spec.md ## Touch (and plan.md), then ask the user to type</w:t>
-      </w:r>
-    </w:p>
-    <w:p>
-      <w:pPr>
-        <w:pStyle w:val="PreformattedText"/>
-        <w:bidi w:val="0"/>
-        <w:jc w:val="left"/>
-        <w:rPr/>
-      </w:pPr>
-      <w:r>
-        <w:rPr>
-          <w:rStyle w:val="SourceText"/>
-        </w:rPr>
-        <w:t xml:space="preserve">  </w:t>
-      </w:r>
-      <w:r>
-        <w:rPr>
-          <w:rStyle w:val="SourceText"/>
-        </w:rPr>
-        <w:t>`/crew:approve T-0042`. (scope.mode is block)</w:t>
+        <w:rPr>
+          <w:rStyle w:val="SourceText"/>
+        </w:rPr>
+        <w:t>none</w:t>
+      </w:r>
+      <w:r>
+        <w:rPr/>
+        <w:t xml:space="preserve">: the ticket has never been approved. </w:t>
       </w:r>
     </w:p>
     <w:p>
@@ -3653,186 +3561,23 @@
         <w:jc w:val="left"/>
         <w:rPr/>
       </w:pPr>
-      <w:bookmarkStart w:id="10" w:name="at-the-end-of-a-turn-the-completion-audi"/>
+      <w:bookmarkStart w:id="10" w:name="while-you-implement-the-scope-guard"/>
       <w:bookmarkEnd w:id="10"/>
       <w:r>
         <w:rPr/>
-        <w:t>At the End of a Turn: The Completion Audit</w:t>
-      </w:r>
-    </w:p>
-    <w:p>
-      <w:pPr>
-        <w:pStyle w:val="BodyText"/>
-        <w:bidi w:val="0"/>
-        <w:jc w:val="left"/>
-        <w:rPr/>
-      </w:pPr>
-      <w:r>
-        <w:rPr/>
-        <w:t xml:space="preserve">The guard only sees the editing tools. A </w:t>
-      </w:r>
-      <w:r>
-        <w:rPr>
-          <w:rStyle w:val="SourceText"/>
-        </w:rPr>
-        <w:t>sed -i</w:t>
-      </w:r>
-      <w:r>
-        <w:rPr/>
-        <w:t>, a shell redirect or a formatter can still change files. So when the session stops, the completion audit compares the whole tree with the commit the ticket started from. It covers committed, staged, unstaged and untracked changes, and both ends of a rename. After you merge main, a file byte-identical to the merged main commit is not counted: it is main's change, not the ticket's; the verdict names that commit. If any changed path is outside Touch, the audit blocks the stop and lists the paths in six lines or fewer. It never blocks the continuation it caused.</w:t>
-      </w:r>
-    </w:p>
-    <w:p>
-      <w:pPr>
-        <w:pStyle w:val="BodyText"/>
-        <w:bidi w:val="0"/>
-        <w:jc w:val="left"/>
-        <w:rPr/>
-      </w:pPr>
-      <w:r>
-        <w:rPr/>
-        <w:t xml:space="preserve">A changed refresh artifact passes the audit only when a path the ticket changed reaches it and the edit is a re-anchor (the </w:t>
-      </w:r>
-      <w:r>
-        <w:rPr>
-          <w:rStyle w:val="SourceText"/>
-        </w:rPr>
-        <w:t>anchor:</w:t>
-      </w:r>
-      <w:r>
-        <w:rPr/>
-        <w:t xml:space="preserve"> or provenance sha moved forward to a commit on this branch) or a regeneration (</w:t>
-      </w:r>
-      <w:r>
-        <w:rPr>
-          <w:rStyle w:val="SourceText"/>
-        </w:rPr>
-        <w:t>.claude/rules/</w:t>
-      </w:r>
-      <w:r>
-        <w:rPr/>
-        <w:t xml:space="preserve"> as </w:t>
-      </w:r>
-      <w:r>
-        <w:rPr>
-          <w:rStyle w:val="SourceText"/>
-        </w:rPr>
-        <w:t>crew_instructions.py rules</w:t>
-      </w:r>
-      <w:r>
-        <w:rPr/>
-        <w:t xml:space="preserve"> writes them, the graph after a code change). A deleted rendered diagram or graph file, a symlink at or along an artifact's path, a file whose git mode changed, or one removed from the index but left on disk (</w:t>
-      </w:r>
-      <w:r>
-        <w:rPr>
-          <w:rStyle w:val="SourceText"/>
-        </w:rPr>
-        <w:t>git rm --cached</w:t>
-      </w:r>
-      <w:r>
-        <w:rPr/>
-        <w:t xml:space="preserve">: the commit deletes it) never passes. A map claim edited without a re-anchor is listed with </w:t>
-      </w:r>
-      <w:r>
-        <w:rPr>
-          <w:rStyle w:val="SourceText"/>
-        </w:rPr>
-        <w:t>[anchor did not move]</w:t>
-      </w:r>
-      <w:r>
-        <w:rPr/>
-        <w:t xml:space="preserve">, and belongs in Touch if that is what the ticket means to do. When git cannot answer, a rule file cannot be read, a short anchor is ambiguous (two commits share it), the artifact dirs cannot be resolved, or a directory the hook cannot search hides whether the config, a rule or a map exists, or two configured artifact dirs are equally specific for a path, the listing says </w:t>
-      </w:r>
-      <w:r>
-        <w:rPr>
-          <w:rStyle w:val="SourceText"/>
-        </w:rPr>
-        <w:t>[could not tell: ...]</w:t>
-      </w:r>
-      <w:r>
-        <w:rPr/>
-        <w:t xml:space="preserve">, and that never passes. (These verdicts are </w:t>
-      </w:r>
-      <w:r>
-        <w:rPr>
-          <w:rStyle w:val="SourceText"/>
-        </w:rPr>
-        <w:t>crew_refresh_check.py</w:t>
-      </w:r>
-      <w:r>
-        <w:rPr/>
-        <w:t xml:space="preserve">'s; the audit applies them once L-0540 lands, and until then admits the artifact dirs for an approved ticket.) </w:t>
-      </w:r>
-      <w:r>
-        <w:rPr>
-          <w:rStyle w:val="SourceText"/>
-        </w:rPr>
-        <w:t>/crew:done</w:t>
-      </w:r>
-      <w:r>
-        <w:rPr/>
-        <w:t xml:space="preserve"> runs the same check:</w:t>
-      </w:r>
-    </w:p>
-    <w:p>
-      <w:pPr>
-        <w:pStyle w:val="PreformattedText"/>
-        <w:bidi w:val="0"/>
-        <w:jc w:val="left"/>
-        <w:rPr/>
-      </w:pPr>
-      <w:r>
-        <w:rPr>
-          <w:rStyle w:val="SourceText"/>
-        </w:rPr>
-        <w:t>python3 &lt;crew&gt;/hooks/scripts/completion_audit.py --check --ticket T-0042</w:t>
-      </w:r>
-    </w:p>
-    <w:p>
-      <w:pPr>
-        <w:pStyle w:val="BodyText"/>
-        <w:bidi w:val="0"/>
-        <w:jc w:val="left"/>
-        <w:rPr/>
-      </w:pPr>
-      <w:r>
-        <w:rPr/>
-        <w:t xml:space="preserve">The audit sees what git sees. Gitignored files, including everything under </w:t>
-      </w:r>
-      <w:r>
-        <w:rPr>
-          <w:rStyle w:val="SourceText"/>
-        </w:rPr>
-        <w:t>.crew/</w:t>
-      </w:r>
-      <w:r>
-        <w:rPr/>
-        <w:t xml:space="preserve">, and </w:t>
-      </w:r>
-      <w:r>
-        <w:rPr>
-          <w:rStyle w:val="SourceText"/>
-        </w:rPr>
-        <w:t>.work/</w:t>
-      </w:r>
-      <w:r>
-        <w:rPr/>
-        <w:t xml:space="preserve"> are outside it.</w:t>
-      </w:r>
-    </w:p>
-    <w:p>
-      <w:pPr>
-        <w:pStyle w:val="Heading3"/>
-        <w:bidi w:val="0"/>
-        <w:ind w:hanging="0" w:left="0" w:right="0"/>
-        <w:jc w:val="left"/>
-        <w:rPr/>
-      </w:pPr>
-      <w:bookmarkStart w:id="11" w:name="amending-scope"/>
-      <w:bookmarkEnd w:id="11"/>
-      <w:r>
-        <w:rPr/>
-        <w:t>Amending Scope</w:t>
+        <w:t>While You Implement: The Scope Guard</w:t>
+      </w:r>
+    </w:p>
+    <w:p>
+      <w:pPr>
+        <w:pStyle w:val="BodyText"/>
+        <w:bidi w:val="0"/>
+        <w:jc w:val="left"/>
+        <w:rPr/>
+      </w:pPr>
+      <w:r>
+        <w:rPr/>
+        <w:t>Before every Write, Edit, MultiEdit or NotebookEdit, the guard checks the target file:</w:t>
       </w:r>
     </w:p>
     <w:p>
@@ -3854,37 +3599,17 @@
       </w:pPr>
       <w:r>
         <w:rPr/>
-        <w:t xml:space="preserve">Edit </w:t>
-      </w:r>
-      <w:r>
-        <w:rPr>
-          <w:rStyle w:val="SourceText"/>
-        </w:rPr>
-        <w:t>spec.md</w:t>
-      </w:r>
-      <w:r>
-        <w:rPr/>
-        <w:t xml:space="preserve"> </w:t>
-      </w:r>
-      <w:r>
-        <w:rPr>
-          <w:rStyle w:val="SourceText"/>
-        </w:rPr>
-        <w:t>## Touch</w:t>
-      </w:r>
-      <w:r>
-        <w:rPr/>
-        <w:t xml:space="preserve"> to add the path. Update </w:t>
-      </w:r>
-      <w:r>
-        <w:rPr>
-          <w:rStyle w:val="SourceText"/>
-        </w:rPr>
-        <w:t>plan.md</w:t>
-      </w:r>
-      <w:r>
-        <w:rPr/>
-        <w:t xml:space="preserve"> if a step now changes it. </w:t>
+        <w:t xml:space="preserve">The ticket's own </w:t>
+      </w:r>
+      <w:r>
+        <w:rPr>
+          <w:rStyle w:val="SourceText"/>
+        </w:rPr>
+        <w:t>.work/tickets/&lt;id&gt;/</w:t>
+      </w:r>
+      <w:r>
+        <w:rPr/>
+        <w:t xml:space="preserve"> files are always allowed, so you can amend the spec and plan. </w:t>
       </w:r>
     </w:p>
     <w:p>
@@ -3906,17 +3631,7 @@
       </w:pPr>
       <w:r>
         <w:rPr/>
-        <w:t xml:space="preserve">Run </w:t>
-      </w:r>
-      <w:r>
-        <w:rPr>
-          <w:rStyle w:val="SourceText"/>
-        </w:rPr>
-        <w:t>crew_ticket.py validate --ticket &lt;id&gt;</w:t>
-      </w:r>
-      <w:r>
-        <w:rPr/>
-        <w:t xml:space="preserve">. </w:t>
+        <w:t xml:space="preserve">Any other file needs a current approval and a path inside Touch. </w:t>
       </w:r>
     </w:p>
     <w:p>
@@ -3931,12 +3646,497 @@
           <w:tab w:val="left" w:pos="829" w:leader="none"/>
         </w:tabs>
         <w:bidi w:val="0"/>
+        <w:spacing w:before="120" w:after="0"/>
         <w:ind w:hanging="283" w:left="829"/>
         <w:jc w:val="left"/>
         <w:rPr/>
       </w:pPr>
       <w:r>
         <w:rPr/>
+        <w:t xml:space="preserve">The code map, the diagrams dir, the graph dir and </w:t>
+      </w:r>
+      <w:r>
+        <w:rPr>
+          <w:rStyle w:val="SourceText"/>
+        </w:rPr>
+        <w:t>.claude/rules/</w:t>
+      </w:r>
+      <w:r>
+        <w:rPr/>
+        <w:t xml:space="preserve"> are writable for an approved ticket, because </w:t>
+      </w:r>
+      <w:r>
+        <w:rPr>
+          <w:rStyle w:val="SourceText"/>
+        </w:rPr>
+        <w:t>/crew:implement</w:t>
+      </w:r>
+      <w:r>
+        <w:rPr/>
+        <w:t xml:space="preserve"> step 6 refreshes them. </w:t>
+      </w:r>
+    </w:p>
+    <w:p>
+      <w:pPr>
+        <w:pStyle w:val="BodyText"/>
+        <w:numPr>
+          <w:ilvl w:val="0"/>
+          <w:numId w:val="7"/>
+        </w:numPr>
+        <w:tabs>
+          <w:tab w:val="clear" w:pos="1134"/>
+          <w:tab w:val="left" w:pos="829" w:leader="none"/>
+        </w:tabs>
+        <w:bidi w:val="0"/>
+        <w:spacing w:before="120" w:after="0"/>
+        <w:ind w:hanging="283" w:left="829"/>
+        <w:jc w:val="left"/>
+        <w:rPr/>
+      </w:pPr>
+      <w:r>
+        <w:rPr/>
+        <w:t xml:space="preserve">Nothing else is exempt: </w:t>
+      </w:r>
+      <w:r>
+        <w:rPr>
+          <w:rStyle w:val="SourceText"/>
+        </w:rPr>
+        <w:t>.crew/</w:t>
+      </w:r>
+      <w:r>
+        <w:rPr/>
+        <w:t xml:space="preserve"> beyond the code map, </w:t>
+      </w:r>
+      <w:r>
+        <w:rPr>
+          <w:rStyle w:val="SourceText"/>
+        </w:rPr>
+        <w:t>TODO.md</w:t>
+      </w:r>
+      <w:r>
+        <w:rPr/>
+        <w:t xml:space="preserve">, the rest of </w:t>
+      </w:r>
+      <w:r>
+        <w:rPr>
+          <w:rStyle w:val="SourceText"/>
+        </w:rPr>
+        <w:t>.claude/</w:t>
+      </w:r>
+      <w:r>
+        <w:rPr/>
+        <w:t xml:space="preserve"> and crew's own policy files. If the ticket changes one of them, list it in Touch. </w:t>
+      </w:r>
+    </w:p>
+    <w:p>
+      <w:pPr>
+        <w:pStyle w:val="BodyText"/>
+        <w:numPr>
+          <w:ilvl w:val="0"/>
+          <w:numId w:val="7"/>
+        </w:numPr>
+        <w:tabs>
+          <w:tab w:val="clear" w:pos="1134"/>
+          <w:tab w:val="left" w:pos="829" w:leader="none"/>
+        </w:tabs>
+        <w:bidi w:val="0"/>
+        <w:ind w:hanging="283" w:left="829"/>
+        <w:jc w:val="left"/>
+        <w:rPr/>
+      </w:pPr>
+      <w:r>
+        <w:rPr/>
+        <w:t xml:space="preserve">Approval receipts, the review ledger and the scope base are always refused. </w:t>
+      </w:r>
+    </w:p>
+    <w:p>
+      <w:pPr>
+        <w:pStyle w:val="BodyText"/>
+        <w:bidi w:val="0"/>
+        <w:jc w:val="left"/>
+        <w:rPr/>
+      </w:pPr>
+      <w:r>
+        <w:rPr/>
+        <w:t xml:space="preserve">The guard checks the real file a symlink points to and the path as written, so a link cannot move a write into or out of scope. </w:t>
+      </w:r>
+      <w:r>
+        <w:rPr>
+          <w:rStyle w:val="SourceText"/>
+        </w:rPr>
+        <w:t>..</w:t>
+      </w:r>
+      <w:r>
+        <w:rPr/>
+        <w:t xml:space="preserve"> is resolved the way the operating system resolves it. Refusals look like this:</w:t>
+      </w:r>
+    </w:p>
+    <w:p>
+      <w:pPr>
+        <w:pStyle w:val="PreformattedText"/>
+        <w:bidi w:val="0"/>
+        <w:jc w:val="left"/>
+        <w:rPr/>
+      </w:pPr>
+      <w:r>
+        <w:rPr>
+          <w:rStyle w:val="SourceText"/>
+        </w:rPr>
+        <w:t>SCOPE GUARD: refused Edit on other/keep.py.</w:t>
+      </w:r>
+    </w:p>
+    <w:p>
+      <w:pPr>
+        <w:pStyle w:val="PreformattedText"/>
+        <w:bidi w:val="0"/>
+        <w:jc w:val="left"/>
+        <w:rPr/>
+      </w:pPr>
+      <w:r>
+        <w:rPr>
+          <w:rStyle w:val="SourceText"/>
+        </w:rPr>
+        <w:t xml:space="preserve">  </w:t>
+      </w:r>
+      <w:r>
+        <w:rPr>
+          <w:rStyle w:val="SourceText"/>
+        </w:rPr>
+        <w:t>Reason: other/keep.py is outside T-0042's spec ## Touch.</w:t>
+      </w:r>
+    </w:p>
+    <w:p>
+      <w:pPr>
+        <w:pStyle w:val="PreformattedText"/>
+        <w:bidi w:val="0"/>
+        <w:jc w:val="left"/>
+        <w:rPr/>
+      </w:pPr>
+      <w:r>
+        <w:rPr>
+          <w:rStyle w:val="SourceText"/>
+        </w:rPr>
+        <w:t xml:space="preserve">  </w:t>
+      </w:r>
+      <w:r>
+        <w:rPr>
+          <w:rStyle w:val="SourceText"/>
+        </w:rPr>
+        <w:t>To widen scope: amend .work/tickets/T-0042/spec.md ## Touch (and plan.md), then ask the user to type</w:t>
+      </w:r>
+    </w:p>
+    <w:p>
+      <w:pPr>
+        <w:pStyle w:val="PreformattedText"/>
+        <w:bidi w:val="0"/>
+        <w:jc w:val="left"/>
+        <w:rPr/>
+      </w:pPr>
+      <w:r>
+        <w:rPr>
+          <w:rStyle w:val="SourceText"/>
+        </w:rPr>
+        <w:t xml:space="preserve">  </w:t>
+      </w:r>
+      <w:r>
+        <w:rPr>
+          <w:rStyle w:val="SourceText"/>
+        </w:rPr>
+        <w:t>`/crew:approve T-0042`. (scope.mode is block)</w:t>
+      </w:r>
+    </w:p>
+    <w:p>
+      <w:pPr>
+        <w:pStyle w:val="Heading3"/>
+        <w:bidi w:val="0"/>
+        <w:ind w:hanging="0" w:left="0" w:right="0"/>
+        <w:jc w:val="left"/>
+        <w:rPr/>
+      </w:pPr>
+      <w:bookmarkStart w:id="11" w:name="at-the-end-of-a-turn-the-completion-audi"/>
+      <w:bookmarkEnd w:id="11"/>
+      <w:r>
+        <w:rPr/>
+        <w:t>At the End of a Turn: The Completion Audit</w:t>
+      </w:r>
+    </w:p>
+    <w:p>
+      <w:pPr>
+        <w:pStyle w:val="BodyText"/>
+        <w:bidi w:val="0"/>
+        <w:jc w:val="left"/>
+        <w:rPr/>
+      </w:pPr>
+      <w:r>
+        <w:rPr/>
+        <w:t xml:space="preserve">The guard only sees the editing tools. A </w:t>
+      </w:r>
+      <w:r>
+        <w:rPr>
+          <w:rStyle w:val="SourceText"/>
+        </w:rPr>
+        <w:t>sed -i</w:t>
+      </w:r>
+      <w:r>
+        <w:rPr/>
+        <w:t>, a shell redirect or a formatter can still change files. So when the session stops, the completion audit compares the whole tree with the commit the ticket started from. It covers committed, staged, unstaged and untracked changes, and both ends of a rename. After you merge main, a file byte-identical to the merged main commit is not counted: it is main's change, not the ticket's; the verdict names that commit. If any changed path is outside Touch, the audit blocks the stop and lists the paths in six lines or fewer. It never blocks the continuation it caused.</w:t>
+      </w:r>
+    </w:p>
+    <w:p>
+      <w:pPr>
+        <w:pStyle w:val="BodyText"/>
+        <w:bidi w:val="0"/>
+        <w:jc w:val="left"/>
+        <w:rPr/>
+      </w:pPr>
+      <w:r>
+        <w:rPr/>
+        <w:t xml:space="preserve">A changed refresh artifact passes the audit only when a path the ticket changed reaches it and the edit is a re-anchor (the </w:t>
+      </w:r>
+      <w:r>
+        <w:rPr>
+          <w:rStyle w:val="SourceText"/>
+        </w:rPr>
+        <w:t>anchor:</w:t>
+      </w:r>
+      <w:r>
+        <w:rPr/>
+        <w:t xml:space="preserve"> or provenance sha moved forward to a commit on this branch) or a regeneration (</w:t>
+      </w:r>
+      <w:r>
+        <w:rPr>
+          <w:rStyle w:val="SourceText"/>
+        </w:rPr>
+        <w:t>.claude/rules/</w:t>
+      </w:r>
+      <w:r>
+        <w:rPr/>
+        <w:t xml:space="preserve"> as </w:t>
+      </w:r>
+      <w:r>
+        <w:rPr>
+          <w:rStyle w:val="SourceText"/>
+        </w:rPr>
+        <w:t>crew_instructions.py rules</w:t>
+      </w:r>
+      <w:r>
+        <w:rPr/>
+        <w:t xml:space="preserve"> writes them, the graph after a code change). A deleted rendered diagram or graph file, a symlink at or along an artifact's path, a file whose git mode changed, or one removed from the index but left on disk (</w:t>
+      </w:r>
+      <w:r>
+        <w:rPr>
+          <w:rStyle w:val="SourceText"/>
+        </w:rPr>
+        <w:t>git rm --cached</w:t>
+      </w:r>
+      <w:r>
+        <w:rPr/>
+        <w:t xml:space="preserve">: the commit deletes it) never passes. A map claim edited without a re-anchor is listed with </w:t>
+      </w:r>
+      <w:r>
+        <w:rPr>
+          <w:rStyle w:val="SourceText"/>
+        </w:rPr>
+        <w:t>[anchor did not move]</w:t>
+      </w:r>
+      <w:r>
+        <w:rPr/>
+        <w:t xml:space="preserve">, and belongs in Touch if that is what the ticket means to do. When git cannot answer, a rule file cannot be read, a short anchor is ambiguous (two commits share it), the artifact dirs cannot be resolved, or a directory the hook cannot search hides whether the config, a rule or a map exists, or two configured artifact dirs are equally specific for a path, the listing says </w:t>
+      </w:r>
+      <w:r>
+        <w:rPr>
+          <w:rStyle w:val="SourceText"/>
+        </w:rPr>
+        <w:t>[could not tell: ...]</w:t>
+      </w:r>
+      <w:r>
+        <w:rPr/>
+        <w:t xml:space="preserve">, and that never passes. (These verdicts are </w:t>
+      </w:r>
+      <w:r>
+        <w:rPr>
+          <w:rStyle w:val="SourceText"/>
+        </w:rPr>
+        <w:t>crew_refresh_check.py</w:t>
+      </w:r>
+      <w:r>
+        <w:rPr/>
+        <w:t xml:space="preserve">'s; the audit applies them once L-0540 lands, and until then admits the artifact dirs for an approved ticket.) </w:t>
+      </w:r>
+      <w:r>
+        <w:rPr>
+          <w:rStyle w:val="SourceText"/>
+        </w:rPr>
+        <w:t>/crew:done</w:t>
+      </w:r>
+      <w:r>
+        <w:rPr/>
+        <w:t xml:space="preserve"> runs the same check:</w:t>
+      </w:r>
+    </w:p>
+    <w:p>
+      <w:pPr>
+        <w:pStyle w:val="PreformattedText"/>
+        <w:bidi w:val="0"/>
+        <w:jc w:val="left"/>
+        <w:rPr/>
+      </w:pPr>
+      <w:r>
+        <w:rPr>
+          <w:rStyle w:val="SourceText"/>
+        </w:rPr>
+        <w:t>python3 &lt;crew&gt;/hooks/scripts/completion_audit.py --check --ticket T-0042</w:t>
+      </w:r>
+    </w:p>
+    <w:p>
+      <w:pPr>
+        <w:pStyle w:val="BodyText"/>
+        <w:bidi w:val="0"/>
+        <w:jc w:val="left"/>
+        <w:rPr/>
+      </w:pPr>
+      <w:r>
+        <w:rPr/>
+        <w:t xml:space="preserve">The audit sees what git sees. Gitignored files, including everything under </w:t>
+      </w:r>
+      <w:r>
+        <w:rPr>
+          <w:rStyle w:val="SourceText"/>
+        </w:rPr>
+        <w:t>.crew/</w:t>
+      </w:r>
+      <w:r>
+        <w:rPr/>
+        <w:t xml:space="preserve">, and </w:t>
+      </w:r>
+      <w:r>
+        <w:rPr>
+          <w:rStyle w:val="SourceText"/>
+        </w:rPr>
+        <w:t>.work/</w:t>
+      </w:r>
+      <w:r>
+        <w:rPr/>
+        <w:t xml:space="preserve"> are outside it.</w:t>
+      </w:r>
+    </w:p>
+    <w:p>
+      <w:pPr>
+        <w:pStyle w:val="Heading3"/>
+        <w:bidi w:val="0"/>
+        <w:ind w:hanging="0" w:left="0" w:right="0"/>
+        <w:jc w:val="left"/>
+        <w:rPr/>
+      </w:pPr>
+      <w:bookmarkStart w:id="12" w:name="amending-scope"/>
+      <w:bookmarkEnd w:id="12"/>
+      <w:r>
+        <w:rPr/>
+        <w:t>Amending Scope</w:t>
+      </w:r>
+    </w:p>
+    <w:p>
+      <w:pPr>
+        <w:pStyle w:val="BodyText"/>
+        <w:numPr>
+          <w:ilvl w:val="0"/>
+          <w:numId w:val="8"/>
+        </w:numPr>
+        <w:tabs>
+          <w:tab w:val="clear" w:pos="1134"/>
+          <w:tab w:val="left" w:pos="829" w:leader="none"/>
+        </w:tabs>
+        <w:bidi w:val="0"/>
+        <w:spacing w:before="120" w:after="0"/>
+        <w:ind w:hanging="283" w:left="829"/>
+        <w:jc w:val="left"/>
+        <w:rPr/>
+      </w:pPr>
+      <w:r>
+        <w:rPr/>
+        <w:t xml:space="preserve">Edit </w:t>
+      </w:r>
+      <w:r>
+        <w:rPr>
+          <w:rStyle w:val="SourceText"/>
+        </w:rPr>
+        <w:t>spec.md</w:t>
+      </w:r>
+      <w:r>
+        <w:rPr/>
+        <w:t xml:space="preserve"> </w:t>
+      </w:r>
+      <w:r>
+        <w:rPr>
+          <w:rStyle w:val="SourceText"/>
+        </w:rPr>
+        <w:t>## Touch</w:t>
+      </w:r>
+      <w:r>
+        <w:rPr/>
+        <w:t xml:space="preserve"> to add the path. Update </w:t>
+      </w:r>
+      <w:r>
+        <w:rPr>
+          <w:rStyle w:val="SourceText"/>
+        </w:rPr>
+        <w:t>plan.md</w:t>
+      </w:r>
+      <w:r>
+        <w:rPr/>
+        <w:t xml:space="preserve"> if a step now changes it. </w:t>
+      </w:r>
+    </w:p>
+    <w:p>
+      <w:pPr>
+        <w:pStyle w:val="BodyText"/>
+        <w:numPr>
+          <w:ilvl w:val="0"/>
+          <w:numId w:val="8"/>
+        </w:numPr>
+        <w:tabs>
+          <w:tab w:val="clear" w:pos="1134"/>
+          <w:tab w:val="left" w:pos="829" w:leader="none"/>
+        </w:tabs>
+        <w:bidi w:val="0"/>
+        <w:spacing w:before="120" w:after="0"/>
+        <w:ind w:hanging="283" w:left="829"/>
+        <w:jc w:val="left"/>
+        <w:rPr/>
+      </w:pPr>
+      <w:r>
+        <w:rPr/>
+        <w:t xml:space="preserve">Run </w:t>
+      </w:r>
+      <w:r>
+        <w:rPr>
+          <w:rStyle w:val="SourceText"/>
+        </w:rPr>
+        <w:t>crew_ticket.py validate --ticket &lt;id&gt;</w:t>
+      </w:r>
+      <w:r>
+        <w:rPr/>
+        <w:t xml:space="preserve">. </w:t>
+      </w:r>
+    </w:p>
+    <w:p>
+      <w:pPr>
+        <w:pStyle w:val="BodyText"/>
+        <w:numPr>
+          <w:ilvl w:val="0"/>
+          <w:numId w:val="8"/>
+        </w:numPr>
+        <w:tabs>
+          <w:tab w:val="clear" w:pos="1134"/>
+          <w:tab w:val="left" w:pos="829" w:leader="none"/>
+        </w:tabs>
+        <w:bidi w:val="0"/>
+        <w:ind w:hanging="283" w:left="829"/>
+        <w:jc w:val="left"/>
+        <w:rPr/>
+      </w:pPr>
+      <w:r>
+        <w:rPr/>
         <w:t xml:space="preserve">Type </w:t>
       </w:r>
       <w:r>
@@ -3970,8 +4170,8 @@
         <w:jc w:val="left"/>
         <w:rPr/>
       </w:pPr>
-      <w:bookmarkStart w:id="12" w:name="after-two-review-rounds-a-successor-plan"/>
-      <w:bookmarkEnd w:id="12"/>
+      <w:bookmarkStart w:id="13" w:name="after-two-review-rounds-a-successor-plan"/>
+      <w:bookmarkEnd w:id="13"/>
       <w:r>
         <w:rPr/>
         <w:t>After Two Review Rounds: A Successor Plan</w:t>
@@ -4057,8 +4257,8 @@
         <w:jc w:val="left"/>
         <w:rPr/>
       </w:pPr>
-      <w:bookmarkStart w:id="13" w:name="modes"/>
-      <w:bookmarkEnd w:id="13"/>
+      <w:bookmarkStart w:id="14" w:name="modes"/>
+      <w:bookmarkEnd w:id="14"/>
       <w:r>
         <w:rPr/>
         <w:t>Modes</w:t>
@@ -4417,8 +4617,8 @@
         <w:jc w:val="left"/>
         <w:rPr/>
       </w:pPr>
-      <w:bookmarkStart w:id="14" w:name="which-ticket-is-active"/>
-      <w:bookmarkEnd w:id="14"/>
+      <w:bookmarkStart w:id="15" w:name="which-ticket-is-active"/>
+      <w:bookmarkEnd w:id="15"/>
       <w:r>
         <w:rPr/>
         <w:t>Which Ticket Is Active</w:t>
@@ -4757,6 +4957,125 @@
   <w:abstractNum w:abstractNumId="3">
     <w:lvl w:ilvl="0">
       <w:start w:val="1"/>
+      <w:numFmt w:val="decimal"/>
+      <w:lvlText w:val="%1."/>
+      <w:lvlJc w:val="left"/>
+      <w:pPr>
+        <w:tabs>
+          <w:tab w:val="num" w:pos="709"/>
+        </w:tabs>
+        <w:ind w:left="709" w:hanging="283"/>
+      </w:pPr>
+      <w:rPr/>
+    </w:lvl>
+    <w:lvl w:ilvl="1">
+      <w:start w:val="1"/>
+      <w:numFmt w:val="decimal"/>
+      <w:lvlText w:val="%2."/>
+      <w:lvlJc w:val="left"/>
+      <w:pPr>
+        <w:tabs>
+          <w:tab w:val="num" w:pos="1418"/>
+        </w:tabs>
+        <w:ind w:left="1418" w:hanging="283"/>
+      </w:pPr>
+      <w:rPr/>
+    </w:lvl>
+    <w:lvl w:ilvl="2">
+      <w:start w:val="1"/>
+      <w:numFmt w:val="decimal"/>
+      <w:lvlText w:val="%3."/>
+      <w:lvlJc w:val="left"/>
+      <w:pPr>
+        <w:tabs>
+          <w:tab w:val="num" w:pos="2127"/>
+        </w:tabs>
+        <w:ind w:left="2127" w:hanging="283"/>
+      </w:pPr>
+      <w:rPr/>
+    </w:lvl>
+    <w:lvl w:ilvl="3">
+      <w:start w:val="1"/>
+      <w:numFmt w:val="decimal"/>
+      <w:lvlText w:val="%4."/>
+      <w:lvlJc w:val="left"/>
+      <w:pPr>
+        <w:tabs>
+          <w:tab w:val="num" w:pos="2836"/>
+        </w:tabs>
+        <w:ind w:left="2836" w:hanging="283"/>
+      </w:pPr>
+      <w:rPr/>
+    </w:lvl>
+    <w:lvl w:ilvl="4">
+      <w:start w:val="1"/>
+      <w:numFmt w:val="decimal"/>
+      <w:lvlText w:val="%5."/>
+      <w:lvlJc w:val="left"/>
+      <w:pPr>
+        <w:tabs>
+          <w:tab w:val="num" w:pos="3545"/>
+        </w:tabs>
+        <w:ind w:left="3545" w:hanging="283"/>
+      </w:pPr>
+      <w:rPr/>
+    </w:lvl>
+    <w:lvl w:ilvl="5">
+      <w:start w:val="1"/>
+      <w:numFmt w:val="decimal"/>
+      <w:lvlText w:val="%6."/>
+      <w:lvlJc w:val="left"/>
+      <w:pPr>
+        <w:tabs>
+          <w:tab w:val="num" w:pos="4254"/>
+        </w:tabs>
+        <w:ind w:left="4254" w:hanging="283"/>
+      </w:pPr>
+      <w:rPr/>
+    </w:lvl>
+    <w:lvl w:ilvl="6">
+      <w:start w:val="1"/>
+      <w:numFmt w:val="decimal"/>
+      <w:lvlText w:val="%7."/>
+      <w:lvlJc w:val="left"/>
+      <w:pPr>
+        <w:tabs>
+          <w:tab w:val="num" w:pos="4963"/>
+        </w:tabs>
+        <w:ind w:left="4963" w:hanging="283"/>
+      </w:pPr>
+      <w:rPr/>
+    </w:lvl>
+    <w:lvl w:ilvl="7">
+      <w:start w:val="1"/>
+      <w:numFmt w:val="decimal"/>
+      <w:lvlText w:val="%8."/>
+      <w:lvlJc w:val="left"/>
+      <w:pPr>
+        <w:tabs>
+          <w:tab w:val="num" w:pos="5672"/>
+        </w:tabs>
+        <w:ind w:left="5672" w:hanging="283"/>
+      </w:pPr>
+      <w:rPr/>
+    </w:lvl>
+    <w:lvl w:ilvl="8">
+      <w:start w:val="1"/>
+      <w:numFmt w:val="decimal"/>
+      <w:lvlText w:val="%9."/>
+      <w:lvlJc w:val="left"/>
+      <w:pPr>
+        <w:tabs>
+          <w:tab w:val="num" w:pos="6381"/>
+        </w:tabs>
+        <w:ind w:left="6381" w:hanging="283"/>
+      </w:pPr>
+      <w:rPr/>
+    </w:lvl>
+  </w:abstractNum>
+  <w:abstractNum w:abstractNumId="4">
+    <w:lvl w:ilvl="0">
+      <w:start w:val="1"/>
       <w:numFmt w:val="bullet"/>
       <w:lvlText w:val=""/>
       <w:lvlJc w:val="left"/>
@@ -4891,7 +5210,7 @@
       </w:rPr>
     </w:lvl>
   </w:abstractNum>
-  <w:abstractNum w:abstractNumId="4">
+  <w:abstractNum w:abstractNumId="5">
     <w:lvl w:ilvl="0">
       <w:start w:val="1"/>
       <w:numFmt w:val="bullet"/>
@@ -5028,7 +5347,7 @@
       </w:rPr>
     </w:lvl>
   </w:abstractNum>
-  <w:abstractNum w:abstractNumId="5">
+  <w:abstractNum w:abstractNumId="6">
     <w:lvl w:ilvl="0">
       <w:start w:val="1"/>
       <w:numFmt w:val="bullet"/>
@@ -5165,7 +5484,7 @@
       </w:rPr>
     </w:lvl>
   </w:abstractNum>
-  <w:abstractNum w:abstractNumId="6">
+  <w:abstractNum w:abstractNumId="7">
     <w:lvl w:ilvl="0">
       <w:start w:val="1"/>
       <w:numFmt w:val="bullet"/>
@@ -5302,7 +5621,7 @@
       </w:rPr>
     </w:lvl>
   </w:abstractNum>
-  <w:abstractNum w:abstractNumId="7">
+  <w:abstractNum w:abstractNumId="8">
     <w:lvl w:ilvl="0">
       <w:start w:val="1"/>
       <w:numFmt w:val="decimal"/>
@@ -5421,7 +5740,7 @@
       <w:rPr/>
     </w:lvl>
   </w:abstractNum>
-  <w:abstractNum w:abstractNumId="8">
+  <w:abstractNum w:abstractNumId="9">
     <w:lvl w:ilvl="0">
       <w:start w:val="1"/>
       <w:numFmt w:val="none"/>
@@ -5565,6 +5884,9 @@
   </w:num>
   <w:num w:numId="8">
     <w:abstractNumId w:val="8"/>
+  </w:num>
+  <w:num w:numId="9">
+    <w:abstractNumId w:val="9"/>
   </w:num>
 </w:numbering>
 </file>

</xml_diff>

<commit_message>
L-0551 (#446): /crew:status --owner and the waiting line
New crew_autopilot_owner.py: owner_items asks _phase(policy=False, deep=False) about every open
ticket and every unindexed ticket folder, so the list agrees with /crew:autopilot. deep=False
stops at review-unread where next would rebuild a bundle or ask gh. crew_status.py prints the
count as one waiting line and lists it under --owner (40 lines, read-only, not with --memory or
--approvals). No INDEX.md or an import failure reads unknown; a phase that raises is counted
as could-not-tell, never dropped.

Claude-Session: https://claude.ai/code/session_01H49aKnVMcvefcadqBGmuMu
</commit_message>
<xml_diff>
--- a/docs/guides/crew/crew-daily-workflow.docx
+++ b/docs/guides/crew/crew-daily-workflow.docx
@@ -1072,9 +1072,9 @@
         </w:tblCellMar>
       </w:tblPr>
       <w:tblGrid>
-        <w:gridCol w:w="1472"/>
-        <w:gridCol w:w="3793"/>
-        <w:gridCol w:w="6074"/>
+        <w:gridCol w:w="1435"/>
+        <w:gridCol w:w="3784"/>
+        <w:gridCol w:w="6120"/>
       </w:tblGrid>
       <w:tr>
         <w:trPr>
@@ -1082,7 +1082,7 @@
         </w:trPr>
         <w:tc>
           <w:tcPr>
-            <w:tcW w:w="1472" w:type="dxa"/>
+            <w:tcW w:w="1435" w:type="dxa"/>
             <w:tcBorders/>
             <w:vAlign w:val="center"/>
           </w:tcPr>
@@ -1104,7 +1104,7 @@
         </w:tc>
         <w:tc>
           <w:tcPr>
-            <w:tcW w:w="3793" w:type="dxa"/>
+            <w:tcW w:w="3784" w:type="dxa"/>
             <w:tcBorders/>
             <w:vAlign w:val="center"/>
           </w:tcPr>
@@ -1126,7 +1126,7 @@
         </w:tc>
         <w:tc>
           <w:tcPr>
-            <w:tcW w:w="6074" w:type="dxa"/>
+            <w:tcW w:w="6120" w:type="dxa"/>
             <w:tcBorders/>
             <w:vAlign w:val="center"/>
           </w:tcPr>
@@ -1151,7 +1151,7 @@
         <w:trPr/>
         <w:tc>
           <w:tcPr>
-            <w:tcW w:w="1472" w:type="dxa"/>
+            <w:tcW w:w="1435" w:type="dxa"/>
             <w:tcBorders/>
             <w:vAlign w:val="center"/>
           </w:tcPr>
@@ -1172,7 +1172,7 @@
         </w:tc>
         <w:tc>
           <w:tcPr>
-            <w:tcW w:w="3793" w:type="dxa"/>
+            <w:tcW w:w="3784" w:type="dxa"/>
             <w:tcBorders/>
             <w:vAlign w:val="center"/>
           </w:tcPr>
@@ -1203,7 +1203,7 @@
         </w:tc>
         <w:tc>
           <w:tcPr>
-            <w:tcW w:w="6074" w:type="dxa"/>
+            <w:tcW w:w="6120" w:type="dxa"/>
             <w:tcBorders/>
             <w:vAlign w:val="center"/>
           </w:tcPr>
@@ -1227,7 +1227,7 @@
         <w:trPr/>
         <w:tc>
           <w:tcPr>
-            <w:tcW w:w="1472" w:type="dxa"/>
+            <w:tcW w:w="1435" w:type="dxa"/>
             <w:tcBorders/>
             <w:vAlign w:val="center"/>
           </w:tcPr>
@@ -1248,7 +1248,7 @@
         </w:tc>
         <w:tc>
           <w:tcPr>
-            <w:tcW w:w="3793" w:type="dxa"/>
+            <w:tcW w:w="3784" w:type="dxa"/>
             <w:tcBorders/>
             <w:vAlign w:val="center"/>
           </w:tcPr>
@@ -1279,7 +1279,7 @@
         </w:tc>
         <w:tc>
           <w:tcPr>
-            <w:tcW w:w="6074" w:type="dxa"/>
+            <w:tcW w:w="6120" w:type="dxa"/>
             <w:tcBorders/>
             <w:vAlign w:val="center"/>
           </w:tcPr>
@@ -1303,7 +1303,7 @@
         <w:trPr/>
         <w:tc>
           <w:tcPr>
-            <w:tcW w:w="1472" w:type="dxa"/>
+            <w:tcW w:w="1435" w:type="dxa"/>
             <w:tcBorders/>
             <w:vAlign w:val="center"/>
           </w:tcPr>
@@ -1324,7 +1324,7 @@
         </w:tc>
         <w:tc>
           <w:tcPr>
-            <w:tcW w:w="3793" w:type="dxa"/>
+            <w:tcW w:w="3784" w:type="dxa"/>
             <w:tcBorders/>
             <w:vAlign w:val="center"/>
           </w:tcPr>
@@ -1355,7 +1355,7 @@
         </w:tc>
         <w:tc>
           <w:tcPr>
-            <w:tcW w:w="6074" w:type="dxa"/>
+            <w:tcW w:w="6120" w:type="dxa"/>
             <w:tcBorders/>
             <w:vAlign w:val="center"/>
           </w:tcPr>
@@ -1379,7 +1379,7 @@
         <w:trPr/>
         <w:tc>
           <w:tcPr>
-            <w:tcW w:w="1472" w:type="dxa"/>
+            <w:tcW w:w="1435" w:type="dxa"/>
             <w:tcBorders/>
             <w:vAlign w:val="center"/>
           </w:tcPr>
@@ -1400,7 +1400,7 @@
         </w:tc>
         <w:tc>
           <w:tcPr>
-            <w:tcW w:w="3793" w:type="dxa"/>
+            <w:tcW w:w="3784" w:type="dxa"/>
             <w:tcBorders/>
             <w:vAlign w:val="center"/>
           </w:tcPr>
@@ -1421,7 +1421,7 @@
         </w:tc>
         <w:tc>
           <w:tcPr>
-            <w:tcW w:w="6074" w:type="dxa"/>
+            <w:tcW w:w="6120" w:type="dxa"/>
             <w:tcBorders/>
             <w:vAlign w:val="center"/>
           </w:tcPr>
@@ -2076,8 +2076,121 @@
         <w:jc w:val="left"/>
         <w:rPr/>
       </w:pPr>
-      <w:bookmarkStart w:id="5" w:name="if-something-refuses"/>
+      <w:bookmarkStart w:id="5" w:name="what-is-waiting-on-me"/>
       <w:bookmarkEnd w:id="5"/>
+      <w:r>
+        <w:rPr/>
+        <w:t>What Is Waiting on Me</w:t>
+      </w:r>
+    </w:p>
+    <w:p>
+      <w:pPr>
+        <w:pStyle w:val="BodyText"/>
+        <w:bidi w:val="0"/>
+        <w:jc w:val="left"/>
+        <w:rPr/>
+      </w:pPr>
+      <w:r>
+        <w:rPr>
+          <w:rStyle w:val="SourceText"/>
+        </w:rPr>
+        <w:t>/crew:status</w:t>
+      </w:r>
+      <w:r>
+        <w:rPr/>
+        <w:t xml:space="preserve"> prints one </w:t>
+      </w:r>
+      <w:r>
+        <w:rPr>
+          <w:rStyle w:val="SourceText"/>
+        </w:rPr>
+        <w:t>waiting</w:t>
+      </w:r>
+      <w:r>
+        <w:rPr/>
+        <w:t xml:space="preserve"> line: how many open tickets are stopped on you. </w:t>
+      </w:r>
+      <w:r>
+        <w:rPr>
+          <w:rStyle w:val="SourceText"/>
+        </w:rPr>
+        <w:t>/crew:status --owner</w:t>
+      </w:r>
+      <w:r>
+        <w:rPr/>
+        <w:t xml:space="preserve"> lists them, one line per ticket with the command to type or the question to answer, for example </w:t>
+      </w:r>
+      <w:r>
+        <w:rPr>
+          <w:rStyle w:val="SourceText"/>
+        </w:rPr>
+        <w:t>T-5 approve /crew:approve T-5</w:t>
+      </w:r>
+      <w:r>
+        <w:rPr/>
+        <w:t xml:space="preserve">. The list comes from the same phase table </w:t>
+      </w:r>
+      <w:r>
+        <w:rPr>
+          <w:rStyle w:val="SourceText"/>
+        </w:rPr>
+        <w:t>/crew:autopilot</w:t>
+      </w:r>
+      <w:r>
+        <w:rPr/>
+        <w:t xml:space="preserve"> uses, so the two never disagree. It runs nothing and never rebuilds a review bundle: a ticket whose finished review would need one shows as </w:t>
+      </w:r>
+      <w:r>
+        <w:rPr>
+          <w:rStyle w:val="SourceText"/>
+        </w:rPr>
+        <w:t>review-unread</w:t>
+      </w:r>
+      <w:r>
+        <w:rPr/>
+        <w:t xml:space="preserve">, and </w:t>
+      </w:r>
+      <w:r>
+        <w:rPr>
+          <w:rStyle w:val="SourceText"/>
+        </w:rPr>
+        <w:t>/crew:autopilot status &lt;id&gt;</w:t>
+      </w:r>
+      <w:r>
+        <w:rPr/>
+        <w:t xml:space="preserve"> reads it. No </w:t>
+      </w:r>
+      <w:r>
+        <w:rPr>
+          <w:rStyle w:val="SourceText"/>
+        </w:rPr>
+        <w:t>.work/INDEX.md</w:t>
+      </w:r>
+      <w:r>
+        <w:rPr/>
+        <w:t xml:space="preserve"> prints </w:t>
+      </w:r>
+      <w:r>
+        <w:rPr>
+          <w:rStyle w:val="SourceText"/>
+        </w:rPr>
+        <w:t>waiting unknown (...)</w:t>
+      </w:r>
+      <w:r>
+        <w:rPr/>
+        <w:t>, never "nothing on you".</w:t>
+      </w:r>
+    </w:p>
+    <w:p>
+      <w:pPr>
+        <w:pStyle w:val="Heading2"/>
+        <w:bidi w:val="0"/>
+        <w:ind w:hanging="0" w:left="0" w:right="0"/>
+        <w:jc w:val="left"/>
+        <w:rPr/>
+      </w:pPr>
+      <w:bookmarkStart w:id="6" w:name="if-something-refuses"/>
+      <w:bookmarkEnd w:id="6"/>
       <w:r>
         <w:rPr/>
         <w:t>If Something Refuses</w:t>
@@ -2097,9 +2210,9 @@
         </w:tblCellMar>
       </w:tblPr>
       <w:tblGrid>
-        <w:gridCol w:w="4169"/>
-        <w:gridCol w:w="2808"/>
-        <w:gridCol w:w="4362"/>
+        <w:gridCol w:w="4189"/>
+        <w:gridCol w:w="2776"/>
+        <w:gridCol w:w="4374"/>
       </w:tblGrid>
       <w:tr>
         <w:trPr>
@@ -2107,7 +2220,7 @@
         </w:trPr>
         <w:tc>
           <w:tcPr>
-            <w:tcW w:w="4169" w:type="dxa"/>
+            <w:tcW w:w="4189" w:type="dxa"/>
             <w:tcBorders/>
             <w:vAlign w:val="center"/>
           </w:tcPr>
@@ -2129,7 +2242,7 @@
         </w:tc>
         <w:tc>
           <w:tcPr>
-            <w:tcW w:w="2808" w:type="dxa"/>
+            <w:tcW w:w="2776" w:type="dxa"/>
             <w:tcBorders/>
             <w:vAlign w:val="center"/>
           </w:tcPr>
@@ -2151,7 +2264,7 @@
         </w:tc>
         <w:tc>
           <w:tcPr>
-            <w:tcW w:w="4362" w:type="dxa"/>
+            <w:tcW w:w="4374" w:type="dxa"/>
             <w:tcBorders/>
             <w:vAlign w:val="center"/>
           </w:tcPr>
@@ -2176,7 +2289,7 @@
         <w:trPr/>
         <w:tc>
           <w:tcPr>
-            <w:tcW w:w="4169" w:type="dxa"/>
+            <w:tcW w:w="4189" w:type="dxa"/>
             <w:tcBorders/>
             <w:vAlign w:val="center"/>
           </w:tcPr>
@@ -2203,7 +2316,7 @@
         </w:tc>
         <w:tc>
           <w:tcPr>
-            <w:tcW w:w="2808" w:type="dxa"/>
+            <w:tcW w:w="2776" w:type="dxa"/>
             <w:tcBorders/>
             <w:vAlign w:val="center"/>
           </w:tcPr>
@@ -2234,7 +2347,7 @@
         </w:tc>
         <w:tc>
           <w:tcPr>
-            <w:tcW w:w="4362" w:type="dxa"/>
+            <w:tcW w:w="4374" w:type="dxa"/>
             <w:tcBorders/>
             <w:vAlign w:val="center"/>
           </w:tcPr>
@@ -2270,7 +2383,7 @@
         <w:trPr/>
         <w:tc>
           <w:tcPr>
-            <w:tcW w:w="4169" w:type="dxa"/>
+            <w:tcW w:w="4189" w:type="dxa"/>
             <w:tcBorders/>
             <w:vAlign w:val="center"/>
           </w:tcPr>
@@ -2291,7 +2404,7 @@
         </w:tc>
         <w:tc>
           <w:tcPr>
-            <w:tcW w:w="2808" w:type="dxa"/>
+            <w:tcW w:w="2776" w:type="dxa"/>
             <w:tcBorders/>
             <w:vAlign w:val="center"/>
           </w:tcPr>
@@ -2312,7 +2425,7 @@
         </w:tc>
         <w:tc>
           <w:tcPr>
-            <w:tcW w:w="4362" w:type="dxa"/>
+            <w:tcW w:w="4374" w:type="dxa"/>
             <w:tcBorders/>
             <w:vAlign w:val="center"/>
           </w:tcPr>
@@ -2346,7 +2459,7 @@
         <w:trPr/>
         <w:tc>
           <w:tcPr>
-            <w:tcW w:w="4169" w:type="dxa"/>
+            <w:tcW w:w="4189" w:type="dxa"/>
             <w:tcBorders/>
             <w:vAlign w:val="center"/>
           </w:tcPr>
@@ -2379,7 +2492,7 @@
         </w:tc>
         <w:tc>
           <w:tcPr>
-            <w:tcW w:w="2808" w:type="dxa"/>
+            <w:tcW w:w="2776" w:type="dxa"/>
             <w:tcBorders/>
             <w:vAlign w:val="center"/>
           </w:tcPr>
@@ -2400,7 +2513,7 @@
         </w:tc>
         <w:tc>
           <w:tcPr>
-            <w:tcW w:w="4362" w:type="dxa"/>
+            <w:tcW w:w="4374" w:type="dxa"/>
             <w:tcBorders/>
             <w:vAlign w:val="center"/>
           </w:tcPr>
@@ -2444,7 +2557,7 @@
         <w:trPr/>
         <w:tc>
           <w:tcPr>
-            <w:tcW w:w="4169" w:type="dxa"/>
+            <w:tcW w:w="4189" w:type="dxa"/>
             <w:tcBorders/>
             <w:vAlign w:val="center"/>
           </w:tcPr>
@@ -2477,7 +2590,7 @@
         </w:tc>
         <w:tc>
           <w:tcPr>
-            <w:tcW w:w="2808" w:type="dxa"/>
+            <w:tcW w:w="2776" w:type="dxa"/>
             <w:tcBorders/>
             <w:vAlign w:val="center"/>
           </w:tcPr>
@@ -2498,7 +2611,7 @@
         </w:tc>
         <w:tc>
           <w:tcPr>
-            <w:tcW w:w="4362" w:type="dxa"/>
+            <w:tcW w:w="4374" w:type="dxa"/>
             <w:tcBorders/>
             <w:vAlign w:val="center"/>
           </w:tcPr>
@@ -2528,7 +2641,7 @@
         <w:trPr/>
         <w:tc>
           <w:tcPr>
-            <w:tcW w:w="4169" w:type="dxa"/>
+            <w:tcW w:w="4189" w:type="dxa"/>
             <w:tcBorders/>
             <w:vAlign w:val="center"/>
           </w:tcPr>
@@ -2571,7 +2684,7 @@
         </w:tc>
         <w:tc>
           <w:tcPr>
-            <w:tcW w:w="2808" w:type="dxa"/>
+            <w:tcW w:w="2776" w:type="dxa"/>
             <w:tcBorders/>
             <w:vAlign w:val="center"/>
           </w:tcPr>
@@ -2592,7 +2705,7 @@
         </w:tc>
         <w:tc>
           <w:tcPr>
-            <w:tcW w:w="4362" w:type="dxa"/>
+            <w:tcW w:w="4374" w:type="dxa"/>
             <w:tcBorders/>
             <w:vAlign w:val="center"/>
           </w:tcPr>
@@ -2616,7 +2729,7 @@
         <w:trPr/>
         <w:tc>
           <w:tcPr>
-            <w:tcW w:w="4169" w:type="dxa"/>
+            <w:tcW w:w="4189" w:type="dxa"/>
             <w:tcBorders/>
             <w:vAlign w:val="center"/>
           </w:tcPr>
@@ -2643,7 +2756,7 @@
         </w:tc>
         <w:tc>
           <w:tcPr>
-            <w:tcW w:w="2808" w:type="dxa"/>
+            <w:tcW w:w="2776" w:type="dxa"/>
             <w:tcBorders/>
             <w:vAlign w:val="center"/>
           </w:tcPr>
@@ -2664,7 +2777,7 @@
         </w:tc>
         <w:tc>
           <w:tcPr>
-            <w:tcW w:w="4362" w:type="dxa"/>
+            <w:tcW w:w="4374" w:type="dxa"/>
             <w:tcBorders/>
             <w:vAlign w:val="center"/>
           </w:tcPr>
@@ -2727,8 +2840,8 @@
         <w:jc w:val="left"/>
         <w:rPr/>
       </w:pPr>
-      <w:bookmarkStart w:id="6" w:name="scope-and-approval"/>
-      <w:bookmarkEnd w:id="6"/>
+      <w:bookmarkStart w:id="7" w:name="scope-and-approval"/>
+      <w:bookmarkEnd w:id="7"/>
       <w:r>
         <w:rPr/>
         <w:t>Scope and Approval</w:t>
@@ -2754,8 +2867,8 @@
         <w:jc w:val="left"/>
         <w:rPr/>
       </w:pPr>
-      <w:bookmarkStart w:id="7" w:name="the-contract"/>
-      <w:bookmarkEnd w:id="7"/>
+      <w:bookmarkStart w:id="8" w:name="the-contract"/>
+      <w:bookmarkEnd w:id="8"/>
       <w:r>
         <w:rPr/>
         <w:t>The Contract</w:t>
@@ -3197,8 +3310,8 @@
         <w:jc w:val="left"/>
         <w:rPr/>
       </w:pPr>
-      <w:bookmarkStart w:id="8" w:name="approval"/>
-      <w:bookmarkEnd w:id="8"/>
+      <w:bookmarkStart w:id="9" w:name="approval"/>
+      <w:bookmarkEnd w:id="9"/>
       <w:r>
         <w:rPr/>
         <w:t>Approval</w:t>
@@ -3631,8 +3744,8 @@
         <w:jc w:val="left"/>
         <w:rPr/>
       </w:pPr>
-      <w:bookmarkStart w:id="9" w:name="while-you-implement-the-scope-guard"/>
-      <w:bookmarkEnd w:id="9"/>
+      <w:bookmarkStart w:id="10" w:name="while-you-implement-the-scope-guard"/>
+      <w:bookmarkEnd w:id="10"/>
       <w:r>
         <w:rPr/>
         <w:t>While You Implement: The Scope Guard</w:t>
@@ -3923,8 +4036,8 @@
         <w:jc w:val="left"/>
         <w:rPr/>
       </w:pPr>
-      <w:bookmarkStart w:id="10" w:name="at-the-end-of-a-turn-the-completion-audi"/>
-      <w:bookmarkEnd w:id="10"/>
+      <w:bookmarkStart w:id="11" w:name="at-the-end-of-a-turn-the-completion-audi"/>
+      <w:bookmarkEnd w:id="11"/>
       <w:r>
         <w:rPr/>
         <w:t>At the End of a Turn: The Completion Audit</w:t>
@@ -4098,8 +4211,8 @@
         <w:jc w:val="left"/>
         <w:rPr/>
       </w:pPr>
-      <w:bookmarkStart w:id="11" w:name="amending-scope"/>
-      <w:bookmarkEnd w:id="11"/>
+      <w:bookmarkStart w:id="12" w:name="amending-scope"/>
+      <w:bookmarkEnd w:id="12"/>
       <w:r>
         <w:rPr/>
         <w:t>Amending Scope</w:t>
@@ -4240,8 +4353,8 @@
         <w:jc w:val="left"/>
         <w:rPr/>
       </w:pPr>
-      <w:bookmarkStart w:id="12" w:name="after-two-review-rounds-a-successor-plan"/>
-      <w:bookmarkEnd w:id="12"/>
+      <w:bookmarkStart w:id="13" w:name="after-two-review-rounds-a-successor-plan"/>
+      <w:bookmarkEnd w:id="13"/>
       <w:r>
         <w:rPr/>
         <w:t>After Two Review Rounds: A Successor Plan</w:t>
@@ -4296,7 +4409,37 @@
       </w:r>
       <w:r>
         <w:rPr/>
-        <w:t xml:space="preserve">; the cap counts every successor plan on the ledger. Write a different plan and approve it. </w:t>
+        <w:t xml:space="preserve">; the cap counts every successor plan on the ledger. With notify on, the last round carrying a BLOCK sends the </w:t>
+      </w:r>
+      <w:r>
+        <w:rPr>
+          <w:rStyle w:val="SourceText"/>
+        </w:rPr>
+        <w:t>Review out of rounds</w:t>
+      </w:r>
+      <w:r>
+        <w:rPr/>
+        <w:t xml:space="preserve"> ping (</w:t>
+      </w:r>
+      <w:r>
+        <w:rPr>
+          <w:rStyle w:val="SourceText"/>
+        </w:rPr>
+        <w:t>-&gt; /crew:plan &lt;id&gt;</w:t>
+      </w:r>
+      <w:r>
+        <w:rPr/>
+        <w:t xml:space="preserve">) when </w:t>
+      </w:r>
+      <w:r>
+        <w:rPr>
+          <w:rStyle w:val="SourceText"/>
+        </w:rPr>
+        <w:t>/crew:autopilot</w:t>
+      </w:r>
+      <w:r>
+        <w:rPr/>
+        <w:t xml:space="preserve"> stops on it. Write a different plan and approve it. </w:t>
       </w:r>
       <w:r>
         <w:rPr>
@@ -4327,8 +4470,8 @@
         <w:jc w:val="left"/>
         <w:rPr/>
       </w:pPr>
-      <w:bookmarkStart w:id="13" w:name="modes"/>
-      <w:bookmarkEnd w:id="13"/>
+      <w:bookmarkStart w:id="14" w:name="modes"/>
+      <w:bookmarkEnd w:id="14"/>
       <w:r>
         <w:rPr/>
         <w:t>Modes</w:t>
@@ -4380,8 +4523,8 @@
         </w:tblCellMar>
       </w:tblPr>
       <w:tblGrid>
-        <w:gridCol w:w="946"/>
-        <w:gridCol w:w="10393"/>
+        <w:gridCol w:w="931"/>
+        <w:gridCol w:w="10408"/>
       </w:tblGrid>
       <w:tr>
         <w:trPr>
@@ -4389,7 +4532,7 @@
         </w:trPr>
         <w:tc>
           <w:tcPr>
-            <w:tcW w:w="946" w:type="dxa"/>
+            <w:tcW w:w="931" w:type="dxa"/>
             <w:tcBorders/>
             <w:vAlign w:val="center"/>
           </w:tcPr>
@@ -4411,7 +4554,7 @@
         </w:tc>
         <w:tc>
           <w:tcPr>
-            <w:tcW w:w="10393" w:type="dxa"/>
+            <w:tcW w:w="10408" w:type="dxa"/>
             <w:tcBorders/>
             <w:vAlign w:val="center"/>
           </w:tcPr>
@@ -4436,7 +4579,7 @@
         <w:trPr/>
         <w:tc>
           <w:tcPr>
-            <w:tcW w:w="946" w:type="dxa"/>
+            <w:tcW w:w="931" w:type="dxa"/>
             <w:tcBorders/>
             <w:vAlign w:val="center"/>
           </w:tcPr>
@@ -4459,7 +4602,7 @@
         </w:tc>
         <w:tc>
           <w:tcPr>
-            <w:tcW w:w="10393" w:type="dxa"/>
+            <w:tcW w:w="10408" w:type="dxa"/>
             <w:tcBorders/>
             <w:vAlign w:val="center"/>
           </w:tcPr>
@@ -4483,7 +4626,7 @@
         <w:trPr/>
         <w:tc>
           <w:tcPr>
-            <w:tcW w:w="946" w:type="dxa"/>
+            <w:tcW w:w="931" w:type="dxa"/>
             <w:tcBorders/>
             <w:vAlign w:val="center"/>
           </w:tcPr>
@@ -4506,7 +4649,7 @@
         </w:tc>
         <w:tc>
           <w:tcPr>
-            <w:tcW w:w="10393" w:type="dxa"/>
+            <w:tcW w:w="10408" w:type="dxa"/>
             <w:tcBorders/>
             <w:vAlign w:val="center"/>
           </w:tcPr>
@@ -4540,7 +4683,7 @@
         <w:trPr/>
         <w:tc>
           <w:tcPr>
-            <w:tcW w:w="946" w:type="dxa"/>
+            <w:tcW w:w="931" w:type="dxa"/>
             <w:tcBorders/>
             <w:vAlign w:val="center"/>
           </w:tcPr>
@@ -4563,7 +4706,7 @@
         </w:tc>
         <w:tc>
           <w:tcPr>
-            <w:tcW w:w="10393" w:type="dxa"/>
+            <w:tcW w:w="10408" w:type="dxa"/>
             <w:tcBorders/>
             <w:vAlign w:val="center"/>
           </w:tcPr>
@@ -4587,7 +4730,7 @@
         <w:trPr/>
         <w:tc>
           <w:tcPr>
-            <w:tcW w:w="946" w:type="dxa"/>
+            <w:tcW w:w="931" w:type="dxa"/>
             <w:tcBorders/>
             <w:vAlign w:val="center"/>
           </w:tcPr>
@@ -4610,7 +4753,7 @@
         </w:tc>
         <w:tc>
           <w:tcPr>
-            <w:tcW w:w="10393" w:type="dxa"/>
+            <w:tcW w:w="10408" w:type="dxa"/>
             <w:tcBorders/>
             <w:vAlign w:val="center"/>
           </w:tcPr>
@@ -4687,8 +4830,8 @@
         <w:jc w:val="left"/>
         <w:rPr/>
       </w:pPr>
-      <w:bookmarkStart w:id="14" w:name="which-ticket-is-active"/>
-      <w:bookmarkEnd w:id="14"/>
+      <w:bookmarkStart w:id="15" w:name="which-ticket-is-active"/>
+      <w:bookmarkEnd w:id="15"/>
       <w:r>
         <w:rPr/>
         <w:t>Which Ticket Is Active</w:t>

</xml_diff>

<commit_message>
L-0687 (#453): the owner list knows hold, blocked, landing and needs-owner
owner_items gains held and blocked: a hold whose revisit date is ahead is counted, a due or
undated one is listed as revisit with next.md's reason (cannot tell is never 'not yet'); a
blocked ticket is counted, landing left out; needs-owner is listed with next.md's next: line, else
its first open question, else cannot tell. The waiting line prints H held, B blocked.

Claude-Session: https://claude.ai/code/session_01H49aKnVMcvefcadqBGmuMu
</commit_message>
<xml_diff>
--- a/docs/guides/crew/crew-daily-workflow.docx
+++ b/docs/guides/crew/crew-daily-workflow.docx
@@ -2158,7 +2158,27 @@
       </w:r>
       <w:r>
         <w:rPr/>
-        <w:t xml:space="preserve"> reads it. No </w:t>
+        <w:t xml:space="preserve"> reads it. A hold whose revisit date is still ahead and a blocked ticket are only counted (</w:t>
+      </w:r>
+      <w:r>
+        <w:rPr>
+          <w:rStyle w:val="SourceText"/>
+        </w:rPr>
+        <w:t>2 held, 1 blocked</w:t>
+      </w:r>
+      <w:r>
+        <w:rPr/>
+        <w:t xml:space="preserve">); a hold that is due is listed as </w:t>
+      </w:r>
+      <w:r>
+        <w:rPr>
+          <w:rStyle w:val="SourceText"/>
+        </w:rPr>
+        <w:t>revisit</w:t>
+      </w:r>
+      <w:r>
+        <w:rPr/>
+        <w:t xml:space="preserve"> with its reason. No </w:t>
       </w:r>
       <w:r>
         <w:rPr>

</xml_diff>

<commit_message>
L-0670 (#483): after an automatic reject, autopilot approves a successor plan only when it quotes every BLOCK and FIX line
New crew_autopilot_replan.py: replan_check requires each BLOCK| and FIX| line of the auto-rejected
round as a whole line of plan.md, counted (CRLF read as LF; NIT lines not owed; anything unreadable
is could-not-tell). crew_autopilot.py approve refuses when it fails, after approval_policy allows
and before crew_ticket.approve, writing nothing; replan-check is the read-only action. An owner's
reject, a first plan and /crew:approve are never checked. Mutations: L-0671 (harness).

Claude-Session: https://claude.ai/code/session_01H49aKnVMcvefcadqBGmuMu
</commit_message>
<xml_diff>
--- a/docs/guides/crew/crew-daily-workflow.docx
+++ b/docs/guides/crew/crew-daily-workflow.docx
@@ -2209,8 +2209,65 @@
         <w:jc w:val="left"/>
         <w:rPr/>
       </w:pPr>
-      <w:bookmarkStart w:id="6" w:name="if-something-refuses"/>
+      <w:bookmarkStart w:id="6" w:name="after-autopilot-rejects-a-review-round-i"/>
       <w:bookmarkEnd w:id="6"/>
+      <w:r>
+        <w:rPr/>
+        <w:t>After Autopilot Rejects a Review Round Itself</w:t>
+      </w:r>
+    </w:p>
+    <w:p>
+      <w:pPr>
+        <w:pStyle w:val="BodyText"/>
+        <w:bidi w:val="0"/>
+        <w:jc w:val="left"/>
+        <w:rPr/>
+      </w:pPr>
+      <w:r>
+        <w:rPr/>
+        <w:t xml:space="preserve">With </w:t>
+      </w:r>
+      <w:r>
+        <w:rPr>
+          <w:rStyle w:val="SourceText"/>
+        </w:rPr>
+        <w:t>autopilot.maxAutoReplans</w:t>
+      </w:r>
+      <w:r>
+        <w:rPr/>
+        <w:t xml:space="preserve"> set, autopilot may reject an out-of-rounds BLOCK round and plan again. It approves that successor plan only when the plan quotes every BLOCK and FIX line of the rejected round as whole lines; </w:t>
+      </w:r>
+      <w:r>
+        <w:rPr>
+          <w:rStyle w:val="SourceText"/>
+        </w:rPr>
+        <w:t>crew_autopilot.py replan-check --ticket &lt;id&gt;</w:t>
+      </w:r>
+      <w:r>
+        <w:rPr/>
+        <w:t xml:space="preserve"> shows the same answer without approving. Your own </w:t>
+      </w:r>
+      <w:r>
+        <w:rPr>
+          <w:rStyle w:val="SourceText"/>
+        </w:rPr>
+        <w:t>/crew:approve</w:t>
+      </w:r>
+      <w:r>
+        <w:rPr/>
+        <w:t xml:space="preserve"> is never held to it.</w:t>
+      </w:r>
+    </w:p>
+    <w:p>
+      <w:pPr>
+        <w:pStyle w:val="Heading2"/>
+        <w:bidi w:val="0"/>
+        <w:ind w:hanging="0" w:left="0" w:right="0"/>
+        <w:jc w:val="left"/>
+        <w:rPr/>
+      </w:pPr>
+      <w:bookmarkStart w:id="7" w:name="if-something-refuses"/>
+      <w:bookmarkEnd w:id="7"/>
       <w:r>
         <w:rPr/>
         <w:t>If Something Refuses</w:t>
@@ -2860,8 +2917,8 @@
         <w:jc w:val="left"/>
         <w:rPr/>
       </w:pPr>
-      <w:bookmarkStart w:id="7" w:name="scope-and-approval"/>
-      <w:bookmarkEnd w:id="7"/>
+      <w:bookmarkStart w:id="8" w:name="scope-and-approval"/>
+      <w:bookmarkEnd w:id="8"/>
       <w:r>
         <w:rPr/>
         <w:t>Scope and Approval</w:t>
@@ -2887,8 +2944,8 @@
         <w:jc w:val="left"/>
         <w:rPr/>
       </w:pPr>
-      <w:bookmarkStart w:id="8" w:name="the-contract"/>
-      <w:bookmarkEnd w:id="8"/>
+      <w:bookmarkStart w:id="9" w:name="the-contract"/>
+      <w:bookmarkEnd w:id="9"/>
       <w:r>
         <w:rPr/>
         <w:t>The Contract</w:t>
@@ -3330,8 +3387,8 @@
         <w:jc w:val="left"/>
         <w:rPr/>
       </w:pPr>
-      <w:bookmarkStart w:id="9" w:name="approval"/>
-      <w:bookmarkEnd w:id="9"/>
+      <w:bookmarkStart w:id="10" w:name="approval"/>
+      <w:bookmarkEnd w:id="10"/>
       <w:r>
         <w:rPr/>
         <w:t>Approval</w:t>
@@ -3764,8 +3821,8 @@
         <w:jc w:val="left"/>
         <w:rPr/>
       </w:pPr>
-      <w:bookmarkStart w:id="10" w:name="while-you-implement-the-scope-guard"/>
-      <w:bookmarkEnd w:id="10"/>
+      <w:bookmarkStart w:id="11" w:name="while-you-implement-the-scope-guard"/>
+      <w:bookmarkEnd w:id="11"/>
       <w:r>
         <w:rPr/>
         <w:t>While You Implement: The Scope Guard</w:t>
@@ -4056,8 +4113,8 @@
         <w:jc w:val="left"/>
         <w:rPr/>
       </w:pPr>
-      <w:bookmarkStart w:id="11" w:name="at-the-end-of-a-turn-the-completion-audi"/>
-      <w:bookmarkEnd w:id="11"/>
+      <w:bookmarkStart w:id="12" w:name="at-the-end-of-a-turn-the-completion-audi"/>
+      <w:bookmarkEnd w:id="12"/>
       <w:r>
         <w:rPr/>
         <w:t>At the End of a Turn: The Completion Audit</w:t>
@@ -4231,8 +4288,8 @@
         <w:jc w:val="left"/>
         <w:rPr/>
       </w:pPr>
-      <w:bookmarkStart w:id="12" w:name="amending-scope"/>
-      <w:bookmarkEnd w:id="12"/>
+      <w:bookmarkStart w:id="13" w:name="amending-scope"/>
+      <w:bookmarkEnd w:id="13"/>
       <w:r>
         <w:rPr/>
         <w:t>Amending Scope</w:t>
@@ -4373,8 +4430,8 @@
         <w:jc w:val="left"/>
         <w:rPr/>
       </w:pPr>
-      <w:bookmarkStart w:id="13" w:name="after-two-review-rounds-a-successor-plan"/>
-      <w:bookmarkEnd w:id="13"/>
+      <w:bookmarkStart w:id="14" w:name="after-two-review-rounds-a-successor-plan"/>
+      <w:bookmarkEnd w:id="14"/>
       <w:r>
         <w:rPr/>
         <w:t>After Two Review Rounds: A Successor Plan</w:t>
@@ -4490,8 +4547,8 @@
         <w:jc w:val="left"/>
         <w:rPr/>
       </w:pPr>
-      <w:bookmarkStart w:id="14" w:name="modes"/>
-      <w:bookmarkEnd w:id="14"/>
+      <w:bookmarkStart w:id="15" w:name="modes"/>
+      <w:bookmarkEnd w:id="15"/>
       <w:r>
         <w:rPr/>
         <w:t>Modes</w:t>
@@ -4850,8 +4907,8 @@
         <w:jc w:val="left"/>
         <w:rPr/>
       </w:pPr>
-      <w:bookmarkStart w:id="15" w:name="which-ticket-is-active"/>
-      <w:bookmarkEnd w:id="15"/>
+      <w:bookmarkStart w:id="16" w:name="which-ticket-is-active"/>
+      <w:bookmarkEnd w:id="16"/>
       <w:r>
         <w:rPr/>
         <w:t>Which Ticket Is Active</w:t>

</xml_diff>

<commit_message>
crew 1.2.3: the Stop's outside-scope line reads the crew 1.0 Touch (L-0711)
scope_report.py took its scope from the pre-1.0 '- touch:' line in
.work/tickets/<id>.md, so every crew 1.0 ticket read as missing and a sed -i
write outside Touch was never named at Stop. It now reads the active ticket,
its approved spec.md ## Touch, in_touch and the refresh-artifact admission
through the calls the completion audit makes. Unjudgeable cases print
could-not-tell with the reason. Still report-only: /crew:done check 3 already
refused the shell-made write, and a test now proves it.
</commit_message>
<xml_diff>
--- a/docs/guides/crew/crew-daily-workflow.docx
+++ b/docs/guides/crew/crew-daily-workflow.docx
@@ -1,6 +1,6 @@
 
 <file path=word/document.xml><?xml version="1.0" encoding="utf-8"?>
-<w:document xmlns:o="urn:schemas-microsoft-com:office:office" xmlns:r="http://schemas.openxmlformats.org/officeDocument/2006/relationships" xmlns:v="urn:schemas-microsoft-com:vml" xmlns:w="http://schemas.openxmlformats.org/wordprocessingml/2006/main" xmlns:w10="urn:schemas-microsoft-com:office:word" xmlns:wp="http://schemas.openxmlformats.org/drawingml/2006/wordprocessingDrawing" xmlns:wps="http://schemas.microsoft.com/office/word/2010/wordprocessingShape" xmlns:wpg="http://schemas.microsoft.com/office/word/2010/wordprocessingGroup" xmlns:mc="http://schemas.openxmlformats.org/markup-compatibility/2006" xmlns:wp14="http://schemas.microsoft.com/office/word/2010/wordprocessingDrawing" xmlns:w14="http://schemas.microsoft.com/office/word/2010/wordml" xmlns:w15="http://schemas.microsoft.com/office/word/2012/wordml" mc:Ignorable="w14 wp14 w15">
+<w:document xmlns:o="urn:schemas-microsoft-com:office:office" xmlns:r="http://schemas.openxmlformats.org/officeDocument/2006/relationships" xmlns:v="urn:schemas-microsoft-com:vml" xmlns:w="http://schemas.openxmlformats.org/wordprocessingml/2006/main" xmlns:w10="urn:schemas-microsoft-com:office:word" xmlns:wp="http://schemas.openxmlformats.org/drawingml/2006/wordprocessingDrawing" xmlns:pic="http://schemas.openxmlformats.org/drawingml/2006/picture" xmlns:wps="http://schemas.microsoft.com/office/word/2010/wordprocessingShape" xmlns:wpg="http://schemas.microsoft.com/office/word/2010/wordprocessingGroup" xmlns:mc="http://schemas.openxmlformats.org/markup-compatibility/2006" xmlns:wp14="http://schemas.microsoft.com/office/word/2010/wordprocessingDrawing" xmlns:w14="http://schemas.microsoft.com/office/word/2010/wordml" xmlns:w15="http://schemas.microsoft.com/office/word/2012/wordml" mc:Ignorable="w14 wp14 w15">
   <w:body>
     <w:p>
       <w:pPr>
@@ -77,7 +77,6 @@
             <w:rStyle w:val="Hyperlink"/>
             <w:rFonts w:ascii="Consolas;Courier New;monospace" w:hAnsi="Consolas;Courier New;monospace" w:eastAsia="Consolas;Courier New;monospace" w:cs="Consolas;Courier New;monospace"/>
             <w:sz w:val="19"/>
-            <w:sz w:val="19"/>
             <w:szCs w:val="19"/>
           </w:rPr>
           <w:t>daily-workflow-scope.md</w:t>
@@ -1110,9 +1109,9 @@
     </w:p>
     <w:tbl>
       <w:tblPr>
-        <w:tblW w:w="6243" w:type="dxa"/>
-        <w:jc w:val="left"/>
-        <w:tblInd w:w="0" w:type="dxa"/>
+        <w:tblW w:w="11339" w:type="dxa"/>
+        <w:jc w:val="left"/>
+        <w:tblInd w:w="28" w:type="dxa"/>
         <w:tblLayout w:type="fixed"/>
         <w:tblCellMar>
           <w:top w:w="28" w:type="dxa"/>
@@ -1122,9 +1121,9 @@
         </w:tblCellMar>
       </w:tblPr>
       <w:tblGrid>
-        <w:gridCol w:w="1171"/>
-        <w:gridCol w:w="2290"/>
-        <w:gridCol w:w="2782"/>
+        <w:gridCol w:w="1429"/>
+        <w:gridCol w:w="3770"/>
+        <w:gridCol w:w="6140"/>
       </w:tblGrid>
       <w:tr>
         <w:trPr>
@@ -1132,7 +1131,7 @@
         </w:trPr>
         <w:tc>
           <w:tcPr>
-            <w:tcW w:w="1171" w:type="dxa"/>
+            <w:tcW w:w="1429" w:type="dxa"/>
             <w:tcBorders/>
             <w:vAlign w:val="center"/>
           </w:tcPr>
@@ -1154,7 +1153,7 @@
         </w:tc>
         <w:tc>
           <w:tcPr>
-            <w:tcW w:w="2290" w:type="dxa"/>
+            <w:tcW w:w="3770" w:type="dxa"/>
             <w:tcBorders/>
             <w:vAlign w:val="center"/>
           </w:tcPr>
@@ -1176,7 +1175,7 @@
         </w:tc>
         <w:tc>
           <w:tcPr>
-            <w:tcW w:w="2782" w:type="dxa"/>
+            <w:tcW w:w="6140" w:type="dxa"/>
             <w:tcBorders/>
             <w:vAlign w:val="center"/>
           </w:tcPr>
@@ -1201,7 +1200,7 @@
         <w:trPr/>
         <w:tc>
           <w:tcPr>
-            <w:tcW w:w="1171" w:type="dxa"/>
+            <w:tcW w:w="1429" w:type="dxa"/>
             <w:tcBorders/>
             <w:vAlign w:val="center"/>
           </w:tcPr>
@@ -1222,7 +1221,7 @@
         </w:tc>
         <w:tc>
           <w:tcPr>
-            <w:tcW w:w="2290" w:type="dxa"/>
+            <w:tcW w:w="3770" w:type="dxa"/>
             <w:tcBorders/>
             <w:vAlign w:val="center"/>
           </w:tcPr>
@@ -1253,7 +1252,7 @@
         </w:tc>
         <w:tc>
           <w:tcPr>
-            <w:tcW w:w="2782" w:type="dxa"/>
+            <w:tcW w:w="6140" w:type="dxa"/>
             <w:tcBorders/>
             <w:vAlign w:val="center"/>
           </w:tcPr>
@@ -1277,7 +1276,7 @@
         <w:trPr/>
         <w:tc>
           <w:tcPr>
-            <w:tcW w:w="1171" w:type="dxa"/>
+            <w:tcW w:w="1429" w:type="dxa"/>
             <w:tcBorders/>
             <w:vAlign w:val="center"/>
           </w:tcPr>
@@ -1298,7 +1297,7 @@
         </w:tc>
         <w:tc>
           <w:tcPr>
-            <w:tcW w:w="2290" w:type="dxa"/>
+            <w:tcW w:w="3770" w:type="dxa"/>
             <w:tcBorders/>
             <w:vAlign w:val="center"/>
           </w:tcPr>
@@ -1329,7 +1328,7 @@
         </w:tc>
         <w:tc>
           <w:tcPr>
-            <w:tcW w:w="2782" w:type="dxa"/>
+            <w:tcW w:w="6140" w:type="dxa"/>
             <w:tcBorders/>
             <w:vAlign w:val="center"/>
           </w:tcPr>
@@ -1353,7 +1352,7 @@
         <w:trPr/>
         <w:tc>
           <w:tcPr>
-            <w:tcW w:w="1171" w:type="dxa"/>
+            <w:tcW w:w="1429" w:type="dxa"/>
             <w:tcBorders/>
             <w:vAlign w:val="center"/>
           </w:tcPr>
@@ -1374,7 +1373,7 @@
         </w:tc>
         <w:tc>
           <w:tcPr>
-            <w:tcW w:w="2290" w:type="dxa"/>
+            <w:tcW w:w="3770" w:type="dxa"/>
             <w:tcBorders/>
             <w:vAlign w:val="center"/>
           </w:tcPr>
@@ -1405,7 +1404,7 @@
         </w:tc>
         <w:tc>
           <w:tcPr>
-            <w:tcW w:w="2782" w:type="dxa"/>
+            <w:tcW w:w="6140" w:type="dxa"/>
             <w:tcBorders/>
             <w:vAlign w:val="center"/>
           </w:tcPr>
@@ -1429,7 +1428,7 @@
         <w:trPr/>
         <w:tc>
           <w:tcPr>
-            <w:tcW w:w="1171" w:type="dxa"/>
+            <w:tcW w:w="1429" w:type="dxa"/>
             <w:tcBorders/>
             <w:vAlign w:val="center"/>
           </w:tcPr>
@@ -1450,7 +1449,7 @@
         </w:tc>
         <w:tc>
           <w:tcPr>
-            <w:tcW w:w="2290" w:type="dxa"/>
+            <w:tcW w:w="3770" w:type="dxa"/>
             <w:tcBorders/>
             <w:vAlign w:val="center"/>
           </w:tcPr>
@@ -1471,7 +1470,7 @@
         </w:tc>
         <w:tc>
           <w:tcPr>
-            <w:tcW w:w="2782" w:type="dxa"/>
+            <w:tcW w:w="6140" w:type="dxa"/>
             <w:tcBorders/>
             <w:vAlign w:val="center"/>
           </w:tcPr>
@@ -2495,9 +2494,9 @@
     </w:p>
     <w:tbl>
       <w:tblPr>
-        <w:tblW w:w="6243" w:type="dxa"/>
-        <w:jc w:val="left"/>
-        <w:tblInd w:w="0" w:type="dxa"/>
+        <w:tblW w:w="11339" w:type="dxa"/>
+        <w:jc w:val="left"/>
+        <w:tblInd w:w="28" w:type="dxa"/>
         <w:tblLayout w:type="fixed"/>
         <w:tblCellMar>
           <w:top w:w="28" w:type="dxa"/>
@@ -2507,9 +2506,9 @@
         </w:tblCellMar>
       </w:tblPr>
       <w:tblGrid>
-        <w:gridCol w:w="3046"/>
-        <w:gridCol w:w="1351"/>
-        <w:gridCol w:w="1846"/>
+        <w:gridCol w:w="4125"/>
+        <w:gridCol w:w="2620"/>
+        <w:gridCol w:w="4594"/>
       </w:tblGrid>
       <w:tr>
         <w:trPr>
@@ -2517,7 +2516,7 @@
         </w:trPr>
         <w:tc>
           <w:tcPr>
-            <w:tcW w:w="3046" w:type="dxa"/>
+            <w:tcW w:w="4125" w:type="dxa"/>
             <w:tcBorders/>
             <w:vAlign w:val="center"/>
           </w:tcPr>
@@ -2539,7 +2538,7 @@
         </w:tc>
         <w:tc>
           <w:tcPr>
-            <w:tcW w:w="1351" w:type="dxa"/>
+            <w:tcW w:w="2620" w:type="dxa"/>
             <w:tcBorders/>
             <w:vAlign w:val="center"/>
           </w:tcPr>
@@ -2561,7 +2560,7 @@
         </w:tc>
         <w:tc>
           <w:tcPr>
-            <w:tcW w:w="1846" w:type="dxa"/>
+            <w:tcW w:w="4594" w:type="dxa"/>
             <w:tcBorders/>
             <w:vAlign w:val="center"/>
           </w:tcPr>
@@ -2586,7 +2585,7 @@
         <w:trPr/>
         <w:tc>
           <w:tcPr>
-            <w:tcW w:w="3046" w:type="dxa"/>
+            <w:tcW w:w="4125" w:type="dxa"/>
             <w:tcBorders/>
             <w:vAlign w:val="center"/>
           </w:tcPr>
@@ -2613,7 +2612,7 @@
         </w:tc>
         <w:tc>
           <w:tcPr>
-            <w:tcW w:w="1351" w:type="dxa"/>
+            <w:tcW w:w="2620" w:type="dxa"/>
             <w:tcBorders/>
             <w:vAlign w:val="center"/>
           </w:tcPr>
@@ -2644,7 +2643,7 @@
         </w:tc>
         <w:tc>
           <w:tcPr>
-            <w:tcW w:w="1846" w:type="dxa"/>
+            <w:tcW w:w="4594" w:type="dxa"/>
             <w:tcBorders/>
             <w:vAlign w:val="center"/>
           </w:tcPr>
@@ -2680,7 +2679,7 @@
         <w:trPr/>
         <w:tc>
           <w:tcPr>
-            <w:tcW w:w="3046" w:type="dxa"/>
+            <w:tcW w:w="4125" w:type="dxa"/>
             <w:tcBorders/>
             <w:vAlign w:val="center"/>
           </w:tcPr>
@@ -2701,7 +2700,7 @@
         </w:tc>
         <w:tc>
           <w:tcPr>
-            <w:tcW w:w="1351" w:type="dxa"/>
+            <w:tcW w:w="2620" w:type="dxa"/>
             <w:tcBorders/>
             <w:vAlign w:val="center"/>
           </w:tcPr>
@@ -2722,7 +2721,7 @@
         </w:tc>
         <w:tc>
           <w:tcPr>
-            <w:tcW w:w="1846" w:type="dxa"/>
+            <w:tcW w:w="4594" w:type="dxa"/>
             <w:tcBorders/>
             <w:vAlign w:val="center"/>
           </w:tcPr>
@@ -2756,7 +2755,7 @@
         <w:trPr/>
         <w:tc>
           <w:tcPr>
-            <w:tcW w:w="3046" w:type="dxa"/>
+            <w:tcW w:w="4125" w:type="dxa"/>
             <w:tcBorders/>
             <w:vAlign w:val="center"/>
           </w:tcPr>
@@ -2789,7 +2788,7 @@
         </w:tc>
         <w:tc>
           <w:tcPr>
-            <w:tcW w:w="1351" w:type="dxa"/>
+            <w:tcW w:w="2620" w:type="dxa"/>
             <w:tcBorders/>
             <w:vAlign w:val="center"/>
           </w:tcPr>
@@ -2810,7 +2809,7 @@
         </w:tc>
         <w:tc>
           <w:tcPr>
-            <w:tcW w:w="1846" w:type="dxa"/>
+            <w:tcW w:w="4594" w:type="dxa"/>
             <w:tcBorders/>
             <w:vAlign w:val="center"/>
           </w:tcPr>
@@ -2854,7 +2853,7 @@
         <w:trPr/>
         <w:tc>
           <w:tcPr>
-            <w:tcW w:w="3046" w:type="dxa"/>
+            <w:tcW w:w="4125" w:type="dxa"/>
             <w:tcBorders/>
             <w:vAlign w:val="center"/>
           </w:tcPr>
@@ -2887,7 +2886,7 @@
         </w:tc>
         <w:tc>
           <w:tcPr>
-            <w:tcW w:w="1351" w:type="dxa"/>
+            <w:tcW w:w="2620" w:type="dxa"/>
             <w:tcBorders/>
             <w:vAlign w:val="center"/>
           </w:tcPr>
@@ -2908,7 +2907,7 @@
         </w:tc>
         <w:tc>
           <w:tcPr>
-            <w:tcW w:w="1846" w:type="dxa"/>
+            <w:tcW w:w="4594" w:type="dxa"/>
             <w:tcBorders/>
             <w:vAlign w:val="center"/>
           </w:tcPr>
@@ -2938,7 +2937,7 @@
         <w:trPr/>
         <w:tc>
           <w:tcPr>
-            <w:tcW w:w="3046" w:type="dxa"/>
+            <w:tcW w:w="4125" w:type="dxa"/>
             <w:tcBorders/>
             <w:vAlign w:val="center"/>
           </w:tcPr>
@@ -2981,7 +2980,7 @@
         </w:tc>
         <w:tc>
           <w:tcPr>
-            <w:tcW w:w="1351" w:type="dxa"/>
+            <w:tcW w:w="2620" w:type="dxa"/>
             <w:tcBorders/>
             <w:vAlign w:val="center"/>
           </w:tcPr>
@@ -3002,7 +3001,7 @@
         </w:tc>
         <w:tc>
           <w:tcPr>
-            <w:tcW w:w="1846" w:type="dxa"/>
+            <w:tcW w:w="4594" w:type="dxa"/>
             <w:tcBorders/>
             <w:vAlign w:val="center"/>
           </w:tcPr>
@@ -3026,7 +3025,7 @@
         <w:trPr/>
         <w:tc>
           <w:tcPr>
-            <w:tcW w:w="3046" w:type="dxa"/>
+            <w:tcW w:w="4125" w:type="dxa"/>
             <w:tcBorders/>
             <w:vAlign w:val="center"/>
           </w:tcPr>
@@ -3053,7 +3052,7 @@
         </w:tc>
         <w:tc>
           <w:tcPr>
-            <w:tcW w:w="1351" w:type="dxa"/>
+            <w:tcW w:w="2620" w:type="dxa"/>
             <w:tcBorders/>
             <w:vAlign w:val="center"/>
           </w:tcPr>
@@ -3074,7 +3073,7 @@
         </w:tc>
         <w:tc>
           <w:tcPr>
-            <w:tcW w:w="1846" w:type="dxa"/>
+            <w:tcW w:w="4594" w:type="dxa"/>
             <w:tcBorders/>
             <w:vAlign w:val="center"/>
           </w:tcPr>
@@ -4661,6 +4660,88 @@
       </w:pPr>
       <w:r>
         <w:rPr/>
+        <w:t xml:space="preserve">The verify gate also prints an </w:t>
+      </w:r>
+      <w:r>
+        <w:rPr>
+          <w:rStyle w:val="SourceText"/>
+        </w:rPr>
+        <w:t>outside-scope:</w:t>
+      </w:r>
+      <w:r>
+        <w:rPr/>
+        <w:t xml:space="preserve"> line every Stop, in any </w:t>
+      </w:r>
+      <w:r>
+        <w:rPr>
+          <w:rStyle w:val="SourceText"/>
+        </w:rPr>
+        <w:t>scope.mode</w:t>
+      </w:r>
+      <w:r>
+        <w:rPr/>
+        <w:t xml:space="preserve">. It reads the same approved </w:t>
+      </w:r>
+      <w:r>
+        <w:rPr>
+          <w:rStyle w:val="SourceText"/>
+        </w:rPr>
+        <w:t>spec.md ## Touch</w:t>
+      </w:r>
+      <w:r>
+        <w:rPr/>
+        <w:t xml:space="preserve"> the audit reads, so it names the same paths early, a </w:t>
+      </w:r>
+      <w:r>
+        <w:rPr>
+          <w:rStyle w:val="SourceText"/>
+        </w:rPr>
+        <w:t>sed -i</w:t>
+      </w:r>
+      <w:r>
+        <w:rPr/>
+        <w:t xml:space="preserve"> write included; it never blocks. </w:t>
+      </w:r>
+      <w:r>
+        <w:rPr>
+          <w:rStyle w:val="SourceText"/>
+        </w:rPr>
+        <w:t>outside-scope: (could not tell - &lt;why&gt;)</w:t>
+      </w:r>
+      <w:r>
+        <w:rPr/>
+        <w:t xml:space="preserve"> means it could not judge: no </w:t>
+      </w:r>
+      <w:r>
+        <w:rPr>
+          <w:rStyle w:val="SourceText"/>
+        </w:rPr>
+        <w:t>spec.md</w:t>
+      </w:r>
+      <w:r>
+        <w:rPr/>
+        <w:t xml:space="preserve">, no </w:t>
+      </w:r>
+      <w:r>
+        <w:rPr>
+          <w:rStyle w:val="SourceText"/>
+        </w:rPr>
+        <w:t>## Touch</w:t>
+      </w:r>
+      <w:r>
+        <w:rPr/>
+        <w:t>, a Touch not yet approved, or a ticket still in the pre-1.0 layout.</w:t>
+      </w:r>
+    </w:p>
+    <w:p>
+      <w:pPr>
+        <w:pStyle w:val="BodyText"/>
+        <w:bidi w:val="0"/>
+        <w:jc w:val="left"/>
+        <w:rPr/>
+      </w:pPr>
+      <w:r>
+        <w:rPr/>
         <w:t xml:space="preserve">A changed refresh artifact passes the audit only when a path the ticket changed reaches it and the edit is a re-anchor (the </w:t>
       </w:r>
       <w:r>
@@ -5098,9 +5179,9 @@
     </w:p>
     <w:tbl>
       <w:tblPr>
-        <w:tblW w:w="6243" w:type="dxa"/>
-        <w:jc w:val="left"/>
-        <w:tblInd w:w="0" w:type="dxa"/>
+        <w:tblW w:w="11339" w:type="dxa"/>
+        <w:jc w:val="left"/>
+        <w:tblInd w:w="28" w:type="dxa"/>
         <w:tblLayout w:type="fixed"/>
         <w:tblCellMar>
           <w:top w:w="28" w:type="dxa"/>
@@ -5110,8 +5191,8 @@
         </w:tblCellMar>
       </w:tblPr>
       <w:tblGrid>
-        <w:gridCol w:w="931"/>
-        <w:gridCol w:w="5312"/>
+        <w:gridCol w:w="945"/>
+        <w:gridCol w:w="10394"/>
       </w:tblGrid>
       <w:tr>
         <w:trPr>
@@ -5119,7 +5200,7 @@
         </w:trPr>
         <w:tc>
           <w:tcPr>
-            <w:tcW w:w="931" w:type="dxa"/>
+            <w:tcW w:w="945" w:type="dxa"/>
             <w:tcBorders/>
             <w:vAlign w:val="center"/>
           </w:tcPr>
@@ -5141,7 +5222,7 @@
         </w:tc>
         <w:tc>
           <w:tcPr>
-            <w:tcW w:w="5312" w:type="dxa"/>
+            <w:tcW w:w="10394" w:type="dxa"/>
             <w:tcBorders/>
             <w:vAlign w:val="center"/>
           </w:tcPr>
@@ -5166,7 +5247,7 @@
         <w:trPr/>
         <w:tc>
           <w:tcPr>
-            <w:tcW w:w="931" w:type="dxa"/>
+            <w:tcW w:w="945" w:type="dxa"/>
             <w:tcBorders/>
             <w:vAlign w:val="center"/>
           </w:tcPr>
@@ -5189,7 +5270,7 @@
         </w:tc>
         <w:tc>
           <w:tcPr>
-            <w:tcW w:w="5312" w:type="dxa"/>
+            <w:tcW w:w="10394" w:type="dxa"/>
             <w:tcBorders/>
             <w:vAlign w:val="center"/>
           </w:tcPr>
@@ -5213,7 +5294,7 @@
         <w:trPr/>
         <w:tc>
           <w:tcPr>
-            <w:tcW w:w="931" w:type="dxa"/>
+            <w:tcW w:w="945" w:type="dxa"/>
             <w:tcBorders/>
             <w:vAlign w:val="center"/>
           </w:tcPr>
@@ -5236,7 +5317,7 @@
         </w:tc>
         <w:tc>
           <w:tcPr>
-            <w:tcW w:w="5312" w:type="dxa"/>
+            <w:tcW w:w="10394" w:type="dxa"/>
             <w:tcBorders/>
             <w:vAlign w:val="center"/>
           </w:tcPr>
@@ -5270,7 +5351,7 @@
         <w:trPr/>
         <w:tc>
           <w:tcPr>
-            <w:tcW w:w="931" w:type="dxa"/>
+            <w:tcW w:w="945" w:type="dxa"/>
             <w:tcBorders/>
             <w:vAlign w:val="center"/>
           </w:tcPr>
@@ -5293,7 +5374,7 @@
         </w:tc>
         <w:tc>
           <w:tcPr>
-            <w:tcW w:w="5312" w:type="dxa"/>
+            <w:tcW w:w="10394" w:type="dxa"/>
             <w:tcBorders/>
             <w:vAlign w:val="center"/>
           </w:tcPr>
@@ -5317,7 +5398,7 @@
         <w:trPr/>
         <w:tc>
           <w:tcPr>
-            <w:tcW w:w="931" w:type="dxa"/>
+            <w:tcW w:w="945" w:type="dxa"/>
             <w:tcBorders/>
             <w:vAlign w:val="center"/>
           </w:tcPr>
@@ -5340,7 +5421,7 @@
         </w:tc>
         <w:tc>
           <w:tcPr>
-            <w:tcW w:w="5312" w:type="dxa"/>
+            <w:tcW w:w="10394" w:type="dxa"/>
             <w:tcBorders/>
             <w:vAlign w:val="center"/>
           </w:tcPr>
@@ -6545,7 +6626,7 @@
       <w:start w:val="1"/>
       <w:numFmt w:val="none"/>
       <w:suff w:val="nothing"/>
-      <w:lvlText w:val="%1"/>
+      <w:lvlText w:val=""/>
       <w:lvlJc w:val="left"/>
       <w:pPr>
         <w:tabs>
@@ -6556,10 +6637,37 @@
     </w:lvl>
     <w:lvl w:ilvl="1">
       <w:start w:val="1"/>
+      <w:numFmt w:val="none"/>
       <w:pStyle w:val="Heading2"/>
+      <w:suff w:val="nothing"/>
+      <w:lvlText w:val=""/>
+      <w:lvlJc w:val="left"/>
+      <w:pPr>
+        <w:tabs>
+          <w:tab w:val="num" w:pos="0"/>
+        </w:tabs>
+        <w:ind w:left="0" w:hanging="0"/>
+      </w:pPr>
+    </w:lvl>
+    <w:lvl w:ilvl="2">
+      <w:start w:val="1"/>
+      <w:numFmt w:val="none"/>
+      <w:pStyle w:val="Heading3"/>
+      <w:suff w:val="nothing"/>
+      <w:lvlText w:val=""/>
+      <w:lvlJc w:val="left"/>
+      <w:pPr>
+        <w:tabs>
+          <w:tab w:val="num" w:pos="0"/>
+        </w:tabs>
+        <w:ind w:left="0" w:hanging="0"/>
+      </w:pPr>
+    </w:lvl>
+    <w:lvl w:ilvl="3">
+      <w:start w:val="1"/>
       <w:numFmt w:val="none"/>
       <w:suff w:val="nothing"/>
-      <w:lvlText w:val="%2"/>
+      <w:lvlText w:val=""/>
       <w:lvlJc w:val="left"/>
       <w:pPr>
         <w:tabs>
@@ -6568,12 +6676,11 @@
         <w:ind w:left="0" w:hanging="0"/>
       </w:pPr>
     </w:lvl>
-    <w:lvl w:ilvl="2">
-      <w:start w:val="1"/>
-      <w:pStyle w:val="Heading3"/>
+    <w:lvl w:ilvl="4">
+      <w:start w:val="1"/>
       <w:numFmt w:val="none"/>
       <w:suff w:val="nothing"/>
-      <w:lvlText w:val="%3"/>
+      <w:lvlText w:val=""/>
       <w:lvlJc w:val="left"/>
       <w:pPr>
         <w:tabs>
@@ -6582,11 +6689,11 @@
         <w:ind w:left="0" w:hanging="0"/>
       </w:pPr>
     </w:lvl>
-    <w:lvl w:ilvl="3">
+    <w:lvl w:ilvl="5">
       <w:start w:val="1"/>
       <w:numFmt w:val="none"/>
       <w:suff w:val="nothing"/>
-      <w:lvlText w:val="%4"/>
+      <w:lvlText w:val=""/>
       <w:lvlJc w:val="left"/>
       <w:pPr>
         <w:tabs>
@@ -6595,11 +6702,11 @@
         <w:ind w:left="0" w:hanging="0"/>
       </w:pPr>
     </w:lvl>
-    <w:lvl w:ilvl="4">
+    <w:lvl w:ilvl="6">
       <w:start w:val="1"/>
       <w:numFmt w:val="none"/>
       <w:suff w:val="nothing"/>
-      <w:lvlText w:val="%5"/>
+      <w:lvlText w:val=""/>
       <w:lvlJc w:val="left"/>
       <w:pPr>
         <w:tabs>
@@ -6608,11 +6715,11 @@
         <w:ind w:left="0" w:hanging="0"/>
       </w:pPr>
     </w:lvl>
-    <w:lvl w:ilvl="5">
+    <w:lvl w:ilvl="7">
       <w:start w:val="1"/>
       <w:numFmt w:val="none"/>
       <w:suff w:val="nothing"/>
-      <w:lvlText w:val="%6"/>
+      <w:lvlText w:val=""/>
       <w:lvlJc w:val="left"/>
       <w:pPr>
         <w:tabs>
@@ -6621,37 +6728,11 @@
         <w:ind w:left="0" w:hanging="0"/>
       </w:pPr>
     </w:lvl>
-    <w:lvl w:ilvl="6">
+    <w:lvl w:ilvl="8">
       <w:start w:val="1"/>
       <w:numFmt w:val="none"/>
       <w:suff w:val="nothing"/>
-      <w:lvlText w:val="%7"/>
-      <w:lvlJc w:val="left"/>
-      <w:pPr>
-        <w:tabs>
-          <w:tab w:val="num" w:pos="0"/>
-        </w:tabs>
-        <w:ind w:left="0" w:hanging="0"/>
-      </w:pPr>
-    </w:lvl>
-    <w:lvl w:ilvl="7">
-      <w:start w:val="1"/>
-      <w:numFmt w:val="none"/>
-      <w:suff w:val="nothing"/>
-      <w:lvlText w:val="%8"/>
-      <w:lvlJc w:val="left"/>
-      <w:pPr>
-        <w:tabs>
-          <w:tab w:val="num" w:pos="0"/>
-        </w:tabs>
-        <w:ind w:left="0" w:hanging="0"/>
-      </w:pPr>
-    </w:lvl>
-    <w:lvl w:ilvl="8">
-      <w:start w:val="1"/>
-      <w:numFmt w:val="none"/>
-      <w:suff w:val="nothing"/>
-      <w:lvlText w:val="%9"/>
+      <w:lvlText w:val=""/>
       <w:lvlJc w:val="left"/>
       <w:pPr>
         <w:tabs>
@@ -6696,7 +6777,7 @@
   <w:docDefaults>
     <w:rPrDefault>
       <w:rPr>
-        <w:rFonts w:ascii="Liberation Serif" w:hAnsi="Liberation Serif" w:eastAsia="WenQuanYi Zen Hei" w:cs="FreeSans"/>
+        <w:rFonts w:ascii="Liberation Serif" w:hAnsi="Liberation Serif" w:eastAsia="Noto Serif CJK SC" w:cs="Noto Sans Devanagari"/>
         <w:sz w:val="24"/>
         <w:szCs w:val="24"/>
         <w:lang w:val="en-US" w:eastAsia="zh-CN" w:bidi="hi-IN"/>
@@ -6726,7 +6807,7 @@
     </w:rPr>
   </w:style>
   <w:style w:type="paragraph" w:styleId="Heading1">
-    <w:name w:val="Heading 1"/>
+    <w:name w:val="heading 1"/>
     <w:basedOn w:val="Heading"/>
     <w:next w:val="BodyText"/>
     <w:qFormat/>
@@ -6734,7 +6815,6 @@
       <w:spacing w:before="240" w:after="80"/>
     </w:pPr>
     <w:rPr>
-      <w:rFonts w:ascii="Noto Sans" w:hAnsi="Noto Sans"/>
       <w:b/>
       <w:bCs/>
       <w:color w:val="88C0D0"/>
@@ -6743,7 +6823,7 @@
     </w:rPr>
   </w:style>
   <w:style w:type="paragraph" w:styleId="Heading2">
-    <w:name w:val="Heading 2"/>
+    <w:name w:val="heading 2"/>
     <w:basedOn w:val="Heading"/>
     <w:next w:val="BodyText"/>
     <w:qFormat/>
@@ -6756,7 +6836,7 @@
       <w:outlineLvl w:val="1"/>
     </w:pPr>
     <w:rPr>
-      <w:rFonts w:ascii="Liberation Serif" w:hAnsi="Liberation Serif" w:eastAsia="WenQuanYi Zen Hei" w:cs="FreeSans"/>
+      <w:rFonts w:ascii="Liberation Serif" w:hAnsi="Liberation Serif" w:eastAsia="Noto Serif CJK SC" w:cs="Noto Sans Devanagari"/>
       <w:b/>
       <w:bCs/>
       <w:color w:val="88C0D0"/>
@@ -6765,7 +6845,7 @@
     </w:rPr>
   </w:style>
   <w:style w:type="paragraph" w:styleId="Heading3">
-    <w:name w:val="Heading 3"/>
+    <w:name w:val="heading 3"/>
     <w:basedOn w:val="Heading"/>
     <w:next w:val="BodyText"/>
     <w:qFormat/>
@@ -6775,12 +6855,24 @@
       <w:outlineLvl w:val="2"/>
     </w:pPr>
     <w:rPr>
-      <w:rFonts w:ascii="Liberation Serif" w:hAnsi="Liberation Serif" w:eastAsia="WenQuanYi Zen Hei" w:cs="FreeSans"/>
+      <w:rFonts w:ascii="Liberation Serif" w:hAnsi="Liberation Serif" w:eastAsia="Noto Serif CJK SC" w:cs="Noto Sans Devanagari"/>
       <w:b/>
       <w:bCs/>
       <w:color w:val="88C0D0"/>
       <w:sz w:val="26"/>
       <w:szCs w:val="26"/>
+    </w:rPr>
+  </w:style>
+  <w:style w:type="character" w:styleId="EndnoteReference">
+    <w:name w:val="endnote reference"/>
+    <w:rPr>
+      <w:vertAlign w:val="superscript"/>
+    </w:rPr>
+  </w:style>
+  <w:style w:type="character" w:styleId="FootnoteReference">
+    <w:name w:val="footnote reference"/>
+    <w:rPr>
+      <w:vertAlign w:val="superscript"/>
     </w:rPr>
   </w:style>
   <w:style w:type="character" w:styleId="EndnoteCharacters">
@@ -6852,7 +6944,7 @@
     </w:rPr>
   </w:style>
   <w:style w:type="paragraph" w:styleId="EnvelopeReturn">
-    <w:name w:val="Envelope Return"/>
+    <w:name w:val="envelope return"/>
     <w:basedOn w:val="Normal"/>
     <w:pPr/>
     <w:rPr>
@@ -6871,46 +6963,6 @@
       <w:color w:val="ECEFF4"/>
     </w:rPr>
   </w:style>
-  <w:style w:type="paragraph" w:styleId="Footer">
-    <w:name w:val="Footer"/>
-    <w:basedOn w:val="Normal"/>
-    <w:pPr>
-      <w:suppressLineNumbers/>
-      <w:tabs>
-        <w:tab w:val="clear" w:pos="1134"/>
-        <w:tab w:val="center" w:pos="5952" w:leader="none"/>
-        <w:tab w:val="right" w:pos="10771" w:leader="none"/>
-      </w:tabs>
-    </w:pPr>
-    <w:rPr/>
-  </w:style>
-  <w:style w:type="paragraph" w:styleId="Header">
-    <w:name w:val="Header"/>
-    <w:basedOn w:val="Normal"/>
-    <w:pPr>
-      <w:suppressLineNumbers/>
-      <w:tabs>
-        <w:tab w:val="clear" w:pos="1134"/>
-        <w:tab w:val="center" w:pos="5952" w:leader="none"/>
-        <w:tab w:val="right" w:pos="10771" w:leader="none"/>
-      </w:tabs>
-    </w:pPr>
-    <w:rPr/>
-  </w:style>
-  <w:style w:type="paragraph" w:styleId="HeaderandFooter">
-    <w:name w:val="Header and Footer"/>
-    <w:basedOn w:val="Normal"/>
-    <w:qFormat/>
-    <w:pPr>
-      <w:suppressLineNumbers/>
-      <w:tabs>
-        <w:tab w:val="clear" w:pos="1134"/>
-        <w:tab w:val="center" w:pos="5953" w:leader="none"/>
-        <w:tab w:val="right" w:pos="10772" w:leader="none"/>
-      </w:tabs>
-    </w:pPr>
-    <w:rPr/>
-  </w:style>
   <w:style w:type="paragraph" w:styleId="Index">
     <w:name w:val="Index"/>
     <w:basedOn w:val="Normal"/>
@@ -6919,11 +6971,11 @@
       <w:suppressLineNumbers/>
     </w:pPr>
     <w:rPr>
-      <w:rFonts w:cs="FreeSans"/>
+      <w:rFonts w:cs="Noto Sans Devanagari"/>
     </w:rPr>
   </w:style>
   <w:style w:type="paragraph" w:styleId="Caption">
-    <w:name w:val="Caption"/>
+    <w:name w:val="caption"/>
     <w:basedOn w:val="Normal"/>
     <w:qFormat/>
     <w:pPr>
@@ -6931,7 +6983,7 @@
       <w:spacing w:before="120" w:after="120"/>
     </w:pPr>
     <w:rPr>
-      <w:rFonts w:cs="FreeSans"/>
+      <w:rFonts w:cs="Noto Sans Devanagari"/>
       <w:i/>
       <w:iCs/>
       <w:sz w:val="24"/>
@@ -6943,7 +6995,7 @@
     <w:basedOn w:val="BodyText"/>
     <w:pPr/>
     <w:rPr>
-      <w:rFonts w:cs="FreeSans"/>
+      <w:rFonts w:cs="Noto Sans Devanagari"/>
     </w:rPr>
   </w:style>
   <w:style w:type="paragraph" w:styleId="BodyText">
@@ -6985,7 +7037,7 @@
       <w:ind w:left="160" w:right="160"/>
     </w:pPr>
     <w:rPr>
-      <w:rFonts w:ascii="Liberation Mono" w:hAnsi="Liberation Mono" w:eastAsia="Liberation Mono" w:cs="Liberation Mono"/>
+      <w:rFonts w:ascii="Liberation Mono" w:hAnsi="Liberation Mono" w:eastAsia="Noto Sans Mono CJK SC" w:cs="Liberation Mono"/>
       <w:sz w:val="20"/>
       <w:szCs w:val="20"/>
     </w:rPr>
@@ -7026,37 +7078,37 @@
         <a:srgbClr val="000000"/>
       </a:dk1>
       <a:lt1>
-        <a:srgbClr val="ffffff"/>
+        <a:srgbClr val="FFFFFF"/>
       </a:lt1>
       <a:dk2>
         <a:srgbClr val="000000"/>
       </a:dk2>
       <a:lt2>
-        <a:srgbClr val="ffffff"/>
+        <a:srgbClr val="FFFFFF"/>
       </a:lt2>
       <a:accent1>
-        <a:srgbClr val="18a303"/>
+        <a:srgbClr val="18A303"/>
       </a:accent1>
       <a:accent2>
-        <a:srgbClr val="0369a3"/>
+        <a:srgbClr val="0369A3"/>
       </a:accent2>
       <a:accent3>
-        <a:srgbClr val="a33e03"/>
+        <a:srgbClr val="A33E03"/>
       </a:accent3>
       <a:accent4>
-        <a:srgbClr val="8e03a3"/>
+        <a:srgbClr val="8E03A3"/>
       </a:accent4>
       <a:accent5>
-        <a:srgbClr val="c99c00"/>
+        <a:srgbClr val="C99C00"/>
       </a:accent5>
       <a:accent6>
-        <a:srgbClr val="c9211e"/>
+        <a:srgbClr val="C9211E"/>
       </a:accent6>
       <a:hlink>
-        <a:srgbClr val="0000ee"/>
+        <a:srgbClr val="0000EE"/>
       </a:hlink>
       <a:folHlink>
-        <a:srgbClr val="551a8b"/>
+        <a:srgbClr val="551A8B"/>
       </a:folHlink>
     </a:clrScheme>
     <a:fontScheme name="Office">

</xml_diff>

<commit_message>
crew 1.2.2: L-0710 harness half - changelog, rebuilt guides, budget count
Claude-Session: https://claude.ai/code/session_01GYbTAPVer2KNpK6NmGbo5p
</commit_message>
<xml_diff>
--- a/docs/guides/crew/crew-daily-workflow.docx
+++ b/docs/guides/crew/crew-daily-workflow.docx
@@ -1,6 +1,6 @@
 
 <file path=word/document.xml><?xml version="1.0" encoding="utf-8"?>
-<w:document xmlns:o="urn:schemas-microsoft-com:office:office" xmlns:r="http://schemas.openxmlformats.org/officeDocument/2006/relationships" xmlns:v="urn:schemas-microsoft-com:vml" xmlns:w="http://schemas.openxmlformats.org/wordprocessingml/2006/main" xmlns:w10="urn:schemas-microsoft-com:office:word" xmlns:wp="http://schemas.openxmlformats.org/drawingml/2006/wordprocessingDrawing" xmlns:wps="http://schemas.microsoft.com/office/word/2010/wordprocessingShape" xmlns:wpg="http://schemas.microsoft.com/office/word/2010/wordprocessingGroup" xmlns:mc="http://schemas.openxmlformats.org/markup-compatibility/2006" xmlns:wp14="http://schemas.microsoft.com/office/word/2010/wordprocessingDrawing" xmlns:w14="http://schemas.microsoft.com/office/word/2010/wordml" xmlns:w15="http://schemas.microsoft.com/office/word/2012/wordml" mc:Ignorable="w14 wp14 w15">
+<w:document xmlns:o="urn:schemas-microsoft-com:office:office" xmlns:r="http://schemas.openxmlformats.org/officeDocument/2006/relationships" xmlns:v="urn:schemas-microsoft-com:vml" xmlns:w="http://schemas.openxmlformats.org/wordprocessingml/2006/main" xmlns:w10="urn:schemas-microsoft-com:office:word" xmlns:wp="http://schemas.openxmlformats.org/drawingml/2006/wordprocessingDrawing" xmlns:pic="http://schemas.openxmlformats.org/drawingml/2006/picture" xmlns:wps="http://schemas.microsoft.com/office/word/2010/wordprocessingShape" xmlns:wpg="http://schemas.microsoft.com/office/word/2010/wordprocessingGroup" xmlns:mc="http://schemas.openxmlformats.org/markup-compatibility/2006" xmlns:wp14="http://schemas.microsoft.com/office/word/2010/wordprocessingDrawing" xmlns:w14="http://schemas.microsoft.com/office/word/2010/wordml" xmlns:w15="http://schemas.microsoft.com/office/word/2012/wordml" mc:Ignorable="w14 wp14 w15">
   <w:body>
     <w:p>
       <w:pPr>
@@ -77,7 +77,6 @@
             <w:rStyle w:val="Hyperlink"/>
             <w:rFonts w:ascii="Consolas;Courier New;monospace" w:hAnsi="Consolas;Courier New;monospace" w:eastAsia="Consolas;Courier New;monospace" w:cs="Consolas;Courier New;monospace"/>
             <w:sz w:val="19"/>
-            <w:sz w:val="19"/>
             <w:szCs w:val="19"/>
           </w:rPr>
           <w:t>daily-workflow-scope.md</w:t>
@@ -1110,9 +1109,9 @@
     </w:p>
     <w:tbl>
       <w:tblPr>
-        <w:tblW w:w="6243" w:type="dxa"/>
-        <w:jc w:val="left"/>
-        <w:tblInd w:w="0" w:type="dxa"/>
+        <w:tblW w:w="11339" w:type="dxa"/>
+        <w:jc w:val="left"/>
+        <w:tblInd w:w="28" w:type="dxa"/>
         <w:tblLayout w:type="fixed"/>
         <w:tblCellMar>
           <w:top w:w="28" w:type="dxa"/>
@@ -1122,9 +1121,9 @@
         </w:tblCellMar>
       </w:tblPr>
       <w:tblGrid>
-        <w:gridCol w:w="1171"/>
-        <w:gridCol w:w="2290"/>
-        <w:gridCol w:w="2782"/>
+        <w:gridCol w:w="1204"/>
+        <w:gridCol w:w="2566"/>
+        <w:gridCol w:w="7569"/>
       </w:tblGrid>
       <w:tr>
         <w:trPr>
@@ -1132,7 +1131,7 @@
         </w:trPr>
         <w:tc>
           <w:tcPr>
-            <w:tcW w:w="1171" w:type="dxa"/>
+            <w:tcW w:w="1204" w:type="dxa"/>
             <w:tcBorders/>
             <w:vAlign w:val="center"/>
           </w:tcPr>
@@ -1154,7 +1153,7 @@
         </w:tc>
         <w:tc>
           <w:tcPr>
-            <w:tcW w:w="2290" w:type="dxa"/>
+            <w:tcW w:w="2566" w:type="dxa"/>
             <w:tcBorders/>
             <w:vAlign w:val="center"/>
           </w:tcPr>
@@ -1176,7 +1175,7 @@
         </w:tc>
         <w:tc>
           <w:tcPr>
-            <w:tcW w:w="2782" w:type="dxa"/>
+            <w:tcW w:w="7569" w:type="dxa"/>
             <w:tcBorders/>
             <w:vAlign w:val="center"/>
           </w:tcPr>
@@ -1201,7 +1200,7 @@
         <w:trPr/>
         <w:tc>
           <w:tcPr>
-            <w:tcW w:w="1171" w:type="dxa"/>
+            <w:tcW w:w="1204" w:type="dxa"/>
             <w:tcBorders/>
             <w:vAlign w:val="center"/>
           </w:tcPr>
@@ -1222,7 +1221,7 @@
         </w:tc>
         <w:tc>
           <w:tcPr>
-            <w:tcW w:w="2290" w:type="dxa"/>
+            <w:tcW w:w="2566" w:type="dxa"/>
             <w:tcBorders/>
             <w:vAlign w:val="center"/>
           </w:tcPr>
@@ -1253,7 +1252,7 @@
         </w:tc>
         <w:tc>
           <w:tcPr>
-            <w:tcW w:w="2782" w:type="dxa"/>
+            <w:tcW w:w="7569" w:type="dxa"/>
             <w:tcBorders/>
             <w:vAlign w:val="center"/>
           </w:tcPr>
@@ -1277,7 +1276,7 @@
         <w:trPr/>
         <w:tc>
           <w:tcPr>
-            <w:tcW w:w="1171" w:type="dxa"/>
+            <w:tcW w:w="1204" w:type="dxa"/>
             <w:tcBorders/>
             <w:vAlign w:val="center"/>
           </w:tcPr>
@@ -1298,7 +1297,7 @@
         </w:tc>
         <w:tc>
           <w:tcPr>
-            <w:tcW w:w="2290" w:type="dxa"/>
+            <w:tcW w:w="2566" w:type="dxa"/>
             <w:tcBorders/>
             <w:vAlign w:val="center"/>
           </w:tcPr>
@@ -1329,7 +1328,7 @@
         </w:tc>
         <w:tc>
           <w:tcPr>
-            <w:tcW w:w="2782" w:type="dxa"/>
+            <w:tcW w:w="7569" w:type="dxa"/>
             <w:tcBorders/>
             <w:vAlign w:val="center"/>
           </w:tcPr>
@@ -1344,7 +1343,17 @@
             </w:pPr>
             <w:r>
               <w:rPr/>
-              <w:t>refuses to end the turn on a red check</w:t>
+              <w:t xml:space="preserve">runs the rules for what changed that fit </w:t>
+            </w:r>
+            <w:r>
+              <w:rPr>
+                <w:rStyle w:val="SourceText"/>
+              </w:rPr>
+              <w:t>verify.stopBudgetSeconds</w:t>
+            </w:r>
+            <w:r>
+              <w:rPr/>
+              <w:t>; refuses to end the turn on a red check, never on a deferral (a rule too big for the budget goes to CI)</w:t>
             </w:r>
           </w:p>
         </w:tc>
@@ -1353,7 +1362,7 @@
         <w:trPr/>
         <w:tc>
           <w:tcPr>
-            <w:tcW w:w="1171" w:type="dxa"/>
+            <w:tcW w:w="1204" w:type="dxa"/>
             <w:tcBorders/>
             <w:vAlign w:val="center"/>
           </w:tcPr>
@@ -1374,7 +1383,7 @@
         </w:tc>
         <w:tc>
           <w:tcPr>
-            <w:tcW w:w="2290" w:type="dxa"/>
+            <w:tcW w:w="2566" w:type="dxa"/>
             <w:tcBorders/>
             <w:vAlign w:val="center"/>
           </w:tcPr>
@@ -1405,7 +1414,7 @@
         </w:tc>
         <w:tc>
           <w:tcPr>
-            <w:tcW w:w="2782" w:type="dxa"/>
+            <w:tcW w:w="7569" w:type="dxa"/>
             <w:tcBorders/>
             <w:vAlign w:val="center"/>
           </w:tcPr>
@@ -1429,7 +1438,7 @@
         <w:trPr/>
         <w:tc>
           <w:tcPr>
-            <w:tcW w:w="1171" w:type="dxa"/>
+            <w:tcW w:w="1204" w:type="dxa"/>
             <w:tcBorders/>
             <w:vAlign w:val="center"/>
           </w:tcPr>
@@ -1450,7 +1459,7 @@
         </w:tc>
         <w:tc>
           <w:tcPr>
-            <w:tcW w:w="2290" w:type="dxa"/>
+            <w:tcW w:w="2566" w:type="dxa"/>
             <w:tcBorders/>
             <w:vAlign w:val="center"/>
           </w:tcPr>
@@ -1471,7 +1480,7 @@
         </w:tc>
         <w:tc>
           <w:tcPr>
-            <w:tcW w:w="2782" w:type="dxa"/>
+            <w:tcW w:w="7569" w:type="dxa"/>
             <w:tcBorders/>
             <w:vAlign w:val="center"/>
           </w:tcPr>
@@ -2495,9 +2504,9 @@
     </w:p>
     <w:tbl>
       <w:tblPr>
-        <w:tblW w:w="6243" w:type="dxa"/>
-        <w:jc w:val="left"/>
-        <w:tblInd w:w="0" w:type="dxa"/>
+        <w:tblW w:w="11339" w:type="dxa"/>
+        <w:jc w:val="left"/>
+        <w:tblInd w:w="28" w:type="dxa"/>
         <w:tblLayout w:type="fixed"/>
         <w:tblCellMar>
           <w:top w:w="28" w:type="dxa"/>
@@ -2507,9 +2516,9 @@
         </w:tblCellMar>
       </w:tblPr>
       <w:tblGrid>
-        <w:gridCol w:w="3046"/>
-        <w:gridCol w:w="1351"/>
-        <w:gridCol w:w="1846"/>
+        <w:gridCol w:w="4125"/>
+        <w:gridCol w:w="2620"/>
+        <w:gridCol w:w="4594"/>
       </w:tblGrid>
       <w:tr>
         <w:trPr>
@@ -2517,7 +2526,7 @@
         </w:trPr>
         <w:tc>
           <w:tcPr>
-            <w:tcW w:w="3046" w:type="dxa"/>
+            <w:tcW w:w="4125" w:type="dxa"/>
             <w:tcBorders/>
             <w:vAlign w:val="center"/>
           </w:tcPr>
@@ -2539,7 +2548,7 @@
         </w:tc>
         <w:tc>
           <w:tcPr>
-            <w:tcW w:w="1351" w:type="dxa"/>
+            <w:tcW w:w="2620" w:type="dxa"/>
             <w:tcBorders/>
             <w:vAlign w:val="center"/>
           </w:tcPr>
@@ -2561,7 +2570,7 @@
         </w:tc>
         <w:tc>
           <w:tcPr>
-            <w:tcW w:w="1846" w:type="dxa"/>
+            <w:tcW w:w="4594" w:type="dxa"/>
             <w:tcBorders/>
             <w:vAlign w:val="center"/>
           </w:tcPr>
@@ -2586,7 +2595,7 @@
         <w:trPr/>
         <w:tc>
           <w:tcPr>
-            <w:tcW w:w="3046" w:type="dxa"/>
+            <w:tcW w:w="4125" w:type="dxa"/>
             <w:tcBorders/>
             <w:vAlign w:val="center"/>
           </w:tcPr>
@@ -2613,7 +2622,7 @@
         </w:tc>
         <w:tc>
           <w:tcPr>
-            <w:tcW w:w="1351" w:type="dxa"/>
+            <w:tcW w:w="2620" w:type="dxa"/>
             <w:tcBorders/>
             <w:vAlign w:val="center"/>
           </w:tcPr>
@@ -2644,7 +2653,7 @@
         </w:tc>
         <w:tc>
           <w:tcPr>
-            <w:tcW w:w="1846" w:type="dxa"/>
+            <w:tcW w:w="4594" w:type="dxa"/>
             <w:tcBorders/>
             <w:vAlign w:val="center"/>
           </w:tcPr>
@@ -2680,7 +2689,7 @@
         <w:trPr/>
         <w:tc>
           <w:tcPr>
-            <w:tcW w:w="3046" w:type="dxa"/>
+            <w:tcW w:w="4125" w:type="dxa"/>
             <w:tcBorders/>
             <w:vAlign w:val="center"/>
           </w:tcPr>
@@ -2701,7 +2710,7 @@
         </w:tc>
         <w:tc>
           <w:tcPr>
-            <w:tcW w:w="1351" w:type="dxa"/>
+            <w:tcW w:w="2620" w:type="dxa"/>
             <w:tcBorders/>
             <w:vAlign w:val="center"/>
           </w:tcPr>
@@ -2722,7 +2731,7 @@
         </w:tc>
         <w:tc>
           <w:tcPr>
-            <w:tcW w:w="1846" w:type="dxa"/>
+            <w:tcW w:w="4594" w:type="dxa"/>
             <w:tcBorders/>
             <w:vAlign w:val="center"/>
           </w:tcPr>
@@ -2756,7 +2765,7 @@
         <w:trPr/>
         <w:tc>
           <w:tcPr>
-            <w:tcW w:w="3046" w:type="dxa"/>
+            <w:tcW w:w="4125" w:type="dxa"/>
             <w:tcBorders/>
             <w:vAlign w:val="center"/>
           </w:tcPr>
@@ -2789,7 +2798,7 @@
         </w:tc>
         <w:tc>
           <w:tcPr>
-            <w:tcW w:w="1351" w:type="dxa"/>
+            <w:tcW w:w="2620" w:type="dxa"/>
             <w:tcBorders/>
             <w:vAlign w:val="center"/>
           </w:tcPr>
@@ -2810,7 +2819,7 @@
         </w:tc>
         <w:tc>
           <w:tcPr>
-            <w:tcW w:w="1846" w:type="dxa"/>
+            <w:tcW w:w="4594" w:type="dxa"/>
             <w:tcBorders/>
             <w:vAlign w:val="center"/>
           </w:tcPr>
@@ -2854,7 +2863,7 @@
         <w:trPr/>
         <w:tc>
           <w:tcPr>
-            <w:tcW w:w="3046" w:type="dxa"/>
+            <w:tcW w:w="4125" w:type="dxa"/>
             <w:tcBorders/>
             <w:vAlign w:val="center"/>
           </w:tcPr>
@@ -2887,7 +2896,7 @@
         </w:tc>
         <w:tc>
           <w:tcPr>
-            <w:tcW w:w="1351" w:type="dxa"/>
+            <w:tcW w:w="2620" w:type="dxa"/>
             <w:tcBorders/>
             <w:vAlign w:val="center"/>
           </w:tcPr>
@@ -2908,7 +2917,7 @@
         </w:tc>
         <w:tc>
           <w:tcPr>
-            <w:tcW w:w="1846" w:type="dxa"/>
+            <w:tcW w:w="4594" w:type="dxa"/>
             <w:tcBorders/>
             <w:vAlign w:val="center"/>
           </w:tcPr>
@@ -2938,7 +2947,7 @@
         <w:trPr/>
         <w:tc>
           <w:tcPr>
-            <w:tcW w:w="3046" w:type="dxa"/>
+            <w:tcW w:w="4125" w:type="dxa"/>
             <w:tcBorders/>
             <w:vAlign w:val="center"/>
           </w:tcPr>
@@ -2981,7 +2990,7 @@
         </w:tc>
         <w:tc>
           <w:tcPr>
-            <w:tcW w:w="1351" w:type="dxa"/>
+            <w:tcW w:w="2620" w:type="dxa"/>
             <w:tcBorders/>
             <w:vAlign w:val="center"/>
           </w:tcPr>
@@ -3002,7 +3011,7 @@
         </w:tc>
         <w:tc>
           <w:tcPr>
-            <w:tcW w:w="1846" w:type="dxa"/>
+            <w:tcW w:w="4594" w:type="dxa"/>
             <w:tcBorders/>
             <w:vAlign w:val="center"/>
           </w:tcPr>
@@ -3026,7 +3035,7 @@
         <w:trPr/>
         <w:tc>
           <w:tcPr>
-            <w:tcW w:w="3046" w:type="dxa"/>
+            <w:tcW w:w="4125" w:type="dxa"/>
             <w:tcBorders/>
             <w:vAlign w:val="center"/>
           </w:tcPr>
@@ -3053,7 +3062,7 @@
         </w:tc>
         <w:tc>
           <w:tcPr>
-            <w:tcW w:w="1351" w:type="dxa"/>
+            <w:tcW w:w="2620" w:type="dxa"/>
             <w:tcBorders/>
             <w:vAlign w:val="center"/>
           </w:tcPr>
@@ -3074,7 +3083,7 @@
         </w:tc>
         <w:tc>
           <w:tcPr>
-            <w:tcW w:w="1846" w:type="dxa"/>
+            <w:tcW w:w="4594" w:type="dxa"/>
             <w:tcBorders/>
             <w:vAlign w:val="center"/>
           </w:tcPr>
@@ -5098,9 +5107,9 @@
     </w:p>
     <w:tbl>
       <w:tblPr>
-        <w:tblW w:w="6243" w:type="dxa"/>
-        <w:jc w:val="left"/>
-        <w:tblInd w:w="0" w:type="dxa"/>
+        <w:tblW w:w="11339" w:type="dxa"/>
+        <w:jc w:val="left"/>
+        <w:tblInd w:w="28" w:type="dxa"/>
         <w:tblLayout w:type="fixed"/>
         <w:tblCellMar>
           <w:top w:w="28" w:type="dxa"/>
@@ -5110,8 +5119,8 @@
         </w:tblCellMar>
       </w:tblPr>
       <w:tblGrid>
-        <w:gridCol w:w="931"/>
-        <w:gridCol w:w="5312"/>
+        <w:gridCol w:w="945"/>
+        <w:gridCol w:w="10394"/>
       </w:tblGrid>
       <w:tr>
         <w:trPr>
@@ -5119,7 +5128,7 @@
         </w:trPr>
         <w:tc>
           <w:tcPr>
-            <w:tcW w:w="931" w:type="dxa"/>
+            <w:tcW w:w="945" w:type="dxa"/>
             <w:tcBorders/>
             <w:vAlign w:val="center"/>
           </w:tcPr>
@@ -5141,7 +5150,7 @@
         </w:tc>
         <w:tc>
           <w:tcPr>
-            <w:tcW w:w="5312" w:type="dxa"/>
+            <w:tcW w:w="10394" w:type="dxa"/>
             <w:tcBorders/>
             <w:vAlign w:val="center"/>
           </w:tcPr>
@@ -5166,7 +5175,7 @@
         <w:trPr/>
         <w:tc>
           <w:tcPr>
-            <w:tcW w:w="931" w:type="dxa"/>
+            <w:tcW w:w="945" w:type="dxa"/>
             <w:tcBorders/>
             <w:vAlign w:val="center"/>
           </w:tcPr>
@@ -5189,7 +5198,7 @@
         </w:tc>
         <w:tc>
           <w:tcPr>
-            <w:tcW w:w="5312" w:type="dxa"/>
+            <w:tcW w:w="10394" w:type="dxa"/>
             <w:tcBorders/>
             <w:vAlign w:val="center"/>
           </w:tcPr>
@@ -5213,7 +5222,7 @@
         <w:trPr/>
         <w:tc>
           <w:tcPr>
-            <w:tcW w:w="931" w:type="dxa"/>
+            <w:tcW w:w="945" w:type="dxa"/>
             <w:tcBorders/>
             <w:vAlign w:val="center"/>
           </w:tcPr>
@@ -5236,7 +5245,7 @@
         </w:tc>
         <w:tc>
           <w:tcPr>
-            <w:tcW w:w="5312" w:type="dxa"/>
+            <w:tcW w:w="10394" w:type="dxa"/>
             <w:tcBorders/>
             <w:vAlign w:val="center"/>
           </w:tcPr>
@@ -5270,7 +5279,7 @@
         <w:trPr/>
         <w:tc>
           <w:tcPr>
-            <w:tcW w:w="931" w:type="dxa"/>
+            <w:tcW w:w="945" w:type="dxa"/>
             <w:tcBorders/>
             <w:vAlign w:val="center"/>
           </w:tcPr>
@@ -5293,7 +5302,7 @@
         </w:tc>
         <w:tc>
           <w:tcPr>
-            <w:tcW w:w="5312" w:type="dxa"/>
+            <w:tcW w:w="10394" w:type="dxa"/>
             <w:tcBorders/>
             <w:vAlign w:val="center"/>
           </w:tcPr>
@@ -5317,7 +5326,7 @@
         <w:trPr/>
         <w:tc>
           <w:tcPr>
-            <w:tcW w:w="931" w:type="dxa"/>
+            <w:tcW w:w="945" w:type="dxa"/>
             <w:tcBorders/>
             <w:vAlign w:val="center"/>
           </w:tcPr>
@@ -5340,7 +5349,7 @@
         </w:tc>
         <w:tc>
           <w:tcPr>
-            <w:tcW w:w="5312" w:type="dxa"/>
+            <w:tcW w:w="10394" w:type="dxa"/>
             <w:tcBorders/>
             <w:vAlign w:val="center"/>
           </w:tcPr>
@@ -6545,7 +6554,7 @@
       <w:start w:val="1"/>
       <w:numFmt w:val="none"/>
       <w:suff w:val="nothing"/>
-      <w:lvlText w:val="%1"/>
+      <w:lvlText w:val=""/>
       <w:lvlJc w:val="left"/>
       <w:pPr>
         <w:tabs>
@@ -6556,10 +6565,37 @@
     </w:lvl>
     <w:lvl w:ilvl="1">
       <w:start w:val="1"/>
+      <w:numFmt w:val="none"/>
       <w:pStyle w:val="Heading2"/>
+      <w:suff w:val="nothing"/>
+      <w:lvlText w:val=""/>
+      <w:lvlJc w:val="left"/>
+      <w:pPr>
+        <w:tabs>
+          <w:tab w:val="num" w:pos="0"/>
+        </w:tabs>
+        <w:ind w:left="0" w:hanging="0"/>
+      </w:pPr>
+    </w:lvl>
+    <w:lvl w:ilvl="2">
+      <w:start w:val="1"/>
+      <w:numFmt w:val="none"/>
+      <w:pStyle w:val="Heading3"/>
+      <w:suff w:val="nothing"/>
+      <w:lvlText w:val=""/>
+      <w:lvlJc w:val="left"/>
+      <w:pPr>
+        <w:tabs>
+          <w:tab w:val="num" w:pos="0"/>
+        </w:tabs>
+        <w:ind w:left="0" w:hanging="0"/>
+      </w:pPr>
+    </w:lvl>
+    <w:lvl w:ilvl="3">
+      <w:start w:val="1"/>
       <w:numFmt w:val="none"/>
       <w:suff w:val="nothing"/>
-      <w:lvlText w:val="%2"/>
+      <w:lvlText w:val=""/>
       <w:lvlJc w:val="left"/>
       <w:pPr>
         <w:tabs>
@@ -6568,12 +6604,11 @@
         <w:ind w:left="0" w:hanging="0"/>
       </w:pPr>
     </w:lvl>
-    <w:lvl w:ilvl="2">
-      <w:start w:val="1"/>
-      <w:pStyle w:val="Heading3"/>
+    <w:lvl w:ilvl="4">
+      <w:start w:val="1"/>
       <w:numFmt w:val="none"/>
       <w:suff w:val="nothing"/>
-      <w:lvlText w:val="%3"/>
+      <w:lvlText w:val=""/>
       <w:lvlJc w:val="left"/>
       <w:pPr>
         <w:tabs>
@@ -6582,11 +6617,11 @@
         <w:ind w:left="0" w:hanging="0"/>
       </w:pPr>
     </w:lvl>
-    <w:lvl w:ilvl="3">
+    <w:lvl w:ilvl="5">
       <w:start w:val="1"/>
       <w:numFmt w:val="none"/>
       <w:suff w:val="nothing"/>
-      <w:lvlText w:val="%4"/>
+      <w:lvlText w:val=""/>
       <w:lvlJc w:val="left"/>
       <w:pPr>
         <w:tabs>
@@ -6595,11 +6630,11 @@
         <w:ind w:left="0" w:hanging="0"/>
       </w:pPr>
     </w:lvl>
-    <w:lvl w:ilvl="4">
+    <w:lvl w:ilvl="6">
       <w:start w:val="1"/>
       <w:numFmt w:val="none"/>
       <w:suff w:val="nothing"/>
-      <w:lvlText w:val="%5"/>
+      <w:lvlText w:val=""/>
       <w:lvlJc w:val="left"/>
       <w:pPr>
         <w:tabs>
@@ -6608,11 +6643,11 @@
         <w:ind w:left="0" w:hanging="0"/>
       </w:pPr>
     </w:lvl>
-    <w:lvl w:ilvl="5">
+    <w:lvl w:ilvl="7">
       <w:start w:val="1"/>
       <w:numFmt w:val="none"/>
       <w:suff w:val="nothing"/>
-      <w:lvlText w:val="%6"/>
+      <w:lvlText w:val=""/>
       <w:lvlJc w:val="left"/>
       <w:pPr>
         <w:tabs>
@@ -6621,37 +6656,11 @@
         <w:ind w:left="0" w:hanging="0"/>
       </w:pPr>
     </w:lvl>
-    <w:lvl w:ilvl="6">
+    <w:lvl w:ilvl="8">
       <w:start w:val="1"/>
       <w:numFmt w:val="none"/>
       <w:suff w:val="nothing"/>
-      <w:lvlText w:val="%7"/>
-      <w:lvlJc w:val="left"/>
-      <w:pPr>
-        <w:tabs>
-          <w:tab w:val="num" w:pos="0"/>
-        </w:tabs>
-        <w:ind w:left="0" w:hanging="0"/>
-      </w:pPr>
-    </w:lvl>
-    <w:lvl w:ilvl="7">
-      <w:start w:val="1"/>
-      <w:numFmt w:val="none"/>
-      <w:suff w:val="nothing"/>
-      <w:lvlText w:val="%8"/>
-      <w:lvlJc w:val="left"/>
-      <w:pPr>
-        <w:tabs>
-          <w:tab w:val="num" w:pos="0"/>
-        </w:tabs>
-        <w:ind w:left="0" w:hanging="0"/>
-      </w:pPr>
-    </w:lvl>
-    <w:lvl w:ilvl="8">
-      <w:start w:val="1"/>
-      <w:numFmt w:val="none"/>
-      <w:suff w:val="nothing"/>
-      <w:lvlText w:val="%9"/>
+      <w:lvlText w:val=""/>
       <w:lvlJc w:val="left"/>
       <w:pPr>
         <w:tabs>
@@ -6696,7 +6705,7 @@
   <w:docDefaults>
     <w:rPrDefault>
       <w:rPr>
-        <w:rFonts w:ascii="Liberation Serif" w:hAnsi="Liberation Serif" w:eastAsia="WenQuanYi Zen Hei" w:cs="FreeSans"/>
+        <w:rFonts w:ascii="Liberation Serif" w:hAnsi="Liberation Serif" w:eastAsia="Noto Serif CJK SC" w:cs="Noto Sans Devanagari"/>
         <w:sz w:val="24"/>
         <w:szCs w:val="24"/>
         <w:lang w:val="en-US" w:eastAsia="zh-CN" w:bidi="hi-IN"/>
@@ -6726,7 +6735,7 @@
     </w:rPr>
   </w:style>
   <w:style w:type="paragraph" w:styleId="Heading1">
-    <w:name w:val="Heading 1"/>
+    <w:name w:val="heading 1"/>
     <w:basedOn w:val="Heading"/>
     <w:next w:val="BodyText"/>
     <w:qFormat/>
@@ -6734,7 +6743,6 @@
       <w:spacing w:before="240" w:after="80"/>
     </w:pPr>
     <w:rPr>
-      <w:rFonts w:ascii="Noto Sans" w:hAnsi="Noto Sans"/>
       <w:b/>
       <w:bCs/>
       <w:color w:val="88C0D0"/>
@@ -6743,7 +6751,7 @@
     </w:rPr>
   </w:style>
   <w:style w:type="paragraph" w:styleId="Heading2">
-    <w:name w:val="Heading 2"/>
+    <w:name w:val="heading 2"/>
     <w:basedOn w:val="Heading"/>
     <w:next w:val="BodyText"/>
     <w:qFormat/>
@@ -6756,7 +6764,7 @@
       <w:outlineLvl w:val="1"/>
     </w:pPr>
     <w:rPr>
-      <w:rFonts w:ascii="Liberation Serif" w:hAnsi="Liberation Serif" w:eastAsia="WenQuanYi Zen Hei" w:cs="FreeSans"/>
+      <w:rFonts w:ascii="Liberation Serif" w:hAnsi="Liberation Serif" w:eastAsia="Noto Serif CJK SC" w:cs="Noto Sans Devanagari"/>
       <w:b/>
       <w:bCs/>
       <w:color w:val="88C0D0"/>
@@ -6765,7 +6773,7 @@
     </w:rPr>
   </w:style>
   <w:style w:type="paragraph" w:styleId="Heading3">
-    <w:name w:val="Heading 3"/>
+    <w:name w:val="heading 3"/>
     <w:basedOn w:val="Heading"/>
     <w:next w:val="BodyText"/>
     <w:qFormat/>
@@ -6775,12 +6783,24 @@
       <w:outlineLvl w:val="2"/>
     </w:pPr>
     <w:rPr>
-      <w:rFonts w:ascii="Liberation Serif" w:hAnsi="Liberation Serif" w:eastAsia="WenQuanYi Zen Hei" w:cs="FreeSans"/>
+      <w:rFonts w:ascii="Liberation Serif" w:hAnsi="Liberation Serif" w:eastAsia="Noto Serif CJK SC" w:cs="Noto Sans Devanagari"/>
       <w:b/>
       <w:bCs/>
       <w:color w:val="88C0D0"/>
       <w:sz w:val="26"/>
       <w:szCs w:val="26"/>
+    </w:rPr>
+  </w:style>
+  <w:style w:type="character" w:styleId="EndnoteReference">
+    <w:name w:val="endnote reference"/>
+    <w:rPr>
+      <w:vertAlign w:val="superscript"/>
+    </w:rPr>
+  </w:style>
+  <w:style w:type="character" w:styleId="FootnoteReference">
+    <w:name w:val="footnote reference"/>
+    <w:rPr>
+      <w:vertAlign w:val="superscript"/>
     </w:rPr>
   </w:style>
   <w:style w:type="character" w:styleId="EndnoteCharacters">
@@ -6852,7 +6872,7 @@
     </w:rPr>
   </w:style>
   <w:style w:type="paragraph" w:styleId="EnvelopeReturn">
-    <w:name w:val="Envelope Return"/>
+    <w:name w:val="envelope return"/>
     <w:basedOn w:val="Normal"/>
     <w:pPr/>
     <w:rPr>
@@ -6871,46 +6891,6 @@
       <w:color w:val="ECEFF4"/>
     </w:rPr>
   </w:style>
-  <w:style w:type="paragraph" w:styleId="Footer">
-    <w:name w:val="Footer"/>
-    <w:basedOn w:val="Normal"/>
-    <w:pPr>
-      <w:suppressLineNumbers/>
-      <w:tabs>
-        <w:tab w:val="clear" w:pos="1134"/>
-        <w:tab w:val="center" w:pos="5952" w:leader="none"/>
-        <w:tab w:val="right" w:pos="10771" w:leader="none"/>
-      </w:tabs>
-    </w:pPr>
-    <w:rPr/>
-  </w:style>
-  <w:style w:type="paragraph" w:styleId="Header">
-    <w:name w:val="Header"/>
-    <w:basedOn w:val="Normal"/>
-    <w:pPr>
-      <w:suppressLineNumbers/>
-      <w:tabs>
-        <w:tab w:val="clear" w:pos="1134"/>
-        <w:tab w:val="center" w:pos="5952" w:leader="none"/>
-        <w:tab w:val="right" w:pos="10771" w:leader="none"/>
-      </w:tabs>
-    </w:pPr>
-    <w:rPr/>
-  </w:style>
-  <w:style w:type="paragraph" w:styleId="HeaderandFooter">
-    <w:name w:val="Header and Footer"/>
-    <w:basedOn w:val="Normal"/>
-    <w:qFormat/>
-    <w:pPr>
-      <w:suppressLineNumbers/>
-      <w:tabs>
-        <w:tab w:val="clear" w:pos="1134"/>
-        <w:tab w:val="center" w:pos="5953" w:leader="none"/>
-        <w:tab w:val="right" w:pos="10772" w:leader="none"/>
-      </w:tabs>
-    </w:pPr>
-    <w:rPr/>
-  </w:style>
   <w:style w:type="paragraph" w:styleId="Index">
     <w:name w:val="Index"/>
     <w:basedOn w:val="Normal"/>
@@ -6919,11 +6899,11 @@
       <w:suppressLineNumbers/>
     </w:pPr>
     <w:rPr>
-      <w:rFonts w:cs="FreeSans"/>
+      <w:rFonts w:cs="Noto Sans Devanagari"/>
     </w:rPr>
   </w:style>
   <w:style w:type="paragraph" w:styleId="Caption">
-    <w:name w:val="Caption"/>
+    <w:name w:val="caption"/>
     <w:basedOn w:val="Normal"/>
     <w:qFormat/>
     <w:pPr>
@@ -6931,7 +6911,7 @@
       <w:spacing w:before="120" w:after="120"/>
     </w:pPr>
     <w:rPr>
-      <w:rFonts w:cs="FreeSans"/>
+      <w:rFonts w:cs="Noto Sans Devanagari"/>
       <w:i/>
       <w:iCs/>
       <w:sz w:val="24"/>
@@ -6943,7 +6923,7 @@
     <w:basedOn w:val="BodyText"/>
     <w:pPr/>
     <w:rPr>
-      <w:rFonts w:cs="FreeSans"/>
+      <w:rFonts w:cs="Noto Sans Devanagari"/>
     </w:rPr>
   </w:style>
   <w:style w:type="paragraph" w:styleId="BodyText">
@@ -6985,7 +6965,7 @@
       <w:ind w:left="160" w:right="160"/>
     </w:pPr>
     <w:rPr>
-      <w:rFonts w:ascii="Liberation Mono" w:hAnsi="Liberation Mono" w:eastAsia="Liberation Mono" w:cs="Liberation Mono"/>
+      <w:rFonts w:ascii="Liberation Mono" w:hAnsi="Liberation Mono" w:eastAsia="Noto Sans Mono CJK SC" w:cs="Liberation Mono"/>
       <w:sz w:val="20"/>
       <w:szCs w:val="20"/>
     </w:rPr>
@@ -7026,37 +7006,37 @@
         <a:srgbClr val="000000"/>
       </a:dk1>
       <a:lt1>
-        <a:srgbClr val="ffffff"/>
+        <a:srgbClr val="FFFFFF"/>
       </a:lt1>
       <a:dk2>
         <a:srgbClr val="000000"/>
       </a:dk2>
       <a:lt2>
-        <a:srgbClr val="ffffff"/>
+        <a:srgbClr val="FFFFFF"/>
       </a:lt2>
       <a:accent1>
-        <a:srgbClr val="18a303"/>
+        <a:srgbClr val="18A303"/>
       </a:accent1>
       <a:accent2>
-        <a:srgbClr val="0369a3"/>
+        <a:srgbClr val="0369A3"/>
       </a:accent2>
       <a:accent3>
-        <a:srgbClr val="a33e03"/>
+        <a:srgbClr val="A33E03"/>
       </a:accent3>
       <a:accent4>
-        <a:srgbClr val="8e03a3"/>
+        <a:srgbClr val="8E03A3"/>
       </a:accent4>
       <a:accent5>
-        <a:srgbClr val="c99c00"/>
+        <a:srgbClr val="C99C00"/>
       </a:accent5>
       <a:accent6>
-        <a:srgbClr val="c9211e"/>
+        <a:srgbClr val="C9211E"/>
       </a:accent6>
       <a:hlink>
-        <a:srgbClr val="0000ee"/>
+        <a:srgbClr val="0000EE"/>
       </a:hlink>
       <a:folHlink>
-        <a:srgbClr val="551a8b"/>
+        <a:srgbClr val="551A8B"/>
       </a:folHlink>
     </a:clrScheme>
     <a:fontScheme name="Office">

</xml_diff>

<commit_message>
L-0710 feature half: /crew:done check 2 needs the verify gate settled for HEAD
done.md check 2 passes on the CI receipt VERIFIED (or NO_GATE), or on a
record where every rule reads pass with the verified marker at HEAD. A
chronic rule (deferred to CI), a 0-rules-ran turn, or a marker behind HEAD
refuses. verify.md names the 'deferred to CI' and '0 rules ran' lines;
verify-gate.yml's header names it the CI home for over-budget rules.
Docs: README, CONFIG s19, PLUGINS.md, daily-workflow and troubleshooting
guides (rebuilt), crew code map, CHANGELOG.
</commit_message>
<xml_diff>
--- a/docs/guides/crew/crew-daily-workflow.docx
+++ b/docs/guides/crew/crew-daily-workflow.docx
@@ -1,6 +1,6 @@
 
 <file path=word/document.xml><?xml version="1.0" encoding="utf-8"?>
-<w:document xmlns:o="urn:schemas-microsoft-com:office:office" xmlns:r="http://schemas.openxmlformats.org/officeDocument/2006/relationships" xmlns:v="urn:schemas-microsoft-com:vml" xmlns:w="http://schemas.openxmlformats.org/wordprocessingml/2006/main" xmlns:w10="urn:schemas-microsoft-com:office:word" xmlns:wp="http://schemas.openxmlformats.org/drawingml/2006/wordprocessingDrawing" xmlns:wps="http://schemas.microsoft.com/office/word/2010/wordprocessingShape" xmlns:wpg="http://schemas.microsoft.com/office/word/2010/wordprocessingGroup" xmlns:mc="http://schemas.openxmlformats.org/markup-compatibility/2006" xmlns:wp14="http://schemas.microsoft.com/office/word/2010/wordprocessingDrawing" xmlns:w14="http://schemas.microsoft.com/office/word/2010/wordml" xmlns:w15="http://schemas.microsoft.com/office/word/2012/wordml" mc:Ignorable="w14 wp14 w15">
+<w:document xmlns:o="urn:schemas-microsoft-com:office:office" xmlns:r="http://schemas.openxmlformats.org/officeDocument/2006/relationships" xmlns:v="urn:schemas-microsoft-com:vml" xmlns:w="http://schemas.openxmlformats.org/wordprocessingml/2006/main" xmlns:w10="urn:schemas-microsoft-com:office:word" xmlns:wp="http://schemas.openxmlformats.org/drawingml/2006/wordprocessingDrawing" xmlns:pic="http://schemas.openxmlformats.org/drawingml/2006/picture" xmlns:wps="http://schemas.microsoft.com/office/word/2010/wordprocessingShape" xmlns:wpg="http://schemas.microsoft.com/office/word/2010/wordprocessingGroup" xmlns:mc="http://schemas.openxmlformats.org/markup-compatibility/2006" xmlns:wp14="http://schemas.microsoft.com/office/word/2010/wordprocessingDrawing" xmlns:w14="http://schemas.microsoft.com/office/word/2010/wordml" xmlns:w15="http://schemas.microsoft.com/office/word/2012/wordml" mc:Ignorable="w14 wp14 w15">
   <w:body>
     <w:p>
       <w:pPr>
@@ -57,7 +57,17 @@
       </w:r>
       <w:r>
         <w:rPr/>
-        <w:t xml:space="preserve"> refuses without a clean review receipt, a clean verify gate, and a passing completion audit.</w:t>
+        <w:t xml:space="preserve"> refuses without a clean review receipt, a verify gate settled for HEAD, and a passing completion audit. Settled means every rule passed here, or the </w:t>
+      </w:r>
+      <w:r>
+        <w:rPr>
+          <w:rStyle w:val="SourceText"/>
+        </w:rPr>
+        <w:t>verify-gate</w:t>
+      </w:r>
+      <w:r>
+        <w:rPr/>
+        <w:t xml:space="preserve"> CI receipt for HEAD is VERIFIED: a rule too big for the Stop budget is deferred to CI, and a Stop turn where 0 rules ran proves nothing.</w:t>
       </w:r>
     </w:p>
     <w:p>
@@ -77,7 +87,6 @@
             <w:rStyle w:val="Hyperlink"/>
             <w:rFonts w:ascii="Consolas;Courier New;monospace" w:hAnsi="Consolas;Courier New;monospace" w:eastAsia="Consolas;Courier New;monospace" w:cs="Consolas;Courier New;monospace"/>
             <w:sz w:val="19"/>
-            <w:sz w:val="19"/>
             <w:szCs w:val="19"/>
           </w:rPr>
           <w:t>daily-workflow-scope.md</w:t>
@@ -1110,9 +1119,9 @@
     </w:p>
     <w:tbl>
       <w:tblPr>
-        <w:tblW w:w="6243" w:type="dxa"/>
-        <w:jc w:val="left"/>
-        <w:tblInd w:w="0" w:type="dxa"/>
+        <w:tblW w:w="11339" w:type="dxa"/>
+        <w:jc w:val="left"/>
+        <w:tblInd w:w="28" w:type="dxa"/>
         <w:tblLayout w:type="fixed"/>
         <w:tblCellMar>
           <w:top w:w="28" w:type="dxa"/>
@@ -1122,9 +1131,9 @@
         </w:tblCellMar>
       </w:tblPr>
       <w:tblGrid>
-        <w:gridCol w:w="1171"/>
-        <w:gridCol w:w="2290"/>
-        <w:gridCol w:w="2782"/>
+        <w:gridCol w:w="1429"/>
+        <w:gridCol w:w="3770"/>
+        <w:gridCol w:w="6140"/>
       </w:tblGrid>
       <w:tr>
         <w:trPr>
@@ -1132,7 +1141,7 @@
         </w:trPr>
         <w:tc>
           <w:tcPr>
-            <w:tcW w:w="1171" w:type="dxa"/>
+            <w:tcW w:w="1429" w:type="dxa"/>
             <w:tcBorders/>
             <w:vAlign w:val="center"/>
           </w:tcPr>
@@ -1154,7 +1163,7 @@
         </w:tc>
         <w:tc>
           <w:tcPr>
-            <w:tcW w:w="2290" w:type="dxa"/>
+            <w:tcW w:w="3770" w:type="dxa"/>
             <w:tcBorders/>
             <w:vAlign w:val="center"/>
           </w:tcPr>
@@ -1176,7 +1185,7 @@
         </w:tc>
         <w:tc>
           <w:tcPr>
-            <w:tcW w:w="2782" w:type="dxa"/>
+            <w:tcW w:w="6140" w:type="dxa"/>
             <w:tcBorders/>
             <w:vAlign w:val="center"/>
           </w:tcPr>
@@ -1201,7 +1210,7 @@
         <w:trPr/>
         <w:tc>
           <w:tcPr>
-            <w:tcW w:w="1171" w:type="dxa"/>
+            <w:tcW w:w="1429" w:type="dxa"/>
             <w:tcBorders/>
             <w:vAlign w:val="center"/>
           </w:tcPr>
@@ -1222,7 +1231,7 @@
         </w:tc>
         <w:tc>
           <w:tcPr>
-            <w:tcW w:w="2290" w:type="dxa"/>
+            <w:tcW w:w="3770" w:type="dxa"/>
             <w:tcBorders/>
             <w:vAlign w:val="center"/>
           </w:tcPr>
@@ -1253,7 +1262,7 @@
         </w:tc>
         <w:tc>
           <w:tcPr>
-            <w:tcW w:w="2782" w:type="dxa"/>
+            <w:tcW w:w="6140" w:type="dxa"/>
             <w:tcBorders/>
             <w:vAlign w:val="center"/>
           </w:tcPr>
@@ -1277,7 +1286,7 @@
         <w:trPr/>
         <w:tc>
           <w:tcPr>
-            <w:tcW w:w="1171" w:type="dxa"/>
+            <w:tcW w:w="1429" w:type="dxa"/>
             <w:tcBorders/>
             <w:vAlign w:val="center"/>
           </w:tcPr>
@@ -1298,7 +1307,7 @@
         </w:tc>
         <w:tc>
           <w:tcPr>
-            <w:tcW w:w="2290" w:type="dxa"/>
+            <w:tcW w:w="3770" w:type="dxa"/>
             <w:tcBorders/>
             <w:vAlign w:val="center"/>
           </w:tcPr>
@@ -1329,7 +1338,7 @@
         </w:tc>
         <w:tc>
           <w:tcPr>
-            <w:tcW w:w="2782" w:type="dxa"/>
+            <w:tcW w:w="6140" w:type="dxa"/>
             <w:tcBorders/>
             <w:vAlign w:val="center"/>
           </w:tcPr>
@@ -1353,7 +1362,7 @@
         <w:trPr/>
         <w:tc>
           <w:tcPr>
-            <w:tcW w:w="1171" w:type="dxa"/>
+            <w:tcW w:w="1429" w:type="dxa"/>
             <w:tcBorders/>
             <w:vAlign w:val="center"/>
           </w:tcPr>
@@ -1374,7 +1383,7 @@
         </w:tc>
         <w:tc>
           <w:tcPr>
-            <w:tcW w:w="2290" w:type="dxa"/>
+            <w:tcW w:w="3770" w:type="dxa"/>
             <w:tcBorders/>
             <w:vAlign w:val="center"/>
           </w:tcPr>
@@ -1405,7 +1414,7 @@
         </w:tc>
         <w:tc>
           <w:tcPr>
-            <w:tcW w:w="2782" w:type="dxa"/>
+            <w:tcW w:w="6140" w:type="dxa"/>
             <w:tcBorders/>
             <w:vAlign w:val="center"/>
           </w:tcPr>
@@ -1429,7 +1438,7 @@
         <w:trPr/>
         <w:tc>
           <w:tcPr>
-            <w:tcW w:w="1171" w:type="dxa"/>
+            <w:tcW w:w="1429" w:type="dxa"/>
             <w:tcBorders/>
             <w:vAlign w:val="center"/>
           </w:tcPr>
@@ -1450,7 +1459,7 @@
         </w:tc>
         <w:tc>
           <w:tcPr>
-            <w:tcW w:w="2290" w:type="dxa"/>
+            <w:tcW w:w="3770" w:type="dxa"/>
             <w:tcBorders/>
             <w:vAlign w:val="center"/>
           </w:tcPr>
@@ -1471,7 +1480,7 @@
         </w:tc>
         <w:tc>
           <w:tcPr>
-            <w:tcW w:w="2782" w:type="dxa"/>
+            <w:tcW w:w="6140" w:type="dxa"/>
             <w:tcBorders/>
             <w:vAlign w:val="center"/>
           </w:tcPr>
@@ -2495,9 +2504,9 @@
     </w:p>
     <w:tbl>
       <w:tblPr>
-        <w:tblW w:w="6243" w:type="dxa"/>
-        <w:jc w:val="left"/>
-        <w:tblInd w:w="0" w:type="dxa"/>
+        <w:tblW w:w="11339" w:type="dxa"/>
+        <w:jc w:val="left"/>
+        <w:tblInd w:w="28" w:type="dxa"/>
         <w:tblLayout w:type="fixed"/>
         <w:tblCellMar>
           <w:top w:w="28" w:type="dxa"/>
@@ -2507,9 +2516,9 @@
         </w:tblCellMar>
       </w:tblPr>
       <w:tblGrid>
-        <w:gridCol w:w="3046"/>
-        <w:gridCol w:w="1351"/>
-        <w:gridCol w:w="1846"/>
+        <w:gridCol w:w="4125"/>
+        <w:gridCol w:w="2620"/>
+        <w:gridCol w:w="4594"/>
       </w:tblGrid>
       <w:tr>
         <w:trPr>
@@ -2517,7 +2526,7 @@
         </w:trPr>
         <w:tc>
           <w:tcPr>
-            <w:tcW w:w="3046" w:type="dxa"/>
+            <w:tcW w:w="4125" w:type="dxa"/>
             <w:tcBorders/>
             <w:vAlign w:val="center"/>
           </w:tcPr>
@@ -2539,7 +2548,7 @@
         </w:tc>
         <w:tc>
           <w:tcPr>
-            <w:tcW w:w="1351" w:type="dxa"/>
+            <w:tcW w:w="2620" w:type="dxa"/>
             <w:tcBorders/>
             <w:vAlign w:val="center"/>
           </w:tcPr>
@@ -2561,7 +2570,7 @@
         </w:tc>
         <w:tc>
           <w:tcPr>
-            <w:tcW w:w="1846" w:type="dxa"/>
+            <w:tcW w:w="4594" w:type="dxa"/>
             <w:tcBorders/>
             <w:vAlign w:val="center"/>
           </w:tcPr>
@@ -2586,7 +2595,7 @@
         <w:trPr/>
         <w:tc>
           <w:tcPr>
-            <w:tcW w:w="3046" w:type="dxa"/>
+            <w:tcW w:w="4125" w:type="dxa"/>
             <w:tcBorders/>
             <w:vAlign w:val="center"/>
           </w:tcPr>
@@ -2613,7 +2622,7 @@
         </w:tc>
         <w:tc>
           <w:tcPr>
-            <w:tcW w:w="1351" w:type="dxa"/>
+            <w:tcW w:w="2620" w:type="dxa"/>
             <w:tcBorders/>
             <w:vAlign w:val="center"/>
           </w:tcPr>
@@ -2644,7 +2653,7 @@
         </w:tc>
         <w:tc>
           <w:tcPr>
-            <w:tcW w:w="1846" w:type="dxa"/>
+            <w:tcW w:w="4594" w:type="dxa"/>
             <w:tcBorders/>
             <w:vAlign w:val="center"/>
           </w:tcPr>
@@ -2680,7 +2689,7 @@
         <w:trPr/>
         <w:tc>
           <w:tcPr>
-            <w:tcW w:w="3046" w:type="dxa"/>
+            <w:tcW w:w="4125" w:type="dxa"/>
             <w:tcBorders/>
             <w:vAlign w:val="center"/>
           </w:tcPr>
@@ -2701,7 +2710,7 @@
         </w:tc>
         <w:tc>
           <w:tcPr>
-            <w:tcW w:w="1351" w:type="dxa"/>
+            <w:tcW w:w="2620" w:type="dxa"/>
             <w:tcBorders/>
             <w:vAlign w:val="center"/>
           </w:tcPr>
@@ -2722,7 +2731,7 @@
         </w:tc>
         <w:tc>
           <w:tcPr>
-            <w:tcW w:w="1846" w:type="dxa"/>
+            <w:tcW w:w="4594" w:type="dxa"/>
             <w:tcBorders/>
             <w:vAlign w:val="center"/>
           </w:tcPr>
@@ -2756,7 +2765,7 @@
         <w:trPr/>
         <w:tc>
           <w:tcPr>
-            <w:tcW w:w="3046" w:type="dxa"/>
+            <w:tcW w:w="4125" w:type="dxa"/>
             <w:tcBorders/>
             <w:vAlign w:val="center"/>
           </w:tcPr>
@@ -2789,7 +2798,7 @@
         </w:tc>
         <w:tc>
           <w:tcPr>
-            <w:tcW w:w="1351" w:type="dxa"/>
+            <w:tcW w:w="2620" w:type="dxa"/>
             <w:tcBorders/>
             <w:vAlign w:val="center"/>
           </w:tcPr>
@@ -2810,7 +2819,7 @@
         </w:tc>
         <w:tc>
           <w:tcPr>
-            <w:tcW w:w="1846" w:type="dxa"/>
+            <w:tcW w:w="4594" w:type="dxa"/>
             <w:tcBorders/>
             <w:vAlign w:val="center"/>
           </w:tcPr>
@@ -2854,7 +2863,7 @@
         <w:trPr/>
         <w:tc>
           <w:tcPr>
-            <w:tcW w:w="3046" w:type="dxa"/>
+            <w:tcW w:w="4125" w:type="dxa"/>
             <w:tcBorders/>
             <w:vAlign w:val="center"/>
           </w:tcPr>
@@ -2887,7 +2896,7 @@
         </w:tc>
         <w:tc>
           <w:tcPr>
-            <w:tcW w:w="1351" w:type="dxa"/>
+            <w:tcW w:w="2620" w:type="dxa"/>
             <w:tcBorders/>
             <w:vAlign w:val="center"/>
           </w:tcPr>
@@ -2908,7 +2917,7 @@
         </w:tc>
         <w:tc>
           <w:tcPr>
-            <w:tcW w:w="1846" w:type="dxa"/>
+            <w:tcW w:w="4594" w:type="dxa"/>
             <w:tcBorders/>
             <w:vAlign w:val="center"/>
           </w:tcPr>
@@ -2938,7 +2947,7 @@
         <w:trPr/>
         <w:tc>
           <w:tcPr>
-            <w:tcW w:w="3046" w:type="dxa"/>
+            <w:tcW w:w="4125" w:type="dxa"/>
             <w:tcBorders/>
             <w:vAlign w:val="center"/>
           </w:tcPr>
@@ -2981,7 +2990,7 @@
         </w:tc>
         <w:tc>
           <w:tcPr>
-            <w:tcW w:w="1351" w:type="dxa"/>
+            <w:tcW w:w="2620" w:type="dxa"/>
             <w:tcBorders/>
             <w:vAlign w:val="center"/>
           </w:tcPr>
@@ -3002,7 +3011,7 @@
         </w:tc>
         <w:tc>
           <w:tcPr>
-            <w:tcW w:w="1846" w:type="dxa"/>
+            <w:tcW w:w="4594" w:type="dxa"/>
             <w:tcBorders/>
             <w:vAlign w:val="center"/>
           </w:tcPr>
@@ -3026,7 +3035,7 @@
         <w:trPr/>
         <w:tc>
           <w:tcPr>
-            <w:tcW w:w="3046" w:type="dxa"/>
+            <w:tcW w:w="4125" w:type="dxa"/>
             <w:tcBorders/>
             <w:vAlign w:val="center"/>
           </w:tcPr>
@@ -3053,7 +3062,7 @@
         </w:tc>
         <w:tc>
           <w:tcPr>
-            <w:tcW w:w="1351" w:type="dxa"/>
+            <w:tcW w:w="2620" w:type="dxa"/>
             <w:tcBorders/>
             <w:vAlign w:val="center"/>
           </w:tcPr>
@@ -3074,7 +3083,7 @@
         </w:tc>
         <w:tc>
           <w:tcPr>
-            <w:tcW w:w="1846" w:type="dxa"/>
+            <w:tcW w:w="4594" w:type="dxa"/>
             <w:tcBorders/>
             <w:vAlign w:val="center"/>
           </w:tcPr>
@@ -5098,9 +5107,9 @@
     </w:p>
     <w:tbl>
       <w:tblPr>
-        <w:tblW w:w="6243" w:type="dxa"/>
-        <w:jc w:val="left"/>
-        <w:tblInd w:w="0" w:type="dxa"/>
+        <w:tblW w:w="11339" w:type="dxa"/>
+        <w:jc w:val="left"/>
+        <w:tblInd w:w="28" w:type="dxa"/>
         <w:tblLayout w:type="fixed"/>
         <w:tblCellMar>
           <w:top w:w="28" w:type="dxa"/>
@@ -5110,8 +5119,8 @@
         </w:tblCellMar>
       </w:tblPr>
       <w:tblGrid>
-        <w:gridCol w:w="931"/>
-        <w:gridCol w:w="5312"/>
+        <w:gridCol w:w="945"/>
+        <w:gridCol w:w="10394"/>
       </w:tblGrid>
       <w:tr>
         <w:trPr>
@@ -5119,7 +5128,7 @@
         </w:trPr>
         <w:tc>
           <w:tcPr>
-            <w:tcW w:w="931" w:type="dxa"/>
+            <w:tcW w:w="945" w:type="dxa"/>
             <w:tcBorders/>
             <w:vAlign w:val="center"/>
           </w:tcPr>
@@ -5141,7 +5150,7 @@
         </w:tc>
         <w:tc>
           <w:tcPr>
-            <w:tcW w:w="5312" w:type="dxa"/>
+            <w:tcW w:w="10394" w:type="dxa"/>
             <w:tcBorders/>
             <w:vAlign w:val="center"/>
           </w:tcPr>
@@ -5166,7 +5175,7 @@
         <w:trPr/>
         <w:tc>
           <w:tcPr>
-            <w:tcW w:w="931" w:type="dxa"/>
+            <w:tcW w:w="945" w:type="dxa"/>
             <w:tcBorders/>
             <w:vAlign w:val="center"/>
           </w:tcPr>
@@ -5189,7 +5198,7 @@
         </w:tc>
         <w:tc>
           <w:tcPr>
-            <w:tcW w:w="5312" w:type="dxa"/>
+            <w:tcW w:w="10394" w:type="dxa"/>
             <w:tcBorders/>
             <w:vAlign w:val="center"/>
           </w:tcPr>
@@ -5213,7 +5222,7 @@
         <w:trPr/>
         <w:tc>
           <w:tcPr>
-            <w:tcW w:w="931" w:type="dxa"/>
+            <w:tcW w:w="945" w:type="dxa"/>
             <w:tcBorders/>
             <w:vAlign w:val="center"/>
           </w:tcPr>
@@ -5236,7 +5245,7 @@
         </w:tc>
         <w:tc>
           <w:tcPr>
-            <w:tcW w:w="5312" w:type="dxa"/>
+            <w:tcW w:w="10394" w:type="dxa"/>
             <w:tcBorders/>
             <w:vAlign w:val="center"/>
           </w:tcPr>
@@ -5270,7 +5279,7 @@
         <w:trPr/>
         <w:tc>
           <w:tcPr>
-            <w:tcW w:w="931" w:type="dxa"/>
+            <w:tcW w:w="945" w:type="dxa"/>
             <w:tcBorders/>
             <w:vAlign w:val="center"/>
           </w:tcPr>
@@ -5293,7 +5302,7 @@
         </w:tc>
         <w:tc>
           <w:tcPr>
-            <w:tcW w:w="5312" w:type="dxa"/>
+            <w:tcW w:w="10394" w:type="dxa"/>
             <w:tcBorders/>
             <w:vAlign w:val="center"/>
           </w:tcPr>
@@ -5317,7 +5326,7 @@
         <w:trPr/>
         <w:tc>
           <w:tcPr>
-            <w:tcW w:w="931" w:type="dxa"/>
+            <w:tcW w:w="945" w:type="dxa"/>
             <w:tcBorders/>
             <w:vAlign w:val="center"/>
           </w:tcPr>
@@ -5340,7 +5349,7 @@
         </w:tc>
         <w:tc>
           <w:tcPr>
-            <w:tcW w:w="5312" w:type="dxa"/>
+            <w:tcW w:w="10394" w:type="dxa"/>
             <w:tcBorders/>
             <w:vAlign w:val="center"/>
           </w:tcPr>
@@ -6545,7 +6554,7 @@
       <w:start w:val="1"/>
       <w:numFmt w:val="none"/>
       <w:suff w:val="nothing"/>
-      <w:lvlText w:val="%1"/>
+      <w:lvlText w:val=""/>
       <w:lvlJc w:val="left"/>
       <w:pPr>
         <w:tabs>
@@ -6556,10 +6565,37 @@
     </w:lvl>
     <w:lvl w:ilvl="1">
       <w:start w:val="1"/>
+      <w:numFmt w:val="none"/>
       <w:pStyle w:val="Heading2"/>
+      <w:suff w:val="nothing"/>
+      <w:lvlText w:val=""/>
+      <w:lvlJc w:val="left"/>
+      <w:pPr>
+        <w:tabs>
+          <w:tab w:val="num" w:pos="0"/>
+        </w:tabs>
+        <w:ind w:left="0" w:hanging="0"/>
+      </w:pPr>
+    </w:lvl>
+    <w:lvl w:ilvl="2">
+      <w:start w:val="1"/>
+      <w:numFmt w:val="none"/>
+      <w:pStyle w:val="Heading3"/>
+      <w:suff w:val="nothing"/>
+      <w:lvlText w:val=""/>
+      <w:lvlJc w:val="left"/>
+      <w:pPr>
+        <w:tabs>
+          <w:tab w:val="num" w:pos="0"/>
+        </w:tabs>
+        <w:ind w:left="0" w:hanging="0"/>
+      </w:pPr>
+    </w:lvl>
+    <w:lvl w:ilvl="3">
+      <w:start w:val="1"/>
       <w:numFmt w:val="none"/>
       <w:suff w:val="nothing"/>
-      <w:lvlText w:val="%2"/>
+      <w:lvlText w:val=""/>
       <w:lvlJc w:val="left"/>
       <w:pPr>
         <w:tabs>
@@ -6568,12 +6604,11 @@
         <w:ind w:left="0" w:hanging="0"/>
       </w:pPr>
     </w:lvl>
-    <w:lvl w:ilvl="2">
-      <w:start w:val="1"/>
-      <w:pStyle w:val="Heading3"/>
+    <w:lvl w:ilvl="4">
+      <w:start w:val="1"/>
       <w:numFmt w:val="none"/>
       <w:suff w:val="nothing"/>
-      <w:lvlText w:val="%3"/>
+      <w:lvlText w:val=""/>
       <w:lvlJc w:val="left"/>
       <w:pPr>
         <w:tabs>
@@ -6582,11 +6617,11 @@
         <w:ind w:left="0" w:hanging="0"/>
       </w:pPr>
     </w:lvl>
-    <w:lvl w:ilvl="3">
+    <w:lvl w:ilvl="5">
       <w:start w:val="1"/>
       <w:numFmt w:val="none"/>
       <w:suff w:val="nothing"/>
-      <w:lvlText w:val="%4"/>
+      <w:lvlText w:val=""/>
       <w:lvlJc w:val="left"/>
       <w:pPr>
         <w:tabs>
@@ -6595,11 +6630,11 @@
         <w:ind w:left="0" w:hanging="0"/>
       </w:pPr>
     </w:lvl>
-    <w:lvl w:ilvl="4">
+    <w:lvl w:ilvl="6">
       <w:start w:val="1"/>
       <w:numFmt w:val="none"/>
       <w:suff w:val="nothing"/>
-      <w:lvlText w:val="%5"/>
+      <w:lvlText w:val=""/>
       <w:lvlJc w:val="left"/>
       <w:pPr>
         <w:tabs>
@@ -6608,11 +6643,11 @@
         <w:ind w:left="0" w:hanging="0"/>
       </w:pPr>
     </w:lvl>
-    <w:lvl w:ilvl="5">
+    <w:lvl w:ilvl="7">
       <w:start w:val="1"/>
       <w:numFmt w:val="none"/>
       <w:suff w:val="nothing"/>
-      <w:lvlText w:val="%6"/>
+      <w:lvlText w:val=""/>
       <w:lvlJc w:val="left"/>
       <w:pPr>
         <w:tabs>
@@ -6621,37 +6656,11 @@
         <w:ind w:left="0" w:hanging="0"/>
       </w:pPr>
     </w:lvl>
-    <w:lvl w:ilvl="6">
+    <w:lvl w:ilvl="8">
       <w:start w:val="1"/>
       <w:numFmt w:val="none"/>
       <w:suff w:val="nothing"/>
-      <w:lvlText w:val="%7"/>
-      <w:lvlJc w:val="left"/>
-      <w:pPr>
-        <w:tabs>
-          <w:tab w:val="num" w:pos="0"/>
-        </w:tabs>
-        <w:ind w:left="0" w:hanging="0"/>
-      </w:pPr>
-    </w:lvl>
-    <w:lvl w:ilvl="7">
-      <w:start w:val="1"/>
-      <w:numFmt w:val="none"/>
-      <w:suff w:val="nothing"/>
-      <w:lvlText w:val="%8"/>
-      <w:lvlJc w:val="left"/>
-      <w:pPr>
-        <w:tabs>
-          <w:tab w:val="num" w:pos="0"/>
-        </w:tabs>
-        <w:ind w:left="0" w:hanging="0"/>
-      </w:pPr>
-    </w:lvl>
-    <w:lvl w:ilvl="8">
-      <w:start w:val="1"/>
-      <w:numFmt w:val="none"/>
-      <w:suff w:val="nothing"/>
-      <w:lvlText w:val="%9"/>
+      <w:lvlText w:val=""/>
       <w:lvlJc w:val="left"/>
       <w:pPr>
         <w:tabs>
@@ -6696,7 +6705,7 @@
   <w:docDefaults>
     <w:rPrDefault>
       <w:rPr>
-        <w:rFonts w:ascii="Liberation Serif" w:hAnsi="Liberation Serif" w:eastAsia="WenQuanYi Zen Hei" w:cs="FreeSans"/>
+        <w:rFonts w:ascii="Liberation Serif" w:hAnsi="Liberation Serif" w:eastAsia="Noto Serif CJK SC" w:cs="Noto Sans Devanagari"/>
         <w:sz w:val="24"/>
         <w:szCs w:val="24"/>
         <w:lang w:val="en-US" w:eastAsia="zh-CN" w:bidi="hi-IN"/>
@@ -6726,7 +6735,7 @@
     </w:rPr>
   </w:style>
   <w:style w:type="paragraph" w:styleId="Heading1">
-    <w:name w:val="Heading 1"/>
+    <w:name w:val="heading 1"/>
     <w:basedOn w:val="Heading"/>
     <w:next w:val="BodyText"/>
     <w:qFormat/>
@@ -6734,7 +6743,6 @@
       <w:spacing w:before="240" w:after="80"/>
     </w:pPr>
     <w:rPr>
-      <w:rFonts w:ascii="Noto Sans" w:hAnsi="Noto Sans"/>
       <w:b/>
       <w:bCs/>
       <w:color w:val="88C0D0"/>
@@ -6743,7 +6751,7 @@
     </w:rPr>
   </w:style>
   <w:style w:type="paragraph" w:styleId="Heading2">
-    <w:name w:val="Heading 2"/>
+    <w:name w:val="heading 2"/>
     <w:basedOn w:val="Heading"/>
     <w:next w:val="BodyText"/>
     <w:qFormat/>
@@ -6756,7 +6764,7 @@
       <w:outlineLvl w:val="1"/>
     </w:pPr>
     <w:rPr>
-      <w:rFonts w:ascii="Liberation Serif" w:hAnsi="Liberation Serif" w:eastAsia="WenQuanYi Zen Hei" w:cs="FreeSans"/>
+      <w:rFonts w:ascii="Liberation Serif" w:hAnsi="Liberation Serif" w:eastAsia="Noto Serif CJK SC" w:cs="Noto Sans Devanagari"/>
       <w:b/>
       <w:bCs/>
       <w:color w:val="88C0D0"/>
@@ -6765,7 +6773,7 @@
     </w:rPr>
   </w:style>
   <w:style w:type="paragraph" w:styleId="Heading3">
-    <w:name w:val="Heading 3"/>
+    <w:name w:val="heading 3"/>
     <w:basedOn w:val="Heading"/>
     <w:next w:val="BodyText"/>
     <w:qFormat/>
@@ -6775,12 +6783,24 @@
       <w:outlineLvl w:val="2"/>
     </w:pPr>
     <w:rPr>
-      <w:rFonts w:ascii="Liberation Serif" w:hAnsi="Liberation Serif" w:eastAsia="WenQuanYi Zen Hei" w:cs="FreeSans"/>
+      <w:rFonts w:ascii="Liberation Serif" w:hAnsi="Liberation Serif" w:eastAsia="Noto Serif CJK SC" w:cs="Noto Sans Devanagari"/>
       <w:b/>
       <w:bCs/>
       <w:color w:val="88C0D0"/>
       <w:sz w:val="26"/>
       <w:szCs w:val="26"/>
+    </w:rPr>
+  </w:style>
+  <w:style w:type="character" w:styleId="EndnoteReference">
+    <w:name w:val="endnote reference"/>
+    <w:rPr>
+      <w:vertAlign w:val="superscript"/>
+    </w:rPr>
+  </w:style>
+  <w:style w:type="character" w:styleId="FootnoteReference">
+    <w:name w:val="footnote reference"/>
+    <w:rPr>
+      <w:vertAlign w:val="superscript"/>
     </w:rPr>
   </w:style>
   <w:style w:type="character" w:styleId="EndnoteCharacters">
@@ -6852,7 +6872,7 @@
     </w:rPr>
   </w:style>
   <w:style w:type="paragraph" w:styleId="EnvelopeReturn">
-    <w:name w:val="Envelope Return"/>
+    <w:name w:val="envelope return"/>
     <w:basedOn w:val="Normal"/>
     <w:pPr/>
     <w:rPr>
@@ -6871,46 +6891,6 @@
       <w:color w:val="ECEFF4"/>
     </w:rPr>
   </w:style>
-  <w:style w:type="paragraph" w:styleId="Footer">
-    <w:name w:val="Footer"/>
-    <w:basedOn w:val="Normal"/>
-    <w:pPr>
-      <w:suppressLineNumbers/>
-      <w:tabs>
-        <w:tab w:val="clear" w:pos="1134"/>
-        <w:tab w:val="center" w:pos="5952" w:leader="none"/>
-        <w:tab w:val="right" w:pos="10771" w:leader="none"/>
-      </w:tabs>
-    </w:pPr>
-    <w:rPr/>
-  </w:style>
-  <w:style w:type="paragraph" w:styleId="Header">
-    <w:name w:val="Header"/>
-    <w:basedOn w:val="Normal"/>
-    <w:pPr>
-      <w:suppressLineNumbers/>
-      <w:tabs>
-        <w:tab w:val="clear" w:pos="1134"/>
-        <w:tab w:val="center" w:pos="5952" w:leader="none"/>
-        <w:tab w:val="right" w:pos="10771" w:leader="none"/>
-      </w:tabs>
-    </w:pPr>
-    <w:rPr/>
-  </w:style>
-  <w:style w:type="paragraph" w:styleId="HeaderandFooter">
-    <w:name w:val="Header and Footer"/>
-    <w:basedOn w:val="Normal"/>
-    <w:qFormat/>
-    <w:pPr>
-      <w:suppressLineNumbers/>
-      <w:tabs>
-        <w:tab w:val="clear" w:pos="1134"/>
-        <w:tab w:val="center" w:pos="5953" w:leader="none"/>
-        <w:tab w:val="right" w:pos="10772" w:leader="none"/>
-      </w:tabs>
-    </w:pPr>
-    <w:rPr/>
-  </w:style>
   <w:style w:type="paragraph" w:styleId="Index">
     <w:name w:val="Index"/>
     <w:basedOn w:val="Normal"/>
@@ -6919,11 +6899,11 @@
       <w:suppressLineNumbers/>
     </w:pPr>
     <w:rPr>
-      <w:rFonts w:cs="FreeSans"/>
+      <w:rFonts w:cs="Noto Sans Devanagari"/>
     </w:rPr>
   </w:style>
   <w:style w:type="paragraph" w:styleId="Caption">
-    <w:name w:val="Caption"/>
+    <w:name w:val="caption"/>
     <w:basedOn w:val="Normal"/>
     <w:qFormat/>
     <w:pPr>
@@ -6931,7 +6911,7 @@
       <w:spacing w:before="120" w:after="120"/>
     </w:pPr>
     <w:rPr>
-      <w:rFonts w:cs="FreeSans"/>
+      <w:rFonts w:cs="Noto Sans Devanagari"/>
       <w:i/>
       <w:iCs/>
       <w:sz w:val="24"/>
@@ -6943,7 +6923,7 @@
     <w:basedOn w:val="BodyText"/>
     <w:pPr/>
     <w:rPr>
-      <w:rFonts w:cs="FreeSans"/>
+      <w:rFonts w:cs="Noto Sans Devanagari"/>
     </w:rPr>
   </w:style>
   <w:style w:type="paragraph" w:styleId="BodyText">
@@ -6985,7 +6965,7 @@
       <w:ind w:left="160" w:right="160"/>
     </w:pPr>
     <w:rPr>
-      <w:rFonts w:ascii="Liberation Mono" w:hAnsi="Liberation Mono" w:eastAsia="Liberation Mono" w:cs="Liberation Mono"/>
+      <w:rFonts w:ascii="Liberation Mono" w:hAnsi="Liberation Mono" w:eastAsia="Noto Sans Mono CJK SC" w:cs="Liberation Mono"/>
       <w:sz w:val="20"/>
       <w:szCs w:val="20"/>
     </w:rPr>
@@ -7026,37 +7006,37 @@
         <a:srgbClr val="000000"/>
       </a:dk1>
       <a:lt1>
-        <a:srgbClr val="ffffff"/>
+        <a:srgbClr val="FFFFFF"/>
       </a:lt1>
       <a:dk2>
         <a:srgbClr val="000000"/>
       </a:dk2>
       <a:lt2>
-        <a:srgbClr val="ffffff"/>
+        <a:srgbClr val="FFFFFF"/>
       </a:lt2>
       <a:accent1>
-        <a:srgbClr val="18a303"/>
+        <a:srgbClr val="18A303"/>
       </a:accent1>
       <a:accent2>
-        <a:srgbClr val="0369a3"/>
+        <a:srgbClr val="0369A3"/>
       </a:accent2>
       <a:accent3>
-        <a:srgbClr val="a33e03"/>
+        <a:srgbClr val="A33E03"/>
       </a:accent3>
       <a:accent4>
-        <a:srgbClr val="8e03a3"/>
+        <a:srgbClr val="8E03A3"/>
       </a:accent4>
       <a:accent5>
-        <a:srgbClr val="c99c00"/>
+        <a:srgbClr val="C99C00"/>
       </a:accent5>
       <a:accent6>
-        <a:srgbClr val="c9211e"/>
+        <a:srgbClr val="C9211E"/>
       </a:accent6>
       <a:hlink>
-        <a:srgbClr val="0000ee"/>
+        <a:srgbClr val="0000EE"/>
       </a:hlink>
       <a:folHlink>
-        <a:srgbClr val="551a8b"/>
+        <a:srgbClr val="551A8B"/>
       </a:folHlink>
     </a:clrScheme>
     <a:fontScheme name="Office">

</xml_diff>

<commit_message>
L-0796: quiet Stop gate - one verdict line, failures verbatim, detail in .crew/.verify-gate.log (crew 1.2.39)
verify-gate.sh and .ps1 print a verdict line, then every line they cannot
prove informational, and write the full text to .crew/.verify-gate.log.
Per-session repeat line; --verbose / CREW_VERIFY_VERBOSE=1 restore the old
output; --ci, --all and --price stay verbose. Exit codes and the L-0733
stdout line unchanged. Tooling PR, lands alone. Crew feature freeze waived
by the owner for this ticket.

Docs: README.md, CONFIG.md, guide src + rebuilt HTML/DOCX/PDF, PLUGINS.md, CHANGELOG, codemap; commands/skills unchanged because /crew:verify, --all and --ci behaviour does not change
</commit_message>
<xml_diff>
--- a/docs/guides/crew/crew-daily-workflow.docx
+++ b/docs/guides/crew/crew-daily-workflow.docx
@@ -1131,9 +1131,9 @@
         </w:tblCellMar>
       </w:tblPr>
       <w:tblGrid>
-        <w:gridCol w:w="1204"/>
-        <w:gridCol w:w="2566"/>
-        <w:gridCol w:w="7569"/>
+        <w:gridCol w:w="1144"/>
+        <w:gridCol w:w="2248"/>
+        <w:gridCol w:w="7947"/>
       </w:tblGrid>
       <w:tr>
         <w:trPr>
@@ -1141,7 +1141,7 @@
         </w:trPr>
         <w:tc>
           <w:tcPr>
-            <w:tcW w:w="1204" w:type="dxa"/>
+            <w:tcW w:w="1144" w:type="dxa"/>
             <w:tcBorders/>
             <w:vAlign w:val="center"/>
           </w:tcPr>
@@ -1163,7 +1163,7 @@
         </w:tc>
         <w:tc>
           <w:tcPr>
-            <w:tcW w:w="2566" w:type="dxa"/>
+            <w:tcW w:w="2248" w:type="dxa"/>
             <w:tcBorders/>
             <w:vAlign w:val="center"/>
           </w:tcPr>
@@ -1185,7 +1185,7 @@
         </w:tc>
         <w:tc>
           <w:tcPr>
-            <w:tcW w:w="7569" w:type="dxa"/>
+            <w:tcW w:w="7947" w:type="dxa"/>
             <w:tcBorders/>
             <w:vAlign w:val="center"/>
           </w:tcPr>
@@ -1210,7 +1210,7 @@
         <w:trPr/>
         <w:tc>
           <w:tcPr>
-            <w:tcW w:w="1204" w:type="dxa"/>
+            <w:tcW w:w="1144" w:type="dxa"/>
             <w:tcBorders/>
             <w:vAlign w:val="center"/>
           </w:tcPr>
@@ -1231,7 +1231,7 @@
         </w:tc>
         <w:tc>
           <w:tcPr>
-            <w:tcW w:w="2566" w:type="dxa"/>
+            <w:tcW w:w="2248" w:type="dxa"/>
             <w:tcBorders/>
             <w:vAlign w:val="center"/>
           </w:tcPr>
@@ -1262,7 +1262,7 @@
         </w:tc>
         <w:tc>
           <w:tcPr>
-            <w:tcW w:w="7569" w:type="dxa"/>
+            <w:tcW w:w="7947" w:type="dxa"/>
             <w:tcBorders/>
             <w:vAlign w:val="center"/>
           </w:tcPr>
@@ -1286,7 +1286,7 @@
         <w:trPr/>
         <w:tc>
           <w:tcPr>
-            <w:tcW w:w="1204" w:type="dxa"/>
+            <w:tcW w:w="1144" w:type="dxa"/>
             <w:tcBorders/>
             <w:vAlign w:val="center"/>
           </w:tcPr>
@@ -1307,7 +1307,7 @@
         </w:tc>
         <w:tc>
           <w:tcPr>
-            <w:tcW w:w="2566" w:type="dxa"/>
+            <w:tcW w:w="2248" w:type="dxa"/>
             <w:tcBorders/>
             <w:vAlign w:val="center"/>
           </w:tcPr>
@@ -1338,7 +1338,7 @@
         </w:tc>
         <w:tc>
           <w:tcPr>
-            <w:tcW w:w="7569" w:type="dxa"/>
+            <w:tcW w:w="7947" w:type="dxa"/>
             <w:tcBorders/>
             <w:vAlign w:val="center"/>
           </w:tcPr>
@@ -1363,7 +1363,27 @@
             </w:r>
             <w:r>
               <w:rPr/>
-              <w:t>; refuses to end the turn on a red check, never on a deferral (a rule too big for the budget goes to CI)</w:t>
+              <w:t xml:space="preserve">; refuses to end the turn on a red check, never on a deferral (a rule too big for the budget goes to CI); prints one verdict line and the failures, the rest is in </w:t>
+            </w:r>
+            <w:r>
+              <w:rPr>
+                <w:rStyle w:val="SourceText"/>
+              </w:rPr>
+              <w:t>.crew/.verify-gate.log</w:t>
+            </w:r>
+            <w:r>
+              <w:rPr/>
+              <w:t xml:space="preserve"> (</w:t>
+            </w:r>
+            <w:r>
+              <w:rPr>
+                <w:rStyle w:val="SourceText"/>
+              </w:rPr>
+              <w:t>--verbose</w:t>
+            </w:r>
+            <w:r>
+              <w:rPr/>
+              <w:t xml:space="preserve"> shows it)</w:t>
             </w:r>
           </w:p>
         </w:tc>
@@ -1372,7 +1392,7 @@
         <w:trPr/>
         <w:tc>
           <w:tcPr>
-            <w:tcW w:w="1204" w:type="dxa"/>
+            <w:tcW w:w="1144" w:type="dxa"/>
             <w:tcBorders/>
             <w:vAlign w:val="center"/>
           </w:tcPr>
@@ -1393,7 +1413,7 @@
         </w:tc>
         <w:tc>
           <w:tcPr>
-            <w:tcW w:w="2566" w:type="dxa"/>
+            <w:tcW w:w="2248" w:type="dxa"/>
             <w:tcBorders/>
             <w:vAlign w:val="center"/>
           </w:tcPr>
@@ -1424,7 +1444,7 @@
         </w:tc>
         <w:tc>
           <w:tcPr>
-            <w:tcW w:w="7569" w:type="dxa"/>
+            <w:tcW w:w="7947" w:type="dxa"/>
             <w:tcBorders/>
             <w:vAlign w:val="center"/>
           </w:tcPr>
@@ -1448,7 +1468,7 @@
         <w:trPr/>
         <w:tc>
           <w:tcPr>
-            <w:tcW w:w="1204" w:type="dxa"/>
+            <w:tcW w:w="1144" w:type="dxa"/>
             <w:tcBorders/>
             <w:vAlign w:val="center"/>
           </w:tcPr>
@@ -1469,7 +1489,7 @@
         </w:tc>
         <w:tc>
           <w:tcPr>
-            <w:tcW w:w="2566" w:type="dxa"/>
+            <w:tcW w:w="2248" w:type="dxa"/>
             <w:tcBorders/>
             <w:vAlign w:val="center"/>
           </w:tcPr>
@@ -1490,7 +1510,7 @@
         </w:tc>
         <w:tc>
           <w:tcPr>
-            <w:tcW w:w="7569" w:type="dxa"/>
+            <w:tcW w:w="7947" w:type="dxa"/>
             <w:tcBorders/>
             <w:vAlign w:val="center"/>
           </w:tcPr>

</xml_diff>

<commit_message>
L-0780: rebuild the daily-workflow and troubleshooting guides
</commit_message>
<xml_diff>
--- a/docs/guides/crew/crew-daily-workflow.docx
+++ b/docs/guides/crew/crew-daily-workflow.docx
@@ -1069,7 +1069,27 @@
       </w:r>
       <w:r>
         <w:rPr/>
-        <w:t xml:space="preserve"> again, so the tree the gate passed is the tree that lands. After the review, a re-anchor changes only the </w:t>
+        <w:t xml:space="preserve"> again, so the tree the gate passed is the tree that lands. From a host that did not run the review, </w:t>
+      </w:r>
+      <w:r>
+        <w:rPr>
+          <w:rStyle w:val="SourceText"/>
+        </w:rPr>
+        <w:t>review_status.py check --root . --pr &lt;PR&gt;</w:t>
+      </w:r>
+      <w:r>
+        <w:rPr/>
+        <w:t xml:space="preserve"> reads the </w:t>
+      </w:r>
+      <w:r>
+        <w:rPr>
+          <w:rStyle w:val="SourceText"/>
+        </w:rPr>
+        <w:t>crew/review</w:t>
+      </w:r>
+      <w:r>
+        <w:rPr/>
+        <w:t xml:space="preserve"> status the authoring host posted for that head; no ledger and no status is could-not-tell and refuses (L-0780). After the review, a re-anchor changes only the </w:t>
       </w:r>
       <w:r>
         <w:rPr>

</xml_diff>

<commit_message>
L-0728 slice 1: per-ticket cost telemetry (schema 1.1 rows), goal cap counts each message once
</commit_message>
<xml_diff>
--- a/docs/guides/crew/crew-daily-workflow.docx
+++ b/docs/guides/crew/crew-daily-workflow.docx
@@ -947,7 +947,57 @@
       </w:r>
       <w:r>
         <w:rPr/>
-        <w:t>. Three checks, all required: the review receipt rebuilds clean, the verify gate is clean, and the completion audit (the whole tree diffed against the scope base, not counting a file that is byte-identical to main as last merged) finds nothing outside scope. Any one failing refuses the close and names what to fix. On success it appends a metrics row, marks the ticket done, and clears a stale handoff.</w:t>
+        <w:t xml:space="preserve">. Three checks, all required: the review receipt rebuilds clean, the verify gate is clean, and the completion audit (the whole tree diffed against the scope base, not counting a file that is byte-identical to main as last merged) finds nothing outside scope. Any one failing refuses the close and names what to fix. On success it appends a metrics row, marks the ticket done, and clears a stale handoff. The metrics row (schema 1.1) carries tokens split by kind, each assistant message counted once, and a list-price cost. They are an attributed lower bound: only the Claude Code transcripts tied to the ticket by a </w:t>
+      </w:r>
+      <w:r>
+        <w:rPr>
+          <w:rStyle w:val="SourceText"/>
+        </w:rPr>
+        <w:t>Ticket ID: &lt;id&gt;</w:t>
+      </w:r>
+      <w:r>
+        <w:rPr/>
+        <w:t xml:space="preserve"> line, a </w:t>
+      </w:r>
+      <w:r>
+        <w:rPr>
+          <w:rStyle w:val="SourceText"/>
+        </w:rPr>
+        <w:t>/crew:&lt;command&gt; &lt;id&gt;</w:t>
+      </w:r>
+      <w:r>
+        <w:rPr/>
+        <w:t xml:space="preserve"> or its own worktree count (a dispatch prompt's </w:t>
+      </w:r>
+      <w:r>
+        <w:rPr>
+          <w:rStyle w:val="SourceText"/>
+        </w:rPr>
+        <w:t>Ticket ID:</w:t>
+      </w:r>
+      <w:r>
+        <w:rPr/>
+        <w:t xml:space="preserve"> line ties a subagent), and when none can be tied both read </w:t>
+      </w:r>
+      <w:r>
+        <w:rPr>
+          <w:rStyle w:val="SourceText"/>
+        </w:rPr>
+        <w:t>UNKNOWN</w:t>
+      </w:r>
+      <w:r>
+        <w:rPr/>
+        <w:t xml:space="preserve">, never </w:t>
+      </w:r>
+      <w:r>
+        <w:rPr>
+          <w:rStyle w:val="SourceText"/>
+        </w:rPr>
+        <w:t>0</w:t>
+      </w:r>
+      <w:r>
+        <w:rPr/>
+        <w:t>.</w:t>
       </w:r>
     </w:p>
     <w:p>

</xml_diff>

<commit_message>
L-0780: scope A - review_status.py is a strict, read-only check of the published crew/review status; post moves to L-0821
</commit_message>
<xml_diff>
--- a/docs/guides/crew/crew-daily-workflow.docx
+++ b/docs/guides/crew/crew-daily-workflow.docx
@@ -1075,11 +1075,11 @@
         <w:rPr>
           <w:rStyle w:val="SourceText"/>
         </w:rPr>
-        <w:t>review_status.py check --root . --pr &lt;PR&gt;</w:t>
-      </w:r>
-      <w:r>
-        <w:rPr/>
-        <w:t xml:space="preserve"> reads the </w:t>
+        <w:t>review_status.py check --pr &lt;PR&gt;</w:t>
+      </w:r>
+      <w:r>
+        <w:rPr/>
+        <w:t xml:space="preserve"> reads the published </w:t>
       </w:r>
       <w:r>
         <w:rPr>
@@ -1089,7 +1089,7 @@
       </w:r>
       <w:r>
         <w:rPr/>
-        <w:t xml:space="preserve"> status the authoring host posted for that head; no ledger and no status is could-not-tell and refuses (L-0780). After the review, a re-anchor changes only the </w:t>
+        <w:t xml:space="preserve"> status of that head; no status is could-not-tell and refuses, and nothing publishes one until L-0821 (L-0780). After the review, a re-anchor changes only the </w:t>
       </w:r>
       <w:r>
         <w:rPr>

</xml_diff>

<commit_message>
L-0728 review round 3: cross-file dedup rule stated, --schema 0.20 README note, codemap re-applied after the merge; crew 1.2.54 set last
</commit_message>
<xml_diff>
--- a/docs/guides/crew/crew-daily-workflow.docx
+++ b/docs/guides/crew/crew-daily-workflow.docx
@@ -947,7 +947,57 @@
       </w:r>
       <w:r>
         <w:rPr/>
-        <w:t>. Three checks, all required: the review receipt rebuilds clean, the verify gate is clean, and the completion audit (the whole tree diffed against the scope base, not counting a file that is byte-identical to main as last merged) finds nothing outside scope. Any one failing refuses the close and names what to fix. On success it appends a metrics row, marks the ticket done, and clears a stale handoff.</w:t>
+        <w:t xml:space="preserve">. Three checks, all required: the review receipt rebuilds clean, the verify gate is clean, and the completion audit (the whole tree diffed against the scope base, not counting a file that is byte-identical to main as last merged) finds nothing outside scope. Any one failing refuses the close and names what to fix. On success it appends a metrics row, marks the ticket done, and clears a stale handoff. The metrics row (schema 1.1) carries tokens split by kind, each assistant message counted once, and a list-price cost. They are an attributed lower bound: only the Claude Code transcripts tied to the ticket by a </w:t>
+      </w:r>
+      <w:r>
+        <w:rPr>
+          <w:rStyle w:val="SourceText"/>
+        </w:rPr>
+        <w:t>Ticket ID: &lt;id&gt;</w:t>
+      </w:r>
+      <w:r>
+        <w:rPr/>
+        <w:t xml:space="preserve"> line, a </w:t>
+      </w:r>
+      <w:r>
+        <w:rPr>
+          <w:rStyle w:val="SourceText"/>
+        </w:rPr>
+        <w:t>/crew:&lt;command&gt; &lt;id&gt;</w:t>
+      </w:r>
+      <w:r>
+        <w:rPr/>
+        <w:t xml:space="preserve"> or its own worktree count (a dispatch prompt's </w:t>
+      </w:r>
+      <w:r>
+        <w:rPr>
+          <w:rStyle w:val="SourceText"/>
+        </w:rPr>
+        <w:t>Ticket ID:</w:t>
+      </w:r>
+      <w:r>
+        <w:rPr/>
+        <w:t xml:space="preserve"> line ties a subagent), and when none can be tied both read </w:t>
+      </w:r>
+      <w:r>
+        <w:rPr>
+          <w:rStyle w:val="SourceText"/>
+        </w:rPr>
+        <w:t>UNKNOWN</w:t>
+      </w:r>
+      <w:r>
+        <w:rPr/>
+        <w:t xml:space="preserve">, never </w:t>
+      </w:r>
+      <w:r>
+        <w:rPr>
+          <w:rStyle w:val="SourceText"/>
+        </w:rPr>
+        <w:t>0</w:t>
+      </w:r>
+      <w:r>
+        <w:rPr/>
+        <w:t>.</w:t>
       </w:r>
     </w:p>
     <w:p>

</xml_diff>

<commit_message>
L-0718: export crew's standards to PR-side reviewers (crew 1.2.86)
crew_standards.py export (--write, --check, --dry-run): docs/review-rules/<SET>.md, REVIEW.md, .cursor/BUGBOT.md and an AGENTS.md Code Review Rules block, opted into by an export: key in .crew/standards.md; refuses symlinks, non-regular files, hand-written files at output paths and over-budget files; --check compares by the standards digest and the crew version and reports orphans. crew_docs_check gains a standards export row; .crew/verify.json gains rule standards-export. This repository opts in.

Docs: README, crew-standards and crew-setup skills, /crew:init, daily-loop and review notes, three guide sources with rebuilt outputs, codemap
</commit_message>
<xml_diff>
--- a/docs/guides/crew/crew-daily-workflow.docx
+++ b/docs/guides/crew/crew-daily-workflow.docx
@@ -690,6 +690,114 @@
       <w:r>
         <w:rPr/>
         <w:t xml:space="preserve"> refuses an incomplete answer sheet and binds a complete one to the exact review bundle, so any later edit needs a new stamp.</w:t>
+      </w:r>
+    </w:p>
+    <w:p>
+      <w:pPr>
+        <w:pStyle w:val="BodyText"/>
+        <w:bidi w:val="0"/>
+        <w:jc w:val="left"/>
+        <w:rPr/>
+      </w:pPr>
+      <w:r>
+        <w:rPr>
+          <w:rStyle w:val="Strong"/>
+        </w:rPr>
+        <w:t>6c. Publishing the standards (optional).</w:t>
+      </w:r>
+      <w:r>
+        <w:rPr/>
+        <w:t xml:space="preserve"> A repository that wants its pull-request reviewers (Claude Code Review, Cursor Bugbot, Codex, Copilot) to check the same standards opts in with </w:t>
+      </w:r>
+      <w:r>
+        <w:rPr>
+          <w:rStyle w:val="SourceText"/>
+        </w:rPr>
+        <w:t>export: ["review", "agents", "bugbot"]</w:t>
+      </w:r>
+      <w:r>
+        <w:rPr/>
+        <w:t xml:space="preserve"> in the </w:t>
+      </w:r>
+      <w:r>
+        <w:rPr>
+          <w:rStyle w:val="SourceText"/>
+        </w:rPr>
+        <w:t>.crew/standards.md</w:t>
+      </w:r>
+      <w:r>
+        <w:rPr/>
+        <w:t xml:space="preserve"> front matter. After an approved proposal edits that file, run </w:t>
+      </w:r>
+      <w:r>
+        <w:rPr>
+          <w:rStyle w:val="SourceText"/>
+        </w:rPr>
+        <w:t>crew_standards.py export --root . --write</w:t>
+      </w:r>
+      <w:r>
+        <w:rPr/>
+        <w:t xml:space="preserve">: it regenerates </w:t>
+      </w:r>
+      <w:r>
+        <w:rPr>
+          <w:rStyle w:val="SourceText"/>
+        </w:rPr>
+        <w:t>docs/review-rules/&lt;SET&gt;.md</w:t>
+      </w:r>
+      <w:r>
+        <w:rPr/>
+        <w:t xml:space="preserve">, </w:t>
+      </w:r>
+      <w:r>
+        <w:rPr>
+          <w:rStyle w:val="SourceText"/>
+        </w:rPr>
+        <w:t>REVIEW.md</w:t>
+      </w:r>
+      <w:r>
+        <w:rPr/>
+        <w:t xml:space="preserve">, </w:t>
+      </w:r>
+      <w:r>
+        <w:rPr>
+          <w:rStyle w:val="SourceText"/>
+        </w:rPr>
+        <w:t>.cursor/BUGBOT.md</w:t>
+      </w:r>
+      <w:r>
+        <w:rPr/>
+        <w:t xml:space="preserve"> and the </w:t>
+      </w:r>
+      <w:r>
+        <w:rPr>
+          <w:rStyle w:val="SourceText"/>
+        </w:rPr>
+        <w:t>## Code Review Rules</w:t>
+      </w:r>
+      <w:r>
+        <w:rPr/>
+        <w:t xml:space="preserve"> block in a hand-written </w:t>
+      </w:r>
+      <w:r>
+        <w:rPr>
+          <w:rStyle w:val="SourceText"/>
+        </w:rPr>
+        <w:t>AGENTS.md</w:t>
+      </w:r>
+      <w:r>
+        <w:rPr/>
+        <w:t xml:space="preserve">. </w:t>
+      </w:r>
+      <w:r>
+        <w:rPr>
+          <w:rStyle w:val="SourceText"/>
+        </w:rPr>
+        <w:t>export --check</w:t>
+      </w:r>
+      <w:r>
+        <w:rPr/>
+        <w:t xml:space="preserve"> fails when any of them is stale, missing, hand-edited or orphaned; freshness is as of the last check, and a skipped check (exit 77) is not coverage.</w:t>
       </w:r>
     </w:p>
     <w:p>
@@ -4565,6 +4673,88 @@
       <w:r>
         <w:rPr/>
         <w:t xml:space="preserve"> and crew's own policy files. If the ticket changes one of them, list it in Touch. </w:t>
+      </w:r>
+    </w:p>
+    <w:p>
+      <w:pPr>
+        <w:pStyle w:val="BodyText"/>
+        <w:numPr>
+          <w:ilvl w:val="0"/>
+          <w:numId w:val="7"/>
+        </w:numPr>
+        <w:tabs>
+          <w:tab w:val="clear" w:pos="1134"/>
+          <w:tab w:val="left" w:pos="829" w:leader="none"/>
+        </w:tabs>
+        <w:bidi w:val="0"/>
+        <w:spacing w:before="120" w:after="0"/>
+        <w:ind w:hanging="283" w:left="829"/>
+        <w:jc w:val="left"/>
+        <w:rPr/>
+      </w:pPr>
+      <w:r>
+        <w:rPr/>
+        <w:t>The generated review files (</w:t>
+      </w:r>
+      <w:r>
+        <w:rPr>
+          <w:rStyle w:val="SourceText"/>
+        </w:rPr>
+        <w:t>docs/review-rules/</w:t>
+      </w:r>
+      <w:r>
+        <w:rPr/>
+        <w:t xml:space="preserve">, </w:t>
+      </w:r>
+      <w:r>
+        <w:rPr>
+          <w:rStyle w:val="SourceText"/>
+        </w:rPr>
+        <w:t>REVIEW.md</w:t>
+      </w:r>
+      <w:r>
+        <w:rPr/>
+        <w:t xml:space="preserve">, </w:t>
+      </w:r>
+      <w:r>
+        <w:rPr>
+          <w:rStyle w:val="SourceText"/>
+        </w:rPr>
+        <w:t>.cursor/BUGBOT.md</w:t>
+      </w:r>
+      <w:r>
+        <w:rPr/>
+        <w:t xml:space="preserve"> and the </w:t>
+      </w:r>
+      <w:r>
+        <w:rPr>
+          <w:rStyle w:val="SourceText"/>
+        </w:rPr>
+        <w:t>## Code Review Rules</w:t>
+      </w:r>
+      <w:r>
+        <w:rPr/>
+        <w:t xml:space="preserve"> block in </w:t>
+      </w:r>
+      <w:r>
+        <w:rPr>
+          <w:rStyle w:val="SourceText"/>
+        </w:rPr>
+        <w:t>AGENTS.md</w:t>
+      </w:r>
+      <w:r>
+        <w:rPr/>
+        <w:t xml:space="preserve">) are ordinary repository files: a ticket that edits a standard lists them in Touch, then regenerates them with </w:t>
+      </w:r>
+      <w:r>
+        <w:rPr>
+          <w:rStyle w:val="SourceText"/>
+        </w:rPr>
+        <w:t>crew_standards.py export --write</w:t>
+      </w:r>
+      <w:r>
+        <w:rPr/>
+        <w:t xml:space="preserve">. </w:t>
       </w:r>
     </w:p>
     <w:p>

</xml_diff>

<commit_message>
L-0714 slice 1: planner learns Lines:, kind tags and the 300-line cap (crew 1.2.91)
Docs: plan template, crew-plan/execute/standards skills, README, daily-loop reference, guide sources and rebuilt guides.
</commit_message>
<xml_diff>
--- a/docs/guides/crew/crew-daily-workflow.docx
+++ b/docs/guides/crew/crew-daily-workflow.docx
@@ -445,7 +445,17 @@
       </w:r>
       <w:r>
         <w:rPr/>
-        <w:t xml:space="preserve"> (Files/Test/Risk/Standards each), checks every Files: entry against the spec's Touch globs, and enters </w:t>
+        <w:t xml:space="preserve"> (Files/Lines/Test/Risk/Standards each; </w:t>
+      </w:r>
+      <w:r>
+        <w:rPr>
+          <w:rStyle w:val="SourceText"/>
+        </w:rPr>
+        <w:t>Lines:</w:t>
+      </w:r>
+      <w:r>
+        <w:rPr/>
+        <w:t xml:space="preserve"> is the step's projected production lines, 300 in total, and not yet checked at approval), checks every Files: entry against the spec's Touch globs, and enters </w:t>
       </w:r>
       <w:r>
         <w:rPr>
@@ -3580,7 +3590,97 @@
       </w:r>
       <w:r>
         <w:rPr/>
-        <w:t xml:space="preserve"> entry must fall inside Touch. A plan cannot add a path the spec does not list. </w:t>
+        <w:t xml:space="preserve"> entry must fall inside Touch. A plan cannot add a path the spec does not list. A step also carries a </w:t>
+      </w:r>
+      <w:r>
+        <w:rPr>
+          <w:rStyle w:val="SourceText"/>
+        </w:rPr>
+        <w:t>Lines:</w:t>
+      </w:r>
+      <w:r>
+        <w:rPr/>
+        <w:t xml:space="preserve"> line (projected production lines, </w:t>
+      </w:r>
+      <w:r>
+        <w:rPr>
+          <w:rStyle w:val="SourceText"/>
+        </w:rPr>
+        <w:t>0</w:t>
+      </w:r>
+      <w:r>
+        <w:rPr/>
+        <w:t xml:space="preserve"> if none) and each production </w:t>
+      </w:r>
+      <w:r>
+        <w:rPr>
+          <w:rStyle w:val="SourceText"/>
+        </w:rPr>
+        <w:t>Files:</w:t>
+      </w:r>
+      <w:r>
+        <w:rPr/>
+        <w:t xml:space="preserve"> entry a kind tag (</w:t>
+      </w:r>
+      <w:r>
+        <w:rPr>
+          <w:rStyle w:val="SourceText"/>
+        </w:rPr>
+        <w:t>[parser]</w:t>
+      </w:r>
+      <w:r>
+        <w:rPr/>
+        <w:t xml:space="preserve">, </w:t>
+      </w:r>
+      <w:r>
+        <w:rPr>
+          <w:rStyle w:val="SourceText"/>
+        </w:rPr>
+        <w:t>[guard]</w:t>
+      </w:r>
+      <w:r>
+        <w:rPr/>
+        <w:t xml:space="preserve">, </w:t>
+      </w:r>
+      <w:r>
+        <w:rPr>
+          <w:rStyle w:val="SourceText"/>
+        </w:rPr>
+        <w:t>[state-machine]</w:t>
+      </w:r>
+      <w:r>
+        <w:rPr/>
+        <w:t xml:space="preserve"> or </w:t>
+      </w:r>
+      <w:r>
+        <w:rPr>
+          <w:rStyle w:val="SourceText"/>
+        </w:rPr>
+        <w:t>[other]</w:t>
+      </w:r>
+      <w:r>
+        <w:rPr/>
+        <w:t xml:space="preserve">). The planner is told to keep a plan to 300 production lines and not to mix a parser, guard or state machine with other production work; </w:t>
+      </w:r>
+      <w:r>
+        <w:rPr>
+          <w:rStyle w:val="SourceText"/>
+        </w:rPr>
+        <w:t>/crew:approve</w:t>
+      </w:r>
+      <w:r>
+        <w:rPr/>
+        <w:t xml:space="preserve"> does not check this yet, and an oversized plan is meant to go to </w:t>
+      </w:r>
+      <w:r>
+        <w:rPr>
+          <w:rStyle w:val="SourceText"/>
+        </w:rPr>
+        <w:t>/crew:split</w:t>
+      </w:r>
+      <w:r>
+        <w:rPr/>
+        <w:t xml:space="preserve">. </w:t>
       </w:r>
     </w:p>
     <w:p>

</xml_diff>